<commit_message>
Cambios en Presentacion y Script
</commit_message>
<xml_diff>
--- a/Presentacion/Script.docx
+++ b/Presentacion/Script.docx
@@ -581,7 +581,7 @@
           <w:iCs/>
           <w:lang w:val="es-ES"/>
         </w:rPr>
-        <w:t>¿Cómo puede una plataforma digital de asesoramiento financiero ayudar a diferentes usuarios a mejorar sus hábitos económicos mediante orientación personalizada, accesible y confiable, mientras mantiene un impacto social y un modelo de negocio sostenible?</w:t>
+        <w:t>¿Cómo puede una plataforma digital de asesoramiento financiero ayudar a los usuarios a mejorar sus hábitos económicos mediante orientación personalizada, accesible y confiable, manteniendo un impacto social y un modelo de negocio sostenible?</w:t>
       </w:r>
       <w:r>
         <w:rPr>
@@ -629,7 +629,7 @@
           <w:iCs/>
           <w:lang w:val="es-ES"/>
         </w:rPr>
-        <w:t xml:space="preserve">Diseñar un plan de negocios y un prototipo de una plataforma digital de planificación financiera para jóvenes, trabajadores independientes y nómadas digitales en Bogotá, basada en una arquitectura de microservicios y algoritmos de personalización (Machine </w:t>
+        <w:t xml:space="preserve">Diseñar un plan de negocios y un prototipo de una plataforma digital de planificación financiera para jóvenes, trabajadores independientes y nómadas digitales en Bogotá, basada en microservicios y algoritmos de personalización (Machine </w:t>
       </w:r>
       <w:proofErr w:type="spellStart"/>
       <w:r>
@@ -647,7 +647,7 @@
           <w:iCs/>
           <w:lang w:val="es-ES"/>
         </w:rPr>
-        <w:t>), que facilite la toma de decisiones económicas y mejore el bienestar financiero de sus usuarios.</w:t>
+        <w:t>), que facilite la toma de decisiones económicas y mejore el bienestar financiero de sus usuarios</w:t>
       </w:r>
       <w:r>
         <w:rPr>
@@ -655,1172 +655,7 @@
           <w:iCs/>
           <w:lang w:val="es-ES"/>
         </w:rPr>
-        <w:t xml:space="preserve"> </w:t>
-      </w:r>
-      <w:r>
-        <w:rPr>
-          <w:lang w:val="es-ES"/>
-        </w:rPr>
-        <w:t>Nuestro fuerte no es buscar solamente realizar una plataforma de cursos y ya, sino que esta busque comprender al usuario sobre temas financieros de forma intuitiva y</w:t>
-      </w:r>
-      <w:r>
-        <w:rPr>
-          <w:lang w:val="es-ES"/>
-        </w:rPr>
-        <w:t xml:space="preserve"> de</w:t>
-      </w:r>
-      <w:r>
-        <w:rPr>
-          <w:lang w:val="es-ES"/>
-        </w:rPr>
-        <w:t xml:space="preserve"> fácil </w:t>
-      </w:r>
-      <w:r>
-        <w:rPr>
-          <w:lang w:val="es-ES"/>
-        </w:rPr>
-        <w:t>acceso</w:t>
-      </w:r>
-      <w:r>
-        <w:rPr>
-          <w:lang w:val="es-ES"/>
-        </w:rPr>
         <w:t>.</w:t>
-      </w:r>
-    </w:p>
-    <w:p>
-      <w:pPr>
-        <w:rPr>
-          <w:lang w:val="es-ES"/>
-        </w:rPr>
-      </w:pPr>
-      <w:r>
-        <w:rPr>
-          <w:b/>
-          <w:bCs/>
-          <w:lang w:val="es-ES"/>
-        </w:rPr>
-        <w:t>[</w:t>
-      </w:r>
-      <w:proofErr w:type="spellStart"/>
-      <w:r>
-        <w:rPr>
-          <w:b/>
-          <w:bCs/>
-          <w:lang w:val="es-ES"/>
-        </w:rPr>
-        <w:t>Diap</w:t>
-      </w:r>
-      <w:proofErr w:type="spellEnd"/>
-      <w:r>
-        <w:rPr>
-          <w:b/>
-          <w:bCs/>
-          <w:lang w:val="es-ES"/>
-        </w:rPr>
-        <w:t>. 7 a 8]</w:t>
-      </w:r>
-      <w:r>
-        <w:rPr>
-          <w:b/>
-          <w:bCs/>
-          <w:lang w:val="es-ES"/>
-        </w:rPr>
-        <w:t xml:space="preserve"> </w:t>
-      </w:r>
-      <w:r>
-        <w:rPr>
-          <w:lang w:val="es-ES"/>
-        </w:rPr>
-        <w:t xml:space="preserve">Para nuestra propuesta vamos a hablar acerca de las características del producto, en primer lugar, nuestro sistema implementará Gamificación Ligera para incentivar y facilitar la compresión de términos económicos a nuestros usuarios, para ello, también se implementa una </w:t>
-      </w:r>
-      <w:r>
-        <w:rPr>
-          <w:lang w:val="es-ES"/>
-        </w:rPr>
-        <w:lastRenderedPageBreak/>
-        <w:t xml:space="preserve">Interfaz Intuitiva. Además de Lecciones para el Aprendizaje Financiero que permitan entregar temas como intereses y conceptos financieros al cliente. Todo esto bajo un modelo </w:t>
-      </w:r>
-      <w:proofErr w:type="spellStart"/>
-      <w:r>
-        <w:rPr>
-          <w:lang w:val="es-ES"/>
-        </w:rPr>
-        <w:t>freemium</w:t>
-      </w:r>
-      <w:proofErr w:type="spellEnd"/>
-      <w:r>
-        <w:rPr>
-          <w:lang w:val="es-ES"/>
-        </w:rPr>
-        <w:t>, es decir, que no tiene costo alguno usar la plataforma, y para funciones adicionales como remover anuncios o mayor profundidad sobre los temas, se tendrá la opción de una suscripción mensual opcional. Permitiendo a nuestro público objetivo poder acceder al entorno</w:t>
-      </w:r>
-      <w:r>
-        <w:rPr>
-          <w:lang w:val="es-ES"/>
-        </w:rPr>
-        <w:t xml:space="preserve"> y obtener ganancias por medio de este modelo.</w:t>
-      </w:r>
-    </w:p>
-    <w:p>
-      <w:r>
-        <w:rPr>
-          <w:b/>
-          <w:bCs/>
-          <w:lang w:val="es-ES"/>
-        </w:rPr>
-        <w:t>[</w:t>
-      </w:r>
-      <w:proofErr w:type="spellStart"/>
-      <w:r>
-        <w:rPr>
-          <w:b/>
-          <w:bCs/>
-          <w:lang w:val="es-ES"/>
-        </w:rPr>
-        <w:t>Diap</w:t>
-      </w:r>
-      <w:proofErr w:type="spellEnd"/>
-      <w:r>
-        <w:rPr>
-          <w:b/>
-          <w:bCs/>
-          <w:lang w:val="es-ES"/>
-        </w:rPr>
-        <w:t xml:space="preserve">. </w:t>
-      </w:r>
-      <w:r>
-        <w:rPr>
-          <w:b/>
-          <w:bCs/>
-          <w:lang w:val="es-ES"/>
-        </w:rPr>
-        <w:t>9</w:t>
-      </w:r>
-      <w:r>
-        <w:rPr>
-          <w:b/>
-          <w:bCs/>
-          <w:lang w:val="es-ES"/>
-        </w:rPr>
-        <w:t xml:space="preserve">] </w:t>
-      </w:r>
-      <w:r>
-        <w:rPr>
-          <w:lang w:val="es-ES"/>
-        </w:rPr>
-        <w:t>[Explicación de la plataforma]</w:t>
-      </w:r>
-    </w:p>
-    <w:p>
-      <w:pPr>
-        <w:rPr>
-          <w:lang w:val="es-ES"/>
-        </w:rPr>
-      </w:pPr>
-      <w:r>
-        <w:rPr>
-          <w:b/>
-          <w:bCs/>
-          <w:lang w:val="es-ES"/>
-        </w:rPr>
-        <w:t>[</w:t>
-      </w:r>
-      <w:proofErr w:type="spellStart"/>
-      <w:r>
-        <w:rPr>
-          <w:b/>
-          <w:bCs/>
-          <w:lang w:val="es-ES"/>
-        </w:rPr>
-        <w:t>Diap</w:t>
-      </w:r>
-      <w:proofErr w:type="spellEnd"/>
-      <w:r>
-        <w:rPr>
-          <w:b/>
-          <w:bCs/>
-          <w:lang w:val="es-ES"/>
-        </w:rPr>
-        <w:t xml:space="preserve">. </w:t>
-      </w:r>
-      <w:r>
-        <w:rPr>
-          <w:b/>
-          <w:bCs/>
-          <w:lang w:val="es-ES"/>
-        </w:rPr>
-        <w:t>10</w:t>
-      </w:r>
-      <w:r>
-        <w:rPr>
-          <w:b/>
-          <w:bCs/>
-          <w:lang w:val="es-ES"/>
-        </w:rPr>
-        <w:t xml:space="preserve">] </w:t>
-      </w:r>
-      <w:r>
-        <w:rPr>
-          <w:lang w:val="es-ES"/>
-        </w:rPr>
-        <w:t xml:space="preserve">Explicando las diferentes herramientas tecnológicas que usamos para construir el anterior prototipo son las siguientes, se utilizará un modelo dual de bases de datos basada en PostgreSQL, la cual almacenará la parte transaccional y </w:t>
-      </w:r>
-      <w:proofErr w:type="spellStart"/>
-      <w:r>
-        <w:rPr>
-          <w:lang w:val="es-ES"/>
-        </w:rPr>
-        <w:t>MondoDB</w:t>
-      </w:r>
-      <w:proofErr w:type="spellEnd"/>
-      <w:r>
-        <w:rPr>
-          <w:lang w:val="es-ES"/>
-        </w:rPr>
-        <w:t xml:space="preserve">, que tendrá los contenidos y los logs, lo que permite equilibrar la seguridad de los datos financieros con la flexibilidad necesaria, para la construcción del modelo de Aprendizaje Automático usamos librerías de Python como </w:t>
-      </w:r>
-      <w:proofErr w:type="spellStart"/>
-      <w:r>
-        <w:rPr>
-          <w:lang w:val="es-ES"/>
-        </w:rPr>
-        <w:t>Scikit-Learn</w:t>
-      </w:r>
-      <w:proofErr w:type="spellEnd"/>
-      <w:r>
-        <w:rPr>
-          <w:lang w:val="es-ES"/>
-        </w:rPr>
-        <w:t xml:space="preserve"> y </w:t>
-      </w:r>
-      <w:proofErr w:type="spellStart"/>
-      <w:r>
-        <w:rPr>
-          <w:lang w:val="es-ES"/>
-        </w:rPr>
-        <w:t>TensorFlor</w:t>
-      </w:r>
-      <w:proofErr w:type="spellEnd"/>
-      <w:r>
-        <w:rPr>
-          <w:lang w:val="es-ES"/>
-        </w:rPr>
-        <w:t xml:space="preserve">, para el </w:t>
-      </w:r>
-      <w:proofErr w:type="spellStart"/>
-      <w:r>
-        <w:rPr>
-          <w:lang w:val="es-ES"/>
-        </w:rPr>
-        <w:t>backend</w:t>
-      </w:r>
-      <w:proofErr w:type="spellEnd"/>
-      <w:r>
-        <w:rPr>
-          <w:lang w:val="es-ES"/>
-        </w:rPr>
-        <w:t xml:space="preserve">, API Gateway y autorización del servicio, se usará Node.js y finalmente para el </w:t>
-      </w:r>
-      <w:proofErr w:type="spellStart"/>
-      <w:r>
-        <w:rPr>
-          <w:lang w:val="es-ES"/>
-        </w:rPr>
-        <w:t>front-end</w:t>
-      </w:r>
-      <w:proofErr w:type="spellEnd"/>
-      <w:r>
-        <w:rPr>
-          <w:lang w:val="es-ES"/>
-        </w:rPr>
-        <w:t xml:space="preserve"> se utilizará Angular, todo esto contenido bajo una infraestructura y </w:t>
-      </w:r>
-      <w:proofErr w:type="spellStart"/>
-      <w:r>
-        <w:rPr>
-          <w:lang w:val="es-ES"/>
-        </w:rPr>
-        <w:t>conten</w:t>
-      </w:r>
-      <w:r>
-        <w:rPr>
-          <w:lang w:val="es-ES"/>
-        </w:rPr>
-        <w:t>ización</w:t>
-      </w:r>
-      <w:proofErr w:type="spellEnd"/>
-      <w:r>
-        <w:rPr>
-          <w:lang w:val="es-ES"/>
-        </w:rPr>
-        <w:t xml:space="preserve"> mediante Docker.</w:t>
-      </w:r>
-    </w:p>
-    <w:p>
-      <w:pPr>
-        <w:rPr>
-          <w:lang w:val="es-ES"/>
-        </w:rPr>
-      </w:pPr>
-      <w:r>
-        <w:rPr>
-          <w:b/>
-          <w:bCs/>
-          <w:lang w:val="es-ES"/>
-        </w:rPr>
-        <w:t>[</w:t>
-      </w:r>
-      <w:proofErr w:type="spellStart"/>
-      <w:r>
-        <w:rPr>
-          <w:b/>
-          <w:bCs/>
-          <w:lang w:val="es-ES"/>
-        </w:rPr>
-        <w:t>Diap</w:t>
-      </w:r>
-      <w:proofErr w:type="spellEnd"/>
-      <w:r>
-        <w:rPr>
-          <w:b/>
-          <w:bCs/>
-          <w:lang w:val="es-ES"/>
-        </w:rPr>
-        <w:t>. 1</w:t>
-      </w:r>
-      <w:r>
-        <w:rPr>
-          <w:b/>
-          <w:bCs/>
-          <w:lang w:val="es-ES"/>
-        </w:rPr>
-        <w:t>1</w:t>
-      </w:r>
-      <w:r>
-        <w:rPr>
-          <w:b/>
-          <w:bCs/>
-          <w:lang w:val="es-ES"/>
-        </w:rPr>
-        <w:t xml:space="preserve">] </w:t>
-      </w:r>
-      <w:r>
-        <w:rPr>
-          <w:lang w:val="es-ES"/>
-        </w:rPr>
-        <w:t>Sobre la arquitectura, como describimos anteriormente, la arquitectura se basa en un modelo de capas,</w:t>
-      </w:r>
-      <w:r>
-        <w:rPr>
-          <w:lang w:val="es-ES"/>
-        </w:rPr>
-        <w:t xml:space="preserve"> dentro del cual se encuentra la Base de Datos hechas con Mondo y </w:t>
-      </w:r>
-      <w:proofErr w:type="spellStart"/>
-      <w:r>
-        <w:rPr>
-          <w:lang w:val="es-ES"/>
-        </w:rPr>
-        <w:t>Postrgre</w:t>
-      </w:r>
-      <w:proofErr w:type="spellEnd"/>
-      <w:r>
-        <w:rPr>
-          <w:lang w:val="es-ES"/>
-        </w:rPr>
-        <w:t xml:space="preserve">, la Inteligencia Artificial para crear el modelo con las librerías de Python ya mencionadas, la capa de Microservicios usando Node.js y la </w:t>
-      </w:r>
-      <w:proofErr w:type="spellStart"/>
-      <w:r>
-        <w:rPr>
-          <w:lang w:val="es-ES"/>
-        </w:rPr>
-        <w:t>Frontend</w:t>
-      </w:r>
-      <w:proofErr w:type="spellEnd"/>
-      <w:r>
-        <w:rPr>
-          <w:lang w:val="es-ES"/>
-        </w:rPr>
-        <w:t xml:space="preserve"> usando Angular, cuya infraestructura es dada por Docker, a la derecha se describe el mismo </w:t>
-      </w:r>
-      <w:proofErr w:type="gramStart"/>
-      <w:r>
-        <w:rPr>
-          <w:lang w:val="es-ES"/>
-        </w:rPr>
-        <w:t>modelo</w:t>
-      </w:r>
-      <w:proofErr w:type="gramEnd"/>
-      <w:r>
-        <w:rPr>
-          <w:lang w:val="es-ES"/>
-        </w:rPr>
-        <w:t xml:space="preserve"> pero con mayor profundidad.</w:t>
-      </w:r>
-    </w:p>
-    <w:p>
-      <w:pPr>
-        <w:rPr>
-          <w:lang w:val="es-ES"/>
-        </w:rPr>
-      </w:pPr>
-      <w:r>
-        <w:rPr>
-          <w:b/>
-          <w:bCs/>
-          <w:lang w:val="es-ES"/>
-        </w:rPr>
-        <w:t>[</w:t>
-      </w:r>
-      <w:proofErr w:type="spellStart"/>
-      <w:r>
-        <w:rPr>
-          <w:b/>
-          <w:bCs/>
-          <w:lang w:val="es-ES"/>
-        </w:rPr>
-        <w:t>Diap</w:t>
-      </w:r>
-      <w:proofErr w:type="spellEnd"/>
-      <w:r>
-        <w:rPr>
-          <w:b/>
-          <w:bCs/>
-          <w:lang w:val="es-ES"/>
-        </w:rPr>
-        <w:t>. 1</w:t>
-      </w:r>
-      <w:r>
-        <w:rPr>
-          <w:b/>
-          <w:bCs/>
-          <w:lang w:val="es-ES"/>
-        </w:rPr>
-        <w:t>2</w:t>
-      </w:r>
-      <w:r>
-        <w:rPr>
-          <w:b/>
-          <w:bCs/>
-          <w:lang w:val="es-ES"/>
-        </w:rPr>
-        <w:t xml:space="preserve"> </w:t>
-      </w:r>
-      <w:r>
-        <w:rPr>
-          <w:b/>
-          <w:bCs/>
-          <w:lang w:val="es-ES"/>
-        </w:rPr>
-        <w:t>a</w:t>
-      </w:r>
-      <w:r>
-        <w:rPr>
-          <w:b/>
-          <w:bCs/>
-          <w:lang w:val="es-ES"/>
-        </w:rPr>
-        <w:t xml:space="preserve"> 1</w:t>
-      </w:r>
-      <w:r>
-        <w:rPr>
-          <w:b/>
-          <w:bCs/>
-          <w:lang w:val="es-ES"/>
-        </w:rPr>
-        <w:t>3</w:t>
-      </w:r>
-      <w:r>
-        <w:rPr>
-          <w:b/>
-          <w:bCs/>
-          <w:lang w:val="es-ES"/>
-        </w:rPr>
-        <w:t>]</w:t>
-      </w:r>
-      <w:r>
-        <w:rPr>
-          <w:b/>
-          <w:bCs/>
-          <w:lang w:val="es-ES"/>
-        </w:rPr>
-        <w:t xml:space="preserve"> </w:t>
-      </w:r>
-      <w:r>
-        <w:rPr>
-          <w:lang w:val="es-ES"/>
-        </w:rPr>
-        <w:t xml:space="preserve">Bueno entonces el estudio de mercado, nuestro aplicativo tiene como objetivo todas las personas de bajos recursos, estudiantes y nómadas digitales, por esto, es importante ofrecer un servicio gratuito para lograr acaparar la demanda existente, en competencia no tenemos competencia directa, más si existen gran cantidad de plataformas financieras, estas ofrecen poco o nulo conocimiento acerca de educación financiera. No existe una plataforma que se centre exclusivamente en conocimientos financieros apropiadamente. </w:t>
-      </w:r>
-      <w:proofErr w:type="spellStart"/>
-      <w:r>
-        <w:rPr>
-          <w:lang w:val="es-ES"/>
-        </w:rPr>
-        <w:t>Bconomy</w:t>
-      </w:r>
-      <w:proofErr w:type="spellEnd"/>
-      <w:r>
-        <w:rPr>
-          <w:lang w:val="es-ES"/>
-        </w:rPr>
-        <w:t xml:space="preserve"> es una herramienta diseñada para evaluar la salud financiera pero no ofrece conocimientos profundos sobre economía, </w:t>
-      </w:r>
-      <w:proofErr w:type="spellStart"/>
-      <w:r>
-        <w:rPr>
-          <w:lang w:val="es-ES"/>
-        </w:rPr>
-        <w:t>Fintonic</w:t>
-      </w:r>
-      <w:proofErr w:type="spellEnd"/>
-      <w:r>
-        <w:rPr>
-          <w:lang w:val="es-ES"/>
-        </w:rPr>
-        <w:t xml:space="preserve"> se encarga de organizar cuentas bancarias y centralizarlas y </w:t>
-      </w:r>
-      <w:proofErr w:type="spellStart"/>
-      <w:r>
-        <w:rPr>
-          <w:lang w:val="es-ES"/>
-        </w:rPr>
-        <w:t>Nequi</w:t>
-      </w:r>
-      <w:proofErr w:type="spellEnd"/>
-      <w:r>
-        <w:rPr>
-          <w:lang w:val="es-ES"/>
-        </w:rPr>
-        <w:t xml:space="preserve"> es una plataforma bancaria digital. No existen formas operacionales centradas en </w:t>
-      </w:r>
-      <w:proofErr w:type="spellStart"/>
-      <w:r>
-        <w:rPr>
-          <w:lang w:val="es-ES"/>
-        </w:rPr>
-        <w:t>edtech</w:t>
-      </w:r>
-      <w:proofErr w:type="spellEnd"/>
-      <w:r>
-        <w:rPr>
-          <w:lang w:val="es-ES"/>
-        </w:rPr>
-        <w:t xml:space="preserve"> sobre aprendizaje económico.</w:t>
-      </w:r>
-    </w:p>
-    <w:p>
-      <w:pPr>
-        <w:rPr>
-          <w:lang w:val="es-ES"/>
-        </w:rPr>
-      </w:pPr>
-      <w:r>
-        <w:rPr>
-          <w:b/>
-          <w:bCs/>
-          <w:lang w:val="es-ES"/>
-        </w:rPr>
-        <w:t>[</w:t>
-      </w:r>
-      <w:proofErr w:type="spellStart"/>
-      <w:r>
-        <w:rPr>
-          <w:b/>
-          <w:bCs/>
-          <w:lang w:val="es-ES"/>
-        </w:rPr>
-        <w:t>Diap</w:t>
-      </w:r>
-      <w:proofErr w:type="spellEnd"/>
-      <w:r>
-        <w:rPr>
-          <w:b/>
-          <w:bCs/>
-          <w:lang w:val="es-ES"/>
-        </w:rPr>
-        <w:t>. 1</w:t>
-      </w:r>
-      <w:r>
-        <w:rPr>
-          <w:b/>
-          <w:bCs/>
-          <w:lang w:val="es-ES"/>
-        </w:rPr>
-        <w:t>4</w:t>
-      </w:r>
-      <w:r>
-        <w:rPr>
-          <w:b/>
-          <w:bCs/>
-          <w:lang w:val="es-ES"/>
-        </w:rPr>
-        <w:t xml:space="preserve">] </w:t>
-      </w:r>
-      <w:r>
-        <w:rPr>
-          <w:lang w:val="es-ES"/>
-        </w:rPr>
-        <w:t xml:space="preserve">Esto se verifica con las 5 fuerzas de Porter, en las cuales se observa como la plataforma tiene poca competencia con el poder del cliente, gracias a su modelo Freemium. Adicionalmente, de </w:t>
-      </w:r>
-      <w:r>
-        <w:rPr>
-          <w:lang w:val="es-ES"/>
-        </w:rPr>
-        <w:t xml:space="preserve">buscar promoverse mediante Google </w:t>
-      </w:r>
-      <w:proofErr w:type="spellStart"/>
-      <w:r>
-        <w:rPr>
-          <w:lang w:val="es-ES"/>
-        </w:rPr>
-        <w:t>Ads</w:t>
-      </w:r>
-      <w:proofErr w:type="spellEnd"/>
-      <w:r>
-        <w:rPr>
-          <w:lang w:val="es-ES"/>
-        </w:rPr>
-        <w:t xml:space="preserve"> y el desarrollo de alianzas universitarias y con sectores públicos, y a pesar de que es posible crear una app similar, se mitiga este peligro de nuevos competidores al establecernos, crear confianza y buscar innovar creando una reputación estable.</w:t>
-      </w:r>
-    </w:p>
-    <w:p>
-      <w:pPr>
-        <w:rPr>
-          <w:lang w:val="es-ES"/>
-        </w:rPr>
-      </w:pPr>
-      <w:r>
-        <w:rPr>
-          <w:b/>
-          <w:bCs/>
-          <w:lang w:val="es-ES"/>
-        </w:rPr>
-        <w:t>[</w:t>
-      </w:r>
-      <w:proofErr w:type="spellStart"/>
-      <w:r>
-        <w:rPr>
-          <w:b/>
-          <w:bCs/>
-          <w:lang w:val="es-ES"/>
-        </w:rPr>
-        <w:t>Diap</w:t>
-      </w:r>
-      <w:proofErr w:type="spellEnd"/>
-      <w:r>
-        <w:rPr>
-          <w:b/>
-          <w:bCs/>
-          <w:lang w:val="es-ES"/>
-        </w:rPr>
-        <w:t>. 1</w:t>
-      </w:r>
-      <w:r>
-        <w:rPr>
-          <w:b/>
-          <w:bCs/>
-          <w:lang w:val="es-ES"/>
-        </w:rPr>
-        <w:t>5</w:t>
-      </w:r>
-      <w:r>
-        <w:rPr>
-          <w:b/>
-          <w:bCs/>
-          <w:lang w:val="es-ES"/>
-        </w:rPr>
-        <w:t xml:space="preserve">] </w:t>
-      </w:r>
-      <w:r>
-        <w:rPr>
-          <w:lang w:val="es-ES"/>
-        </w:rPr>
-        <w:t xml:space="preserve">Es posible que existan amenazas de sustitutivos, debido al contenido dado por </w:t>
-      </w:r>
-      <w:proofErr w:type="spellStart"/>
-      <w:r>
-        <w:rPr>
-          <w:lang w:val="es-ES"/>
-        </w:rPr>
-        <w:t>finfluencers</w:t>
-      </w:r>
-      <w:proofErr w:type="spellEnd"/>
-      <w:r>
-        <w:rPr>
-          <w:lang w:val="es-ES"/>
-        </w:rPr>
-        <w:t xml:space="preserve"> y modelos básicos de aprendizaje, para ello, la plataforma debe diferenciarse por su autenticidad, su autoridad técnica y su adaptabilidad, y como se dijo anteriormente, para evitar una confrontación directa con sistemas bancarios tradicionales, se debe centrar en el aprendizaje financiero en vez de la gestión de transacciones y comportarse como una </w:t>
-      </w:r>
-      <w:proofErr w:type="spellStart"/>
-      <w:r>
-        <w:rPr>
-          <w:lang w:val="es-ES"/>
-        </w:rPr>
-        <w:t>fintech</w:t>
-      </w:r>
-      <w:proofErr w:type="spellEnd"/>
-      <w:r>
-        <w:rPr>
-          <w:lang w:val="es-ES"/>
-        </w:rPr>
-        <w:t>.</w:t>
-      </w:r>
-    </w:p>
-    <w:p>
-      <w:pPr>
-        <w:rPr>
-          <w:lang w:val="es-ES"/>
-        </w:rPr>
-      </w:pPr>
-    </w:p>
-    <w:p>
-      <w:pPr>
-        <w:rPr>
-          <w:lang w:val="es-ES"/>
-        </w:rPr>
-      </w:pPr>
-      <w:r>
-        <w:rPr>
-          <w:b/>
-          <w:bCs/>
-          <w:lang w:val="es-ES"/>
-        </w:rPr>
-        <w:t>[</w:t>
-      </w:r>
-      <w:proofErr w:type="spellStart"/>
-      <w:r>
-        <w:rPr>
-          <w:b/>
-          <w:bCs/>
-          <w:lang w:val="es-ES"/>
-        </w:rPr>
-        <w:t>Diap</w:t>
-      </w:r>
-      <w:proofErr w:type="spellEnd"/>
-      <w:r>
-        <w:rPr>
-          <w:b/>
-          <w:bCs/>
-          <w:lang w:val="es-ES"/>
-        </w:rPr>
-        <w:t>. 1</w:t>
-      </w:r>
-      <w:r>
-        <w:rPr>
-          <w:b/>
-          <w:bCs/>
-          <w:lang w:val="es-ES"/>
-        </w:rPr>
-        <w:t>6 a 17</w:t>
-      </w:r>
-      <w:r>
-        <w:rPr>
-          <w:b/>
-          <w:bCs/>
-          <w:lang w:val="es-ES"/>
-        </w:rPr>
-        <w:t xml:space="preserve">] </w:t>
-      </w:r>
-      <w:r>
-        <w:rPr>
-          <w:lang w:val="es-ES"/>
-        </w:rPr>
-        <w:t xml:space="preserve">Adicionalmente en nuestro modelo de negocio se encuentra </w:t>
-      </w:r>
-      <w:r>
-        <w:rPr>
-          <w:lang w:val="es-ES"/>
-        </w:rPr>
-        <w:t>el</w:t>
-      </w:r>
-      <w:r>
-        <w:rPr>
-          <w:lang w:val="es-ES"/>
-        </w:rPr>
-        <w:t xml:space="preserve"> modelo </w:t>
-      </w:r>
-      <w:proofErr w:type="spellStart"/>
-      <w:r>
-        <w:rPr>
-          <w:lang w:val="es-ES"/>
-        </w:rPr>
-        <w:t>Canvas</w:t>
-      </w:r>
-      <w:proofErr w:type="spellEnd"/>
-      <w:r>
-        <w:rPr>
-          <w:lang w:val="es-ES"/>
-        </w:rPr>
-        <w:t xml:space="preserve">, </w:t>
-      </w:r>
-      <w:r>
-        <w:rPr>
-          <w:lang w:val="es-ES"/>
-        </w:rPr>
-        <w:t xml:space="preserve">siendo </w:t>
-      </w:r>
-      <w:r>
-        <w:rPr>
-          <w:lang w:val="es-ES"/>
-        </w:rPr>
-        <w:t xml:space="preserve">alguno de los </w:t>
-      </w:r>
-      <w:r>
-        <w:rPr>
-          <w:lang w:val="es-ES"/>
-        </w:rPr>
-        <w:t xml:space="preserve">posibles </w:t>
-      </w:r>
-      <w:r>
-        <w:rPr>
-          <w:lang w:val="es-ES"/>
-        </w:rPr>
-        <w:t xml:space="preserve">socios clave universidades tales como la Universidad del Rosario o </w:t>
-      </w:r>
-      <w:r>
-        <w:rPr>
-          <w:lang w:val="es-ES"/>
-        </w:rPr>
-        <w:t xml:space="preserve">también </w:t>
-      </w:r>
-      <w:r>
-        <w:rPr>
-          <w:lang w:val="es-ES"/>
-        </w:rPr>
-        <w:t xml:space="preserve">el Banco de la República, </w:t>
-      </w:r>
-      <w:r>
-        <w:rPr>
-          <w:lang w:val="es-ES"/>
-        </w:rPr>
-        <w:t xml:space="preserve">además es posible hacer alianzas con </w:t>
-      </w:r>
-      <w:r>
-        <w:rPr>
-          <w:lang w:val="es-ES"/>
-        </w:rPr>
-        <w:t>instituciones públicas que tienen enfoque sobre temas de educación financiera</w:t>
-      </w:r>
-      <w:r>
-        <w:rPr>
-          <w:lang w:val="es-ES"/>
-        </w:rPr>
-        <w:t xml:space="preserve">, </w:t>
-      </w:r>
-      <w:r>
-        <w:rPr>
-          <w:lang w:val="es-ES"/>
-        </w:rPr>
-        <w:t>además de</w:t>
-      </w:r>
-      <w:r>
-        <w:rPr>
-          <w:lang w:val="es-ES"/>
-        </w:rPr>
-        <w:t xml:space="preserve"> </w:t>
-      </w:r>
-      <w:proofErr w:type="spellStart"/>
-      <w:r>
-        <w:rPr>
-          <w:lang w:val="es-ES"/>
-        </w:rPr>
-        <w:t>ONG’s</w:t>
-      </w:r>
-      <w:proofErr w:type="spellEnd"/>
-      <w:r>
-        <w:rPr>
-          <w:lang w:val="es-ES"/>
-        </w:rPr>
-        <w:t xml:space="preserve"> </w:t>
-      </w:r>
-      <w:r>
-        <w:rPr>
-          <w:lang w:val="es-ES"/>
-        </w:rPr>
-        <w:t>y otras fundaciones cercanas a temas económicos</w:t>
-      </w:r>
-      <w:r>
-        <w:rPr>
-          <w:lang w:val="es-ES"/>
-        </w:rPr>
-        <w:t>. A</w:t>
-      </w:r>
-      <w:r>
-        <w:rPr>
-          <w:lang w:val="es-ES"/>
-        </w:rPr>
-        <w:t xml:space="preserve">cerca de las actividades clave están el mantenimiento de un aplicativo web, el diseño de herramientas interactivas para el cliente, marketing digital, y la creación de contenido dinámico y </w:t>
-      </w:r>
-      <w:proofErr w:type="spellStart"/>
-      <w:r>
-        <w:rPr>
-          <w:lang w:val="es-ES"/>
-        </w:rPr>
-        <w:t>gamificado</w:t>
-      </w:r>
-      <w:proofErr w:type="spellEnd"/>
-      <w:r>
-        <w:rPr>
-          <w:lang w:val="es-ES"/>
-        </w:rPr>
-        <w:t>. Nuestra propuesta de valor como comentamos es una plataforma autónoma, interactiva y personalizada hacia el usuario, con coste cero al usuario final, la corrección de hábitos y un enfoque en la accesibilidad</w:t>
-      </w:r>
-      <w:r>
-        <w:rPr>
-          <w:lang w:val="es-ES"/>
-        </w:rPr>
-        <w:t>. Las relaciones con el cliente serán</w:t>
-      </w:r>
-      <w:r>
-        <w:rPr>
-          <w:lang w:val="es-ES"/>
-        </w:rPr>
-        <w:t xml:space="preserve"> por medio de autoservicio digital, con soporte opcional y comunicación del aplicativo al usuario</w:t>
-      </w:r>
-      <w:r>
-        <w:rPr>
-          <w:lang w:val="es-ES"/>
-        </w:rPr>
-        <w:t>. L</w:t>
-      </w:r>
-      <w:r>
-        <w:rPr>
-          <w:lang w:val="es-ES"/>
-        </w:rPr>
-        <w:t>os canales será</w:t>
-      </w:r>
-      <w:r>
-        <w:rPr>
-          <w:lang w:val="es-ES"/>
-        </w:rPr>
-        <w:t>n</w:t>
-      </w:r>
-      <w:r>
-        <w:rPr>
-          <w:lang w:val="es-ES"/>
-        </w:rPr>
-        <w:t xml:space="preserve"> </w:t>
-      </w:r>
-      <w:r>
-        <w:rPr>
-          <w:lang w:val="es-ES"/>
-        </w:rPr>
-        <w:t>a través de</w:t>
-      </w:r>
-      <w:r>
-        <w:rPr>
-          <w:lang w:val="es-ES"/>
-        </w:rPr>
-        <w:t xml:space="preserve"> nuestra página web</w:t>
-      </w:r>
-      <w:r>
-        <w:rPr>
-          <w:lang w:val="es-ES"/>
-        </w:rPr>
-        <w:t>.</w:t>
-      </w:r>
-      <w:r>
-        <w:rPr>
-          <w:lang w:val="es-ES"/>
-        </w:rPr>
-        <w:t xml:space="preserve"> </w:t>
-      </w:r>
-      <w:r>
-        <w:rPr>
-          <w:lang w:val="es-ES"/>
-        </w:rPr>
-        <w:t>L</w:t>
-      </w:r>
-      <w:r>
-        <w:rPr>
-          <w:lang w:val="es-ES"/>
-        </w:rPr>
-        <w:t xml:space="preserve">os segmentos </w:t>
-      </w:r>
-      <w:r>
-        <w:rPr>
-          <w:lang w:val="es-ES"/>
-        </w:rPr>
-        <w:t xml:space="preserve">del público comprenderán </w:t>
-      </w:r>
-      <w:r>
-        <w:rPr>
-          <w:lang w:val="es-ES"/>
-        </w:rPr>
-        <w:t>los jóvenes entre 18 a 24 años, trabajadores informales, nómadas digitales y personas interesadas en el mundo de la economía</w:t>
-      </w:r>
-      <w:r>
-        <w:rPr>
-          <w:lang w:val="es-ES"/>
-        </w:rPr>
-        <w:t>.</w:t>
-      </w:r>
-      <w:r>
-        <w:rPr>
-          <w:lang w:val="es-ES"/>
-        </w:rPr>
-        <w:t xml:space="preserve"> </w:t>
-      </w:r>
-      <w:r>
-        <w:rPr>
-          <w:lang w:val="es-ES"/>
-        </w:rPr>
-        <w:t>L</w:t>
-      </w:r>
-      <w:r>
-        <w:rPr>
-          <w:lang w:val="es-ES"/>
-        </w:rPr>
-        <w:t xml:space="preserve">a estructura de costos </w:t>
-      </w:r>
-      <w:r>
-        <w:rPr>
-          <w:lang w:val="es-ES"/>
-        </w:rPr>
-        <w:t>está compuesta por el</w:t>
-      </w:r>
-      <w:r>
-        <w:rPr>
-          <w:lang w:val="es-ES"/>
-        </w:rPr>
-        <w:t xml:space="preserve"> salario del talento humano, desarrollo </w:t>
-      </w:r>
-      <w:r>
-        <w:rPr>
-          <w:lang w:val="es-ES"/>
-        </w:rPr>
-        <w:t>tecnológico</w:t>
-      </w:r>
-      <w:r>
-        <w:rPr>
-          <w:lang w:val="es-ES"/>
-        </w:rPr>
-        <w:t xml:space="preserve"> (como servidores), marketing y la producción del material. </w:t>
-      </w:r>
-      <w:r>
-        <w:rPr>
-          <w:lang w:val="es-ES"/>
-        </w:rPr>
-        <w:t>Nuestra fuente de ingreso es</w:t>
-      </w:r>
-      <w:r>
-        <w:rPr>
-          <w:lang w:val="es-ES"/>
-        </w:rPr>
-        <w:t xml:space="preserve"> por medio de suscripciones mensuales, dinero por despliegue de publicidad mediante la versión gratuita y posibles patrocinios de bancos interesad</w:t>
-      </w:r>
-      <w:r>
-        <w:rPr>
-          <w:lang w:val="es-ES"/>
-        </w:rPr>
-        <w:t>o</w:t>
-      </w:r>
-      <w:r>
-        <w:rPr>
-          <w:lang w:val="es-ES"/>
-        </w:rPr>
-        <w:t>s en el aplicativo.</w:t>
-      </w:r>
-    </w:p>
-    <w:p>
-      <w:pPr>
-        <w:rPr>
-          <w:lang w:val="es-ES"/>
-        </w:rPr>
-      </w:pPr>
-      <w:r>
-        <w:rPr>
-          <w:b/>
-          <w:bCs/>
-          <w:lang w:val="es-ES"/>
-        </w:rPr>
-        <w:t>[</w:t>
-      </w:r>
-      <w:proofErr w:type="spellStart"/>
-      <w:r>
-        <w:rPr>
-          <w:b/>
-          <w:bCs/>
-          <w:lang w:val="es-ES"/>
-        </w:rPr>
-        <w:t>Diap</w:t>
-      </w:r>
-      <w:proofErr w:type="spellEnd"/>
-      <w:r>
-        <w:rPr>
-          <w:b/>
-          <w:bCs/>
-          <w:lang w:val="es-ES"/>
-        </w:rPr>
-        <w:t xml:space="preserve">. 18] </w:t>
-      </w:r>
-      <w:r>
-        <w:rPr>
-          <w:lang w:val="es-ES"/>
-        </w:rPr>
-        <w:t xml:space="preserve">Usando lo dado anteriormente, las características del modelo de negocio, se puede garantizar la accesibilidad, la personalización, la escalabilidad y la interactividad con las características del modelo </w:t>
-      </w:r>
-      <w:proofErr w:type="spellStart"/>
-      <w:r>
-        <w:rPr>
-          <w:lang w:val="es-ES"/>
-        </w:rPr>
-        <w:t>Canvas</w:t>
-      </w:r>
-      <w:proofErr w:type="spellEnd"/>
-      <w:r>
-        <w:rPr>
-          <w:lang w:val="es-ES"/>
-        </w:rPr>
-        <w:t xml:space="preserve"> que hemos descrito anteriormente.</w:t>
-      </w:r>
-      <w:r>
-        <w:rPr>
-          <w:lang w:val="es-ES"/>
-        </w:rPr>
-        <w:tab/>
-      </w:r>
-    </w:p>
-    <w:p>
-      <w:pPr>
-        <w:rPr>
-          <w:lang w:val="es-ES"/>
-        </w:rPr>
-      </w:pPr>
-      <w:r>
-        <w:rPr>
-          <w:b/>
-          <w:bCs/>
-          <w:lang w:val="es-ES"/>
-        </w:rPr>
-        <w:t>[</w:t>
-      </w:r>
-      <w:proofErr w:type="spellStart"/>
-      <w:r>
-        <w:rPr>
-          <w:b/>
-          <w:bCs/>
-          <w:lang w:val="es-ES"/>
-        </w:rPr>
-        <w:t>Diap</w:t>
-      </w:r>
-      <w:proofErr w:type="spellEnd"/>
-      <w:r>
-        <w:rPr>
-          <w:b/>
-          <w:bCs/>
-          <w:lang w:val="es-ES"/>
-        </w:rPr>
-        <w:t xml:space="preserve">. 19] </w:t>
-      </w:r>
-      <w:r>
-        <w:rPr>
-          <w:lang w:val="es-ES"/>
-        </w:rPr>
-        <w:t xml:space="preserve">Entonces, ¿cuál es nuestra misión?, es </w:t>
       </w:r>
       <w:r>
         <w:rPr>
@@ -1828,7 +663,1203 @@
           <w:iCs/>
           <w:lang w:val="es-ES"/>
         </w:rPr>
-        <w:t>Empoderar a jóvenes, trabajadores informales y nómadas digitales en Bogotá mediante un eco sistema tecnológico de planificación financiera personalizado y accesible. A través de algoritmos de análisis de datos y herramientas interactivas, transforma</w:t>
+        <w:t xml:space="preserve"> </w:t>
+      </w:r>
+      <w:r>
+        <w:rPr>
+          <w:lang w:val="es-ES"/>
+        </w:rPr>
+        <w:t>Nuestro fuerte no es buscar solamente realizar una plataforma de cursos y ya, sino que esta busque comprender al usuario sobre temas financieros de forma intuitiva y</w:t>
+      </w:r>
+      <w:r>
+        <w:rPr>
+          <w:lang w:val="es-ES"/>
+        </w:rPr>
+        <w:t xml:space="preserve"> de</w:t>
+      </w:r>
+      <w:r>
+        <w:rPr>
+          <w:lang w:val="es-ES"/>
+        </w:rPr>
+        <w:t xml:space="preserve"> fácil </w:t>
+      </w:r>
+      <w:r>
+        <w:rPr>
+          <w:lang w:val="es-ES"/>
+        </w:rPr>
+        <w:t>acceso</w:t>
+      </w:r>
+      <w:r>
+        <w:rPr>
+          <w:lang w:val="es-ES"/>
+        </w:rPr>
+        <w:t>.</w:t>
+      </w:r>
+    </w:p>
+    <w:p>
+      <w:pPr>
+        <w:rPr>
+          <w:lang w:val="es-ES"/>
+        </w:rPr>
+      </w:pPr>
+      <w:r>
+        <w:rPr>
+          <w:b/>
+          <w:bCs/>
+          <w:lang w:val="es-ES"/>
+        </w:rPr>
+        <w:t>[</w:t>
+      </w:r>
+      <w:proofErr w:type="spellStart"/>
+      <w:r>
+        <w:rPr>
+          <w:b/>
+          <w:bCs/>
+          <w:lang w:val="es-ES"/>
+        </w:rPr>
+        <w:t>Diap</w:t>
+      </w:r>
+      <w:proofErr w:type="spellEnd"/>
+      <w:r>
+        <w:rPr>
+          <w:b/>
+          <w:bCs/>
+          <w:lang w:val="es-ES"/>
+        </w:rPr>
+        <w:t>. 7 a 8]</w:t>
+      </w:r>
+      <w:r>
+        <w:rPr>
+          <w:b/>
+          <w:bCs/>
+          <w:lang w:val="es-ES"/>
+        </w:rPr>
+        <w:t xml:space="preserve"> </w:t>
+      </w:r>
+      <w:r>
+        <w:rPr>
+          <w:lang w:val="es-ES"/>
+        </w:rPr>
+        <w:t xml:space="preserve">Para nuestra propuesta vamos a hablar acerca de las características del producto, en primer lugar, nuestro sistema implementará Gamificación Ligera para incentivar y facilitar la compresión de términos económicos a nuestros usuarios, para ello, también se implementa una Interfaz Intuitiva. Además de Lecciones para el Aprendizaje Financiero que permitan entregar </w:t>
+      </w:r>
+      <w:r>
+        <w:rPr>
+          <w:lang w:val="es-ES"/>
+        </w:rPr>
+        <w:lastRenderedPageBreak/>
+        <w:t xml:space="preserve">temas como intereses y conceptos financieros al cliente. Todo esto bajo un modelo </w:t>
+      </w:r>
+      <w:proofErr w:type="spellStart"/>
+      <w:r>
+        <w:rPr>
+          <w:lang w:val="es-ES"/>
+        </w:rPr>
+        <w:t>freemium</w:t>
+      </w:r>
+      <w:proofErr w:type="spellEnd"/>
+      <w:r>
+        <w:rPr>
+          <w:lang w:val="es-ES"/>
+        </w:rPr>
+        <w:t>, es decir, que no tiene costo alguno usar la plataforma, y para funciones adicionales como remover anuncios o mayor profundidad sobre los temas, se tendrá la opción de una suscripción mensual opcional. Permitiendo a nuestro público objetivo poder acceder al entorno</w:t>
+      </w:r>
+      <w:r>
+        <w:rPr>
+          <w:lang w:val="es-ES"/>
+        </w:rPr>
+        <w:t xml:space="preserve"> y obtener ganancias por medio de este modelo.</w:t>
+      </w:r>
+    </w:p>
+    <w:p>
+      <w:r>
+        <w:rPr>
+          <w:b/>
+          <w:bCs/>
+          <w:lang w:val="es-ES"/>
+        </w:rPr>
+        <w:t>[</w:t>
+      </w:r>
+      <w:proofErr w:type="spellStart"/>
+      <w:r>
+        <w:rPr>
+          <w:b/>
+          <w:bCs/>
+          <w:lang w:val="es-ES"/>
+        </w:rPr>
+        <w:t>Diap</w:t>
+      </w:r>
+      <w:proofErr w:type="spellEnd"/>
+      <w:r>
+        <w:rPr>
+          <w:b/>
+          <w:bCs/>
+          <w:lang w:val="es-ES"/>
+        </w:rPr>
+        <w:t xml:space="preserve">. </w:t>
+      </w:r>
+      <w:r>
+        <w:rPr>
+          <w:b/>
+          <w:bCs/>
+          <w:lang w:val="es-ES"/>
+        </w:rPr>
+        <w:t>9</w:t>
+      </w:r>
+      <w:r>
+        <w:rPr>
+          <w:b/>
+          <w:bCs/>
+          <w:lang w:val="es-ES"/>
+        </w:rPr>
+        <w:t xml:space="preserve">] </w:t>
+      </w:r>
+      <w:r>
+        <w:rPr>
+          <w:lang w:val="es-ES"/>
+        </w:rPr>
+        <w:t>[Explicación de la plataforma]</w:t>
+      </w:r>
+    </w:p>
+    <w:p>
+      <w:pPr>
+        <w:rPr>
+          <w:lang w:val="es-ES"/>
+        </w:rPr>
+      </w:pPr>
+      <w:r>
+        <w:rPr>
+          <w:b/>
+          <w:bCs/>
+          <w:lang w:val="es-ES"/>
+        </w:rPr>
+        <w:t>[</w:t>
+      </w:r>
+      <w:proofErr w:type="spellStart"/>
+      <w:r>
+        <w:rPr>
+          <w:b/>
+          <w:bCs/>
+          <w:lang w:val="es-ES"/>
+        </w:rPr>
+        <w:t>Diap</w:t>
+      </w:r>
+      <w:proofErr w:type="spellEnd"/>
+      <w:r>
+        <w:rPr>
+          <w:b/>
+          <w:bCs/>
+          <w:lang w:val="es-ES"/>
+        </w:rPr>
+        <w:t xml:space="preserve">. </w:t>
+      </w:r>
+      <w:r>
+        <w:rPr>
+          <w:b/>
+          <w:bCs/>
+          <w:lang w:val="es-ES"/>
+        </w:rPr>
+        <w:t>10</w:t>
+      </w:r>
+      <w:r>
+        <w:rPr>
+          <w:b/>
+          <w:bCs/>
+          <w:lang w:val="es-ES"/>
+        </w:rPr>
+        <w:t xml:space="preserve">] </w:t>
+      </w:r>
+      <w:r>
+        <w:rPr>
+          <w:lang w:val="es-ES"/>
+        </w:rPr>
+        <w:t xml:space="preserve">Explicando las diferentes herramientas tecnológicas que usamos para construir el anterior prototipo son las siguientes, se utilizará un modelo dual de bases de datos basada en PostgreSQL, la cual almacenará la parte transaccional y </w:t>
+      </w:r>
+      <w:proofErr w:type="spellStart"/>
+      <w:r>
+        <w:rPr>
+          <w:lang w:val="es-ES"/>
+        </w:rPr>
+        <w:t>MondoDB</w:t>
+      </w:r>
+      <w:proofErr w:type="spellEnd"/>
+      <w:r>
+        <w:rPr>
+          <w:lang w:val="es-ES"/>
+        </w:rPr>
+        <w:t xml:space="preserve">, que tendrá los contenidos y los logs, lo que permite equilibrar la seguridad de los datos financieros con la flexibilidad necesaria, para la construcción del modelo de Aprendizaje Automático usamos librerías de Python como </w:t>
+      </w:r>
+      <w:proofErr w:type="spellStart"/>
+      <w:r>
+        <w:rPr>
+          <w:lang w:val="es-ES"/>
+        </w:rPr>
+        <w:t>Scikit-Learn</w:t>
+      </w:r>
+      <w:proofErr w:type="spellEnd"/>
+      <w:r>
+        <w:rPr>
+          <w:lang w:val="es-ES"/>
+        </w:rPr>
+        <w:t xml:space="preserve"> y </w:t>
+      </w:r>
+      <w:proofErr w:type="spellStart"/>
+      <w:r>
+        <w:rPr>
+          <w:lang w:val="es-ES"/>
+        </w:rPr>
+        <w:t>TensorFlor</w:t>
+      </w:r>
+      <w:proofErr w:type="spellEnd"/>
+      <w:r>
+        <w:rPr>
+          <w:lang w:val="es-ES"/>
+        </w:rPr>
+        <w:t>. P</w:t>
+      </w:r>
+      <w:r>
+        <w:rPr>
+          <w:lang w:val="es-ES"/>
+        </w:rPr>
+        <w:t xml:space="preserve">ara el </w:t>
+      </w:r>
+      <w:proofErr w:type="spellStart"/>
+      <w:r>
+        <w:rPr>
+          <w:lang w:val="es-ES"/>
+        </w:rPr>
+        <w:t>backend</w:t>
+      </w:r>
+      <w:proofErr w:type="spellEnd"/>
+      <w:r>
+        <w:rPr>
+          <w:lang w:val="es-ES"/>
+        </w:rPr>
+        <w:t>, API Gateway y autorización del servicio se usará Node.js</w:t>
+      </w:r>
+      <w:r>
+        <w:rPr>
+          <w:lang w:val="es-ES"/>
+        </w:rPr>
+        <w:t>.</w:t>
+      </w:r>
+      <w:r>
+        <w:rPr>
+          <w:lang w:val="es-ES"/>
+        </w:rPr>
+        <w:t xml:space="preserve"> </w:t>
+      </w:r>
+      <w:r>
+        <w:rPr>
+          <w:lang w:val="es-ES"/>
+        </w:rPr>
+        <w:t>Y</w:t>
+      </w:r>
+      <w:r>
+        <w:rPr>
+          <w:lang w:val="es-ES"/>
+        </w:rPr>
+        <w:t xml:space="preserve"> finalmente para el </w:t>
+      </w:r>
+      <w:proofErr w:type="spellStart"/>
+      <w:r>
+        <w:rPr>
+          <w:lang w:val="es-ES"/>
+        </w:rPr>
+        <w:t>front-end</w:t>
+      </w:r>
+      <w:proofErr w:type="spellEnd"/>
+      <w:r>
+        <w:rPr>
+          <w:lang w:val="es-ES"/>
+        </w:rPr>
+        <w:t xml:space="preserve"> se utilizará Angular, todo esto contenido bajo una infraestructura y </w:t>
+      </w:r>
+      <w:proofErr w:type="spellStart"/>
+      <w:r>
+        <w:rPr>
+          <w:lang w:val="es-ES"/>
+        </w:rPr>
+        <w:t>conten</w:t>
+      </w:r>
+      <w:r>
+        <w:rPr>
+          <w:lang w:val="es-ES"/>
+        </w:rPr>
+        <w:t>ización</w:t>
+      </w:r>
+      <w:proofErr w:type="spellEnd"/>
+      <w:r>
+        <w:rPr>
+          <w:lang w:val="es-ES"/>
+        </w:rPr>
+        <w:t xml:space="preserve"> mediante Docker.</w:t>
+      </w:r>
+    </w:p>
+    <w:p>
+      <w:pPr>
+        <w:rPr>
+          <w:lang w:val="es-ES"/>
+        </w:rPr>
+      </w:pPr>
+      <w:r>
+        <w:rPr>
+          <w:b/>
+          <w:bCs/>
+          <w:lang w:val="es-ES"/>
+        </w:rPr>
+        <w:t>[</w:t>
+      </w:r>
+      <w:proofErr w:type="spellStart"/>
+      <w:r>
+        <w:rPr>
+          <w:b/>
+          <w:bCs/>
+          <w:lang w:val="es-ES"/>
+        </w:rPr>
+        <w:t>Diap</w:t>
+      </w:r>
+      <w:proofErr w:type="spellEnd"/>
+      <w:r>
+        <w:rPr>
+          <w:b/>
+          <w:bCs/>
+          <w:lang w:val="es-ES"/>
+        </w:rPr>
+        <w:t>. 1</w:t>
+      </w:r>
+      <w:r>
+        <w:rPr>
+          <w:b/>
+          <w:bCs/>
+          <w:lang w:val="es-ES"/>
+        </w:rPr>
+        <w:t>1</w:t>
+      </w:r>
+      <w:r>
+        <w:rPr>
+          <w:b/>
+          <w:bCs/>
+          <w:lang w:val="es-ES"/>
+        </w:rPr>
+        <w:t xml:space="preserve">] </w:t>
+      </w:r>
+      <w:r>
+        <w:rPr>
+          <w:lang w:val="es-ES"/>
+        </w:rPr>
+        <w:t>Sobre la arquitectura, como describimos anteriormente, la arquitectura se basa en un modelo de capas,</w:t>
+      </w:r>
+      <w:r>
+        <w:rPr>
+          <w:lang w:val="es-ES"/>
+        </w:rPr>
+        <w:t xml:space="preserve"> dentro del cual se encuentra la Base de Datos hechas con Mondo y </w:t>
+      </w:r>
+      <w:proofErr w:type="spellStart"/>
+      <w:r>
+        <w:rPr>
+          <w:lang w:val="es-ES"/>
+        </w:rPr>
+        <w:t>Postrgre</w:t>
+      </w:r>
+      <w:proofErr w:type="spellEnd"/>
+      <w:r>
+        <w:rPr>
+          <w:lang w:val="es-ES"/>
+        </w:rPr>
+        <w:t xml:space="preserve">, la Inteligencia Artificial para crear el modelo con las librerías de Python ya mencionadas, la capa de Microservicios usando Node.js y la </w:t>
+      </w:r>
+      <w:proofErr w:type="spellStart"/>
+      <w:r>
+        <w:rPr>
+          <w:lang w:val="es-ES"/>
+        </w:rPr>
+        <w:t>Frontend</w:t>
+      </w:r>
+      <w:proofErr w:type="spellEnd"/>
+      <w:r>
+        <w:rPr>
+          <w:lang w:val="es-ES"/>
+        </w:rPr>
+        <w:t xml:space="preserve"> usando Angular, cuya infraestructura es dada por Docker, a la derecha se describe el mismo </w:t>
+      </w:r>
+      <w:proofErr w:type="gramStart"/>
+      <w:r>
+        <w:rPr>
+          <w:lang w:val="es-ES"/>
+        </w:rPr>
+        <w:t>modelo</w:t>
+      </w:r>
+      <w:proofErr w:type="gramEnd"/>
+      <w:r>
+        <w:rPr>
+          <w:lang w:val="es-ES"/>
+        </w:rPr>
+        <w:t xml:space="preserve"> pero con mayor profundidad.</w:t>
+      </w:r>
+    </w:p>
+    <w:p>
+      <w:pPr>
+        <w:rPr>
+          <w:lang w:val="es-ES"/>
+        </w:rPr>
+      </w:pPr>
+      <w:r>
+        <w:rPr>
+          <w:b/>
+          <w:bCs/>
+          <w:lang w:val="es-ES"/>
+        </w:rPr>
+        <w:t>[</w:t>
+      </w:r>
+      <w:proofErr w:type="spellStart"/>
+      <w:r>
+        <w:rPr>
+          <w:b/>
+          <w:bCs/>
+          <w:lang w:val="es-ES"/>
+        </w:rPr>
+        <w:t>Diap</w:t>
+      </w:r>
+      <w:proofErr w:type="spellEnd"/>
+      <w:r>
+        <w:rPr>
+          <w:b/>
+          <w:bCs/>
+          <w:lang w:val="es-ES"/>
+        </w:rPr>
+        <w:t>. 1</w:t>
+      </w:r>
+      <w:r>
+        <w:rPr>
+          <w:b/>
+          <w:bCs/>
+          <w:lang w:val="es-ES"/>
+        </w:rPr>
+        <w:t>2</w:t>
+      </w:r>
+      <w:r>
+        <w:rPr>
+          <w:b/>
+          <w:bCs/>
+          <w:lang w:val="es-ES"/>
+        </w:rPr>
+        <w:t xml:space="preserve"> </w:t>
+      </w:r>
+      <w:r>
+        <w:rPr>
+          <w:b/>
+          <w:bCs/>
+          <w:lang w:val="es-ES"/>
+        </w:rPr>
+        <w:t>a</w:t>
+      </w:r>
+      <w:r>
+        <w:rPr>
+          <w:b/>
+          <w:bCs/>
+          <w:lang w:val="es-ES"/>
+        </w:rPr>
+        <w:t xml:space="preserve"> 1</w:t>
+      </w:r>
+      <w:r>
+        <w:rPr>
+          <w:b/>
+          <w:bCs/>
+          <w:lang w:val="es-ES"/>
+        </w:rPr>
+        <w:t>3</w:t>
+      </w:r>
+      <w:r>
+        <w:rPr>
+          <w:b/>
+          <w:bCs/>
+          <w:lang w:val="es-ES"/>
+        </w:rPr>
+        <w:t>]</w:t>
+      </w:r>
+      <w:r>
+        <w:rPr>
+          <w:b/>
+          <w:bCs/>
+          <w:lang w:val="es-ES"/>
+        </w:rPr>
+        <w:t xml:space="preserve"> </w:t>
+      </w:r>
+      <w:r>
+        <w:rPr>
+          <w:lang w:val="es-ES"/>
+        </w:rPr>
+        <w:t xml:space="preserve">Bueno entonces el estudio de mercado, nuestro aplicativo tiene como objetivo todas las personas de bajos recursos, estudiantes y nómadas digitales, por esto, es importante ofrecer un servicio gratuito para lograr acaparar la demanda existente, en competencia no tenemos competencia directa, más si existen gran cantidad de plataformas financieras, estas ofrecen poco o nulo conocimiento acerca de educación financiera. No existe una plataforma que se centre exclusivamente en conocimientos financieros apropiadamente. </w:t>
+      </w:r>
+      <w:proofErr w:type="spellStart"/>
+      <w:r>
+        <w:rPr>
+          <w:lang w:val="es-ES"/>
+        </w:rPr>
+        <w:t>Bconomy</w:t>
+      </w:r>
+      <w:proofErr w:type="spellEnd"/>
+      <w:r>
+        <w:rPr>
+          <w:lang w:val="es-ES"/>
+        </w:rPr>
+        <w:t xml:space="preserve"> es una herramienta diseñada para evaluar la salud financiera pero no ofrece conocimientos profundos sobre economía, </w:t>
+      </w:r>
+      <w:proofErr w:type="spellStart"/>
+      <w:r>
+        <w:rPr>
+          <w:lang w:val="es-ES"/>
+        </w:rPr>
+        <w:t>Fintonic</w:t>
+      </w:r>
+      <w:proofErr w:type="spellEnd"/>
+      <w:r>
+        <w:rPr>
+          <w:lang w:val="es-ES"/>
+        </w:rPr>
+        <w:t xml:space="preserve"> se encarga de organizar cuentas bancarias y centralizarlas y </w:t>
+      </w:r>
+      <w:proofErr w:type="spellStart"/>
+      <w:r>
+        <w:rPr>
+          <w:lang w:val="es-ES"/>
+        </w:rPr>
+        <w:t>Nequi</w:t>
+      </w:r>
+      <w:proofErr w:type="spellEnd"/>
+      <w:r>
+        <w:rPr>
+          <w:lang w:val="es-ES"/>
+        </w:rPr>
+        <w:t xml:space="preserve"> es una plataforma bancaria digital. No existen formas operacionales centradas en </w:t>
+      </w:r>
+      <w:proofErr w:type="spellStart"/>
+      <w:r>
+        <w:rPr>
+          <w:lang w:val="es-ES"/>
+        </w:rPr>
+        <w:t>edtech</w:t>
+      </w:r>
+      <w:proofErr w:type="spellEnd"/>
+      <w:r>
+        <w:rPr>
+          <w:lang w:val="es-ES"/>
+        </w:rPr>
+        <w:t xml:space="preserve"> sobre aprendizaje económico.</w:t>
+      </w:r>
+    </w:p>
+    <w:p>
+      <w:pPr>
+        <w:rPr>
+          <w:lang w:val="es-ES"/>
+        </w:rPr>
+      </w:pPr>
+      <w:r>
+        <w:rPr>
+          <w:b/>
+          <w:bCs/>
+          <w:lang w:val="es-ES"/>
+        </w:rPr>
+        <w:t>[</w:t>
+      </w:r>
+      <w:proofErr w:type="spellStart"/>
+      <w:r>
+        <w:rPr>
+          <w:b/>
+          <w:bCs/>
+          <w:lang w:val="es-ES"/>
+        </w:rPr>
+        <w:t>Diap</w:t>
+      </w:r>
+      <w:proofErr w:type="spellEnd"/>
+      <w:r>
+        <w:rPr>
+          <w:b/>
+          <w:bCs/>
+          <w:lang w:val="es-ES"/>
+        </w:rPr>
+        <w:t>. 1</w:t>
+      </w:r>
+      <w:r>
+        <w:rPr>
+          <w:b/>
+          <w:bCs/>
+          <w:lang w:val="es-ES"/>
+        </w:rPr>
+        <w:t>4</w:t>
+      </w:r>
+      <w:r>
+        <w:rPr>
+          <w:b/>
+          <w:bCs/>
+          <w:lang w:val="es-ES"/>
+        </w:rPr>
+        <w:t xml:space="preserve">] </w:t>
+      </w:r>
+      <w:r>
+        <w:rPr>
+          <w:lang w:val="es-ES"/>
+        </w:rPr>
+        <w:t xml:space="preserve">Esto se verifica con las 5 fuerzas de Porter, en las cuales se observa como la plataforma tiene poca competencia con el poder del cliente, gracias a su modelo Freemium. Adicionalmente, de </w:t>
+      </w:r>
+      <w:r>
+        <w:rPr>
+          <w:lang w:val="es-ES"/>
+        </w:rPr>
+        <w:t xml:space="preserve">buscar promoverse mediante Google </w:t>
+      </w:r>
+      <w:proofErr w:type="spellStart"/>
+      <w:r>
+        <w:rPr>
+          <w:lang w:val="es-ES"/>
+        </w:rPr>
+        <w:t>Ads</w:t>
+      </w:r>
+      <w:proofErr w:type="spellEnd"/>
+      <w:r>
+        <w:rPr>
+          <w:lang w:val="es-ES"/>
+        </w:rPr>
+        <w:t xml:space="preserve"> y el desarrollo de alianzas universitarias y con sectores públicos, y a pesar de que es posible crear una app similar, se mitiga este peligro de nuevos competidores al establecernos, crear confianza y buscar innovar creando una reputación estable.</w:t>
+      </w:r>
+    </w:p>
+    <w:p>
+      <w:pPr>
+        <w:rPr>
+          <w:lang w:val="es-ES"/>
+        </w:rPr>
+      </w:pPr>
+      <w:r>
+        <w:rPr>
+          <w:b/>
+          <w:bCs/>
+          <w:lang w:val="es-ES"/>
+        </w:rPr>
+        <w:t>[</w:t>
+      </w:r>
+      <w:proofErr w:type="spellStart"/>
+      <w:r>
+        <w:rPr>
+          <w:b/>
+          <w:bCs/>
+          <w:lang w:val="es-ES"/>
+        </w:rPr>
+        <w:t>Diap</w:t>
+      </w:r>
+      <w:proofErr w:type="spellEnd"/>
+      <w:r>
+        <w:rPr>
+          <w:b/>
+          <w:bCs/>
+          <w:lang w:val="es-ES"/>
+        </w:rPr>
+        <w:t>. 1</w:t>
+      </w:r>
+      <w:r>
+        <w:rPr>
+          <w:b/>
+          <w:bCs/>
+          <w:lang w:val="es-ES"/>
+        </w:rPr>
+        <w:t>5</w:t>
+      </w:r>
+      <w:r>
+        <w:rPr>
+          <w:b/>
+          <w:bCs/>
+          <w:lang w:val="es-ES"/>
+        </w:rPr>
+        <w:t xml:space="preserve">] </w:t>
+      </w:r>
+      <w:r>
+        <w:rPr>
+          <w:lang w:val="es-ES"/>
+        </w:rPr>
+        <w:t xml:space="preserve">Es posible que existan amenazas de sustitutivos, debido al contenido dado por </w:t>
+      </w:r>
+      <w:proofErr w:type="spellStart"/>
+      <w:r>
+        <w:rPr>
+          <w:lang w:val="es-ES"/>
+        </w:rPr>
+        <w:t>finfluencers</w:t>
+      </w:r>
+      <w:proofErr w:type="spellEnd"/>
+      <w:r>
+        <w:rPr>
+          <w:lang w:val="es-ES"/>
+        </w:rPr>
+        <w:t xml:space="preserve"> y modelos básicos de aprendizaje, para ello, la plataforma debe diferenciarse por su autenticidad, su autoridad técnica y su adaptabilidad, y como se dijo anteriormente, para evitar una confrontación directa con sistemas bancarios tradicionales, se debe centrar en el aprendizaje financiero en vez de la gestión de transacciones y comportarse como una </w:t>
+      </w:r>
+      <w:proofErr w:type="spellStart"/>
+      <w:r>
+        <w:rPr>
+          <w:lang w:val="es-ES"/>
+        </w:rPr>
+        <w:t>fintech</w:t>
+      </w:r>
+      <w:proofErr w:type="spellEnd"/>
+      <w:r>
+        <w:rPr>
+          <w:lang w:val="es-ES"/>
+        </w:rPr>
+        <w:t>.</w:t>
+      </w:r>
+    </w:p>
+    <w:p>
+      <w:pPr>
+        <w:rPr>
+          <w:lang w:val="es-ES"/>
+        </w:rPr>
+      </w:pPr>
+    </w:p>
+    <w:p>
+      <w:pPr>
+        <w:rPr>
+          <w:lang w:val="es-ES"/>
+        </w:rPr>
+      </w:pPr>
+      <w:r>
+        <w:rPr>
+          <w:b/>
+          <w:bCs/>
+          <w:lang w:val="es-ES"/>
+        </w:rPr>
+        <w:lastRenderedPageBreak/>
+        <w:t>[</w:t>
+      </w:r>
+      <w:proofErr w:type="spellStart"/>
+      <w:r>
+        <w:rPr>
+          <w:b/>
+          <w:bCs/>
+          <w:lang w:val="es-ES"/>
+        </w:rPr>
+        <w:t>Diap</w:t>
+      </w:r>
+      <w:proofErr w:type="spellEnd"/>
+      <w:r>
+        <w:rPr>
+          <w:b/>
+          <w:bCs/>
+          <w:lang w:val="es-ES"/>
+        </w:rPr>
+        <w:t>. 1</w:t>
+      </w:r>
+      <w:r>
+        <w:rPr>
+          <w:b/>
+          <w:bCs/>
+          <w:lang w:val="es-ES"/>
+        </w:rPr>
+        <w:t>6 a 17</w:t>
+      </w:r>
+      <w:r>
+        <w:rPr>
+          <w:b/>
+          <w:bCs/>
+          <w:lang w:val="es-ES"/>
+        </w:rPr>
+        <w:t xml:space="preserve">] </w:t>
+      </w:r>
+      <w:r>
+        <w:rPr>
+          <w:lang w:val="es-ES"/>
+        </w:rPr>
+        <w:t xml:space="preserve">Adicionalmente en nuestro modelo de negocio se encuentra </w:t>
+      </w:r>
+      <w:r>
+        <w:rPr>
+          <w:lang w:val="es-ES"/>
+        </w:rPr>
+        <w:t>el</w:t>
+      </w:r>
+      <w:r>
+        <w:rPr>
+          <w:lang w:val="es-ES"/>
+        </w:rPr>
+        <w:t xml:space="preserve"> modelo </w:t>
+      </w:r>
+      <w:proofErr w:type="spellStart"/>
+      <w:r>
+        <w:rPr>
+          <w:lang w:val="es-ES"/>
+        </w:rPr>
+        <w:t>Canvas</w:t>
+      </w:r>
+      <w:proofErr w:type="spellEnd"/>
+      <w:r>
+        <w:rPr>
+          <w:lang w:val="es-ES"/>
+        </w:rPr>
+        <w:t xml:space="preserve">, </w:t>
+      </w:r>
+      <w:r>
+        <w:rPr>
+          <w:lang w:val="es-ES"/>
+        </w:rPr>
+        <w:t xml:space="preserve">siendo </w:t>
+      </w:r>
+      <w:r>
+        <w:rPr>
+          <w:lang w:val="es-ES"/>
+        </w:rPr>
+        <w:t xml:space="preserve">alguno de los </w:t>
+      </w:r>
+      <w:r>
+        <w:rPr>
+          <w:lang w:val="es-ES"/>
+        </w:rPr>
+        <w:t xml:space="preserve">posibles </w:t>
+      </w:r>
+      <w:r>
+        <w:rPr>
+          <w:lang w:val="es-ES"/>
+        </w:rPr>
+        <w:t xml:space="preserve">socios clave universidades tales como la Universidad del Rosario o </w:t>
+      </w:r>
+      <w:r>
+        <w:rPr>
+          <w:lang w:val="es-ES"/>
+        </w:rPr>
+        <w:t xml:space="preserve">también </w:t>
+      </w:r>
+      <w:r>
+        <w:rPr>
+          <w:lang w:val="es-ES"/>
+        </w:rPr>
+        <w:t xml:space="preserve">el Banco de la República, </w:t>
+      </w:r>
+      <w:r>
+        <w:rPr>
+          <w:lang w:val="es-ES"/>
+        </w:rPr>
+        <w:t xml:space="preserve">además es posible hacer alianzas con </w:t>
+      </w:r>
+      <w:r>
+        <w:rPr>
+          <w:lang w:val="es-ES"/>
+        </w:rPr>
+        <w:t>instituciones públicas que tienen enfoque sobre temas de educación financiera</w:t>
+      </w:r>
+      <w:r>
+        <w:rPr>
+          <w:lang w:val="es-ES"/>
+        </w:rPr>
+        <w:t xml:space="preserve">, </w:t>
+      </w:r>
+      <w:r>
+        <w:rPr>
+          <w:lang w:val="es-ES"/>
+        </w:rPr>
+        <w:t>además de</w:t>
+      </w:r>
+      <w:r>
+        <w:rPr>
+          <w:lang w:val="es-ES"/>
+        </w:rPr>
+        <w:t xml:space="preserve"> </w:t>
+      </w:r>
+      <w:proofErr w:type="spellStart"/>
+      <w:r>
+        <w:rPr>
+          <w:lang w:val="es-ES"/>
+        </w:rPr>
+        <w:t>ONG’s</w:t>
+      </w:r>
+      <w:proofErr w:type="spellEnd"/>
+      <w:r>
+        <w:rPr>
+          <w:lang w:val="es-ES"/>
+        </w:rPr>
+        <w:t xml:space="preserve"> </w:t>
+      </w:r>
+      <w:r>
+        <w:rPr>
+          <w:lang w:val="es-ES"/>
+        </w:rPr>
+        <w:t>y otras fundaciones cercanas a temas económicos</w:t>
+      </w:r>
+      <w:r>
+        <w:rPr>
+          <w:lang w:val="es-ES"/>
+        </w:rPr>
+        <w:t>. A</w:t>
+      </w:r>
+      <w:r>
+        <w:rPr>
+          <w:lang w:val="es-ES"/>
+        </w:rPr>
+        <w:t xml:space="preserve">cerca de las actividades clave están el mantenimiento de un aplicativo web, el diseño de herramientas interactivas para el cliente, marketing digital, y la creación de contenido dinámico y </w:t>
+      </w:r>
+      <w:proofErr w:type="spellStart"/>
+      <w:r>
+        <w:rPr>
+          <w:lang w:val="es-ES"/>
+        </w:rPr>
+        <w:t>gamificado</w:t>
+      </w:r>
+      <w:proofErr w:type="spellEnd"/>
+      <w:r>
+        <w:rPr>
+          <w:lang w:val="es-ES"/>
+        </w:rPr>
+        <w:t>. Nuestra propuesta de valor como comentamos es una plataforma autónoma, interactiva y personalizada hacia el usuario, con coste cero al usuario final, la corrección de hábitos y un enfoque en la accesibilidad</w:t>
+      </w:r>
+      <w:r>
+        <w:rPr>
+          <w:lang w:val="es-ES"/>
+        </w:rPr>
+        <w:t>. Las relaciones con el cliente serán</w:t>
+      </w:r>
+      <w:r>
+        <w:rPr>
+          <w:lang w:val="es-ES"/>
+        </w:rPr>
+        <w:t xml:space="preserve"> por medio de autoservicio digital, con soporte opcional y comunicación del aplicativo al usuario</w:t>
+      </w:r>
+      <w:r>
+        <w:rPr>
+          <w:lang w:val="es-ES"/>
+        </w:rPr>
+        <w:t>. L</w:t>
+      </w:r>
+      <w:r>
+        <w:rPr>
+          <w:lang w:val="es-ES"/>
+        </w:rPr>
+        <w:t>os canales será</w:t>
+      </w:r>
+      <w:r>
+        <w:rPr>
+          <w:lang w:val="es-ES"/>
+        </w:rPr>
+        <w:t>n</w:t>
+      </w:r>
+      <w:r>
+        <w:rPr>
+          <w:lang w:val="es-ES"/>
+        </w:rPr>
+        <w:t xml:space="preserve"> </w:t>
+      </w:r>
+      <w:r>
+        <w:rPr>
+          <w:lang w:val="es-ES"/>
+        </w:rPr>
+        <w:t>a través de</w:t>
+      </w:r>
+      <w:r>
+        <w:rPr>
+          <w:lang w:val="es-ES"/>
+        </w:rPr>
+        <w:t xml:space="preserve"> nuestra página web</w:t>
+      </w:r>
+      <w:r>
+        <w:rPr>
+          <w:lang w:val="es-ES"/>
+        </w:rPr>
+        <w:t>.</w:t>
+      </w:r>
+      <w:r>
+        <w:rPr>
+          <w:lang w:val="es-ES"/>
+        </w:rPr>
+        <w:t xml:space="preserve"> </w:t>
+      </w:r>
+      <w:r>
+        <w:rPr>
+          <w:lang w:val="es-ES"/>
+        </w:rPr>
+        <w:t>L</w:t>
+      </w:r>
+      <w:r>
+        <w:rPr>
+          <w:lang w:val="es-ES"/>
+        </w:rPr>
+        <w:t xml:space="preserve">os segmentos </w:t>
+      </w:r>
+      <w:r>
+        <w:rPr>
+          <w:lang w:val="es-ES"/>
+        </w:rPr>
+        <w:t xml:space="preserve">del público comprenderán </w:t>
+      </w:r>
+      <w:r>
+        <w:rPr>
+          <w:lang w:val="es-ES"/>
+        </w:rPr>
+        <w:t>los jóvenes entre 18 a 24 años, trabajadores informales, nómadas digitales y personas interesadas en el mundo de la economía</w:t>
+      </w:r>
+      <w:r>
+        <w:rPr>
+          <w:lang w:val="es-ES"/>
+        </w:rPr>
+        <w:t>.</w:t>
+      </w:r>
+      <w:r>
+        <w:rPr>
+          <w:lang w:val="es-ES"/>
+        </w:rPr>
+        <w:t xml:space="preserve"> </w:t>
+      </w:r>
+      <w:r>
+        <w:rPr>
+          <w:lang w:val="es-ES"/>
+        </w:rPr>
+        <w:t>L</w:t>
+      </w:r>
+      <w:r>
+        <w:rPr>
+          <w:lang w:val="es-ES"/>
+        </w:rPr>
+        <w:t xml:space="preserve">a estructura de costos </w:t>
+      </w:r>
+      <w:r>
+        <w:rPr>
+          <w:lang w:val="es-ES"/>
+        </w:rPr>
+        <w:t>está compuesta por el</w:t>
+      </w:r>
+      <w:r>
+        <w:rPr>
+          <w:lang w:val="es-ES"/>
+        </w:rPr>
+        <w:t xml:space="preserve"> salario del talento humano, desarrollo </w:t>
+      </w:r>
+      <w:r>
+        <w:rPr>
+          <w:lang w:val="es-ES"/>
+        </w:rPr>
+        <w:t>tecnológico</w:t>
+      </w:r>
+      <w:r>
+        <w:rPr>
+          <w:lang w:val="es-ES"/>
+        </w:rPr>
+        <w:t xml:space="preserve"> (como servidores), marketing y la producción del material. </w:t>
+      </w:r>
+      <w:r>
+        <w:rPr>
+          <w:lang w:val="es-ES"/>
+        </w:rPr>
+        <w:t>Nuestra fuente de ingreso es</w:t>
+      </w:r>
+      <w:r>
+        <w:rPr>
+          <w:lang w:val="es-ES"/>
+        </w:rPr>
+        <w:t xml:space="preserve"> por medio de suscripciones mensuales, dinero por despliegue de publicidad mediante la versión gratuita y posibles patrocinios de bancos interesad</w:t>
+      </w:r>
+      <w:r>
+        <w:rPr>
+          <w:lang w:val="es-ES"/>
+        </w:rPr>
+        <w:t>o</w:t>
+      </w:r>
+      <w:r>
+        <w:rPr>
+          <w:lang w:val="es-ES"/>
+        </w:rPr>
+        <w:t>s en el aplicativo.</w:t>
+      </w:r>
+    </w:p>
+    <w:p>
+      <w:pPr>
+        <w:rPr>
+          <w:lang w:val="es-ES"/>
+        </w:rPr>
+      </w:pPr>
+      <w:r>
+        <w:rPr>
+          <w:b/>
+          <w:bCs/>
+          <w:lang w:val="es-ES"/>
+        </w:rPr>
+        <w:t>[</w:t>
+      </w:r>
+      <w:proofErr w:type="spellStart"/>
+      <w:r>
+        <w:rPr>
+          <w:b/>
+          <w:bCs/>
+          <w:lang w:val="es-ES"/>
+        </w:rPr>
+        <w:t>Diap</w:t>
+      </w:r>
+      <w:proofErr w:type="spellEnd"/>
+      <w:r>
+        <w:rPr>
+          <w:b/>
+          <w:bCs/>
+          <w:lang w:val="es-ES"/>
+        </w:rPr>
+        <w:t xml:space="preserve">. 18] </w:t>
+      </w:r>
+      <w:r>
+        <w:rPr>
+          <w:lang w:val="es-ES"/>
+        </w:rPr>
+        <w:t xml:space="preserve">Usando lo dado anteriormente, las características del modelo de negocio, se puede garantizar la accesibilidad, la personalización, la escalabilidad y la interactividad con las características del modelo </w:t>
+      </w:r>
+      <w:proofErr w:type="spellStart"/>
+      <w:r>
+        <w:rPr>
+          <w:lang w:val="es-ES"/>
+        </w:rPr>
+        <w:t>Canvas</w:t>
+      </w:r>
+      <w:proofErr w:type="spellEnd"/>
+      <w:r>
+        <w:rPr>
+          <w:lang w:val="es-ES"/>
+        </w:rPr>
+        <w:t xml:space="preserve"> que hemos descrito anteriormente.</w:t>
+      </w:r>
+      <w:r>
+        <w:rPr>
+          <w:lang w:val="es-ES"/>
+        </w:rPr>
+        <w:tab/>
+      </w:r>
+    </w:p>
+    <w:p>
+      <w:pPr>
+        <w:rPr>
+          <w:lang w:val="es-ES"/>
+        </w:rPr>
+      </w:pPr>
+      <w:r>
+        <w:rPr>
+          <w:b/>
+          <w:bCs/>
+          <w:lang w:val="es-ES"/>
+        </w:rPr>
+        <w:t>[</w:t>
+      </w:r>
+      <w:proofErr w:type="spellStart"/>
+      <w:r>
+        <w:rPr>
+          <w:b/>
+          <w:bCs/>
+          <w:lang w:val="es-ES"/>
+        </w:rPr>
+        <w:t>Diap</w:t>
+      </w:r>
+      <w:proofErr w:type="spellEnd"/>
+      <w:r>
+        <w:rPr>
+          <w:b/>
+          <w:bCs/>
+          <w:lang w:val="es-ES"/>
+        </w:rPr>
+        <w:t xml:space="preserve">. 19] </w:t>
+      </w:r>
+      <w:r>
+        <w:rPr>
+          <w:lang w:val="es-ES"/>
+        </w:rPr>
+        <w:t xml:space="preserve">Entonces, ¿cuál es nuestra misión?, es </w:t>
       </w:r>
       <w:r>
         <w:rPr>
@@ -1836,7 +1867,7 @@
           <w:iCs/>
           <w:lang w:val="es-ES"/>
         </w:rPr>
-        <w:t>nd</w:t>
+        <w:t>Empoderar a jóvenes, trabajadores informales y nómadas digitales en Bogotá mediante un eco sistema tecnológico de planificación financiera personalizado y accesible. A través de algoritmos de análisis de datos y herramientas interactivas, transforma</w:t>
       </w:r>
       <w:r>
         <w:rPr>
@@ -1844,7 +1875,7 @@
           <w:iCs/>
           <w:lang w:val="es-ES"/>
         </w:rPr>
-        <w:t>o conceptos financieros complejos en estrategias prácticas de ahorro, inversión y gestión de seguridad social, promoviendo la resiliencia económica y la bancarización efectiva en un entorno laboral digital y dinámico.</w:t>
+        <w:t>nd</w:t>
       </w:r>
       <w:r>
         <w:rPr>
@@ -1852,52 +1883,7 @@
           <w:iCs/>
           <w:lang w:val="es-ES"/>
         </w:rPr>
-        <w:t xml:space="preserve"> </w:t>
-      </w:r>
-      <w:r>
-        <w:rPr>
-          <w:lang w:val="es-ES"/>
-        </w:rPr>
-        <w:t>Esto en base a la evidencia, la mejor forma de proporcionar educación financiera efectiva es por medio de un sistema intuitivo.</w:t>
-      </w:r>
-    </w:p>
-    <w:p>
-      <w:pPr>
-        <w:rPr>
-          <w:lang w:val="es-ES"/>
-        </w:rPr>
-      </w:pPr>
-      <w:r>
-        <w:rPr>
-          <w:b/>
-          <w:bCs/>
-          <w:lang w:val="es-ES"/>
-        </w:rPr>
-        <w:t>[</w:t>
-      </w:r>
-      <w:proofErr w:type="spellStart"/>
-      <w:r>
-        <w:rPr>
-          <w:b/>
-          <w:bCs/>
-          <w:lang w:val="es-ES"/>
-        </w:rPr>
-        <w:t>Diap</w:t>
-      </w:r>
-      <w:proofErr w:type="spellEnd"/>
-      <w:r>
-        <w:rPr>
-          <w:b/>
-          <w:bCs/>
-          <w:lang w:val="es-ES"/>
-        </w:rPr>
-        <w:t xml:space="preserve">. 20] </w:t>
-      </w:r>
-      <w:r>
-        <w:rPr>
-          <w:lang w:val="es-ES"/>
-        </w:rPr>
-        <w:t xml:space="preserve">La visión entonces es que </w:t>
+        <w:t>o conceptos financieros complejos en estrategias prácticas de ahorro, inversión y gestión de seguridad social, promoviendo la resiliencia económica y la bancarización efectiva en un entorno laboral digital y dinámico.</w:t>
       </w:r>
       <w:r>
         <w:rPr>
@@ -1905,33 +1891,78 @@
           <w:iCs/>
           <w:lang w:val="es-ES"/>
         </w:rPr>
-        <w:t xml:space="preserve">Para el año 2030, </w:t>
-      </w:r>
-      <w:proofErr w:type="spellStart"/>
+        <w:t xml:space="preserve"> </w:t>
+      </w:r>
+      <w:r>
+        <w:rPr>
+          <w:lang w:val="es-ES"/>
+        </w:rPr>
+        <w:t>Esto en base a la evidencia, la mejor forma de proporcionar educación financiera efectiva es por medio de un sistema intuitivo.</w:t>
+      </w:r>
+    </w:p>
+    <w:p>
+      <w:pPr>
+        <w:rPr>
+          <w:lang w:val="es-ES"/>
+        </w:rPr>
+      </w:pPr>
+      <w:r>
+        <w:rPr>
+          <w:b/>
+          <w:bCs/>
+          <w:lang w:val="es-ES"/>
+        </w:rPr>
+        <w:t>[</w:t>
+      </w:r>
+      <w:proofErr w:type="spellStart"/>
+      <w:r>
+        <w:rPr>
+          <w:b/>
+          <w:bCs/>
+          <w:lang w:val="es-ES"/>
+        </w:rPr>
+        <w:t>Diap</w:t>
+      </w:r>
+      <w:proofErr w:type="spellEnd"/>
+      <w:r>
+        <w:rPr>
+          <w:b/>
+          <w:bCs/>
+          <w:lang w:val="es-ES"/>
+        </w:rPr>
+        <w:t xml:space="preserve">. 20] </w:t>
+      </w:r>
+      <w:r>
+        <w:rPr>
+          <w:lang w:val="es-ES"/>
+        </w:rPr>
+        <w:t xml:space="preserve">La visión entonces es que </w:t>
+      </w:r>
       <w:r>
         <w:rPr>
           <w:i/>
           <w:iCs/>
           <w:lang w:val="es-ES"/>
         </w:rPr>
-        <w:t>Edufinanzas</w:t>
-      </w:r>
-      <w:proofErr w:type="spellEnd"/>
+        <w:t xml:space="preserve">Para el año 2030, </w:t>
+      </w:r>
+      <w:proofErr w:type="spellStart"/>
       <w:r>
         <w:rPr>
           <w:i/>
           <w:iCs/>
           <w:lang w:val="es-ES"/>
         </w:rPr>
-        <w:t xml:space="preserve"> se consolide</w:t>
-      </w:r>
+        <w:t>Edufinanzas</w:t>
+      </w:r>
+      <w:proofErr w:type="spellEnd"/>
       <w:r>
         <w:rPr>
           <w:i/>
           <w:iCs/>
           <w:lang w:val="es-ES"/>
         </w:rPr>
-        <w:t xml:space="preserve"> como la plataforma tecnológica líder en la ciudad de Bogotá para la gestión financiera inteligente de trabajadores independientes, reconocida por nuestra capacidad de integrar la realidad del mercado laboral digital con soluciones de analítica avanzada que garanticen la seguridad socioeconómica de nuestros usuarios.</w:t>
+        <w:t xml:space="preserve"> se consolide</w:t>
       </w:r>
       <w:r>
         <w:rPr>
@@ -1939,6 +1970,14 @@
           <w:iCs/>
           <w:lang w:val="es-ES"/>
         </w:rPr>
+        <w:t xml:space="preserve"> como la plataforma tecnológica líder en la ciudad de Bogotá para la gestión financiera inteligente de trabajadores independientes, reconocida por nuestra capacidad de integrar la realidad del mercado laboral digital con soluciones de analítica avanzada que garanticen la seguridad socioeconómica de nuestros usuarios.</w:t>
+      </w:r>
+      <w:r>
+        <w:rPr>
+          <w:i/>
+          <w:iCs/>
+          <w:lang w:val="es-ES"/>
+        </w:rPr>
         <w:t xml:space="preserve"> </w:t>
       </w:r>
       <w:r>
@@ -2161,19 +2200,7 @@
         <w:rPr>
           <w:lang w:val="es-ES"/>
         </w:rPr>
-        <w:t xml:space="preserve"> el resto </w:t>
-      </w:r>
-      <w:r>
-        <w:rPr>
-          <w:lang w:val="es-ES"/>
-        </w:rPr>
-        <w:t xml:space="preserve">(15 millones 790 mil) </w:t>
-      </w:r>
-      <w:r>
-        <w:rPr>
-          <w:lang w:val="es-ES"/>
-        </w:rPr>
-        <w:t>usando un</w:t>
+        <w:t xml:space="preserve"> el resto usando un</w:t>
       </w:r>
       <w:r>
         <w:rPr>
@@ -2605,7 +2632,7 @@
         <w:rPr>
           <w:lang w:val="es-ES"/>
         </w:rPr>
-        <w:t>Con base en lo anterior, nos dejaría el flujo de caja que es el dinero libre que podemos invertir en agrandar el proyecto, mejorar infraestructuras, etc. Como observamos, durante el primer año contamos con apenas 11 millones de pesos. Pero esperamos que en año venideros este flujo aumente hasta alcanzar los 180 millones 509 mil para el</w:t>
+        <w:t>Con base en lo anterior, nos dejaría el flujo de caja que es el dinero libre que podemos invertir en agrandar el proyecto. Como observamos, durante el primer año contamos con apenas 11 millones de pesos. Pero esperamos que en año venideros este flujo aumente hasta alcanzar los 180 millones 509 mil para el</w:t>
       </w:r>
       <w:r>
         <w:rPr>
@@ -3190,7 +3217,7 @@
           <w:iCs/>
           <w:lang w:val="es-ES"/>
         </w:rPr>
-        <w:t xml:space="preserve"> presenta una propuesta sólida para una plataforma de </w:t>
+        <w:t xml:space="preserve"> propone una plataforma </w:t>
       </w:r>
       <w:proofErr w:type="spellStart"/>
       <w:r>
@@ -3199,7 +3226,7 @@
           <w:iCs/>
           <w:lang w:val="es-ES"/>
         </w:rPr>
-        <w:t>edtech</w:t>
+        <w:t>EdTech</w:t>
       </w:r>
       <w:proofErr w:type="spellEnd"/>
       <w:r>
@@ -3208,25 +3235,23 @@
           <w:iCs/>
           <w:lang w:val="es-ES"/>
         </w:rPr>
-        <w:t xml:space="preserve"> centrada en el aprendizaje financiero, permitiendo que estudiantes, personas de bajos recursos y nómadas digitales puedan aprender de forma intuitiva y personalizada. El análisis realizado permite reconocer sus oportunidades y riesgos, resultando en una </w:t>
-      </w:r>
-      <w:proofErr w:type="spellStart"/>
+        <w:t xml:space="preserve"> centrada en educación financiera, que permite a estudiantes, personas de bajos recursos y nómadas digitales acceder a </w:t>
+      </w:r>
       <w:r>
         <w:rPr>
           <w:i/>
           <w:iCs/>
           <w:lang w:val="es-ES"/>
         </w:rPr>
-        <w:t>viablidad</w:t>
-      </w:r>
-      <w:proofErr w:type="spellEnd"/>
+        <w:t>un aprendizaje</w:t>
+      </w:r>
       <w:r>
         <w:rPr>
           <w:i/>
           <w:iCs/>
           <w:lang w:val="es-ES"/>
         </w:rPr>
-        <w:t xml:space="preserve"> del modelo dentro del mercado actual.</w:t>
+        <w:t xml:space="preserve"> intuitivo y personalizado. El análisis identifica sus oportunidades y riesgos, mostrando la viabilidad del modelo en el mercado actual</w:t>
       </w:r>
       <w:r>
         <w:rPr>
@@ -3234,209 +3259,225 @@
           <w:iCs/>
           <w:lang w:val="es-ES"/>
         </w:rPr>
-        <w:t xml:space="preserve"> </w:t>
-      </w:r>
-      <w:r>
-        <w:rPr>
-          <w:lang w:val="es-ES"/>
-        </w:rPr>
-        <w:t xml:space="preserve">Y como segunda y última conclusión es que </w:t>
-      </w:r>
-      <w:proofErr w:type="spellStart"/>
+        <w:t>.</w:t>
+      </w:r>
       <w:r>
         <w:rPr>
           <w:i/>
           <w:iCs/>
           <w:lang w:val="es-ES"/>
         </w:rPr>
-        <w:t>EduFinanzas</w:t>
-      </w:r>
-      <w:proofErr w:type="spellEnd"/>
+        <w:t xml:space="preserve"> </w:t>
+      </w:r>
+      <w:r>
+        <w:rPr>
+          <w:lang w:val="es-ES"/>
+        </w:rPr>
+        <w:t xml:space="preserve">Y como segunda y última conclusión es que </w:t>
+      </w:r>
+      <w:proofErr w:type="spellStart"/>
       <w:r>
         <w:rPr>
           <w:i/>
           <w:iCs/>
           <w:lang w:val="es-ES"/>
         </w:rPr>
-        <w:t xml:space="preserve"> tiene potencial en mejorar la educación financiera dentro de estas comunidades, ofreciendo una plataforma inclusiva para sus usuarios, tanto con o sin suscripción. Permitiendo a la plataforma estar en la ola de la vanguardia de la transformación digital bancaria, permitiendo que la inteligencia de datos se traduzca en un bienestar financiero tangible para la sociedad.</w:t>
-      </w:r>
-    </w:p>
-    <w:p>
-      <w:pPr>
-        <w:rPr>
-          <w:lang w:val="es-ES"/>
-        </w:rPr>
-      </w:pPr>
-      <w:r>
-        <w:rPr>
-          <w:b/>
-          <w:bCs/>
-          <w:lang w:val="es-ES"/>
-        </w:rPr>
-        <w:t>[</w:t>
-      </w:r>
-      <w:proofErr w:type="spellStart"/>
-      <w:r>
-        <w:rPr>
-          <w:b/>
-          <w:bCs/>
-          <w:lang w:val="es-ES"/>
-        </w:rPr>
-        <w:t>Diap</w:t>
-      </w:r>
-      <w:proofErr w:type="spellEnd"/>
-      <w:r>
-        <w:rPr>
-          <w:b/>
-          <w:bCs/>
-          <w:lang w:val="es-ES"/>
-        </w:rPr>
-        <w:t>. 39</w:t>
-      </w:r>
-      <w:r>
-        <w:rPr>
-          <w:b/>
-          <w:bCs/>
-          <w:lang w:val="es-ES"/>
-        </w:rPr>
-        <w:t xml:space="preserve"> a 40</w:t>
-      </w:r>
-      <w:r>
-        <w:rPr>
-          <w:b/>
-          <w:bCs/>
-          <w:lang w:val="es-ES"/>
-        </w:rPr>
-        <w:t xml:space="preserve">] </w:t>
-      </w:r>
-      <w:r>
-        <w:rPr>
-          <w:lang w:val="es-ES"/>
-        </w:rPr>
-        <w:t>Bueno, aquí tenemos alguna de la bibliografía relevante para el proyecto, otras referencias se encuentran dentro del proyecto.</w:t>
-      </w:r>
-    </w:p>
-    <w:p>
-      <w:pPr>
-        <w:rPr>
-          <w:lang w:val="es-ES"/>
-        </w:rPr>
-      </w:pPr>
-      <w:r>
-        <w:rPr>
-          <w:b/>
-          <w:bCs/>
-          <w:lang w:val="es-ES"/>
-        </w:rPr>
-        <w:t>[</w:t>
-      </w:r>
-      <w:proofErr w:type="spellStart"/>
-      <w:r>
-        <w:rPr>
-          <w:b/>
-          <w:bCs/>
-          <w:lang w:val="es-ES"/>
-        </w:rPr>
-        <w:t>Diap</w:t>
-      </w:r>
-      <w:proofErr w:type="spellEnd"/>
-      <w:r>
-        <w:rPr>
-          <w:b/>
-          <w:bCs/>
-          <w:lang w:val="es-ES"/>
-        </w:rPr>
-        <w:t>. 4</w:t>
-      </w:r>
-      <w:r>
-        <w:rPr>
-          <w:b/>
-          <w:bCs/>
-          <w:lang w:val="es-ES"/>
-        </w:rPr>
-        <w:t>1</w:t>
-      </w:r>
-      <w:r>
-        <w:rPr>
-          <w:b/>
-          <w:bCs/>
-          <w:lang w:val="es-ES"/>
-        </w:rPr>
-        <w:t xml:space="preserve">] </w:t>
-      </w:r>
-      <w:r>
-        <w:rPr>
-          <w:lang w:val="es-ES"/>
-        </w:rPr>
-        <w:t>Como agradecimientos, inicialmente al grupo de emprendimiento que sirvió como base para la elaboración del proyecto, a todos estos compañeros que permitieron construir el conocimiento para el proyecto, al profesor Abel Antonio Navarrete por el acompañamiento durante todo el tiempo del proyecto, por las reuniones y consejos para mejorar nuestro proyecto, al profesor José David Álvarez por la disposición del tiempo, otros docentes y compañeros que acompañaron durante todos estos años de formación.</w:t>
-      </w:r>
-    </w:p>
-    <w:p>
-      <w:pPr>
-        <w:rPr>
-          <w:lang w:val="es-ES"/>
-        </w:rPr>
-      </w:pPr>
-      <w:r>
-        <w:rPr>
-          <w:b/>
-          <w:bCs/>
-          <w:lang w:val="es-ES"/>
-        </w:rPr>
-        <w:t>[</w:t>
-      </w:r>
-      <w:proofErr w:type="spellStart"/>
-      <w:r>
-        <w:rPr>
-          <w:b/>
-          <w:bCs/>
-          <w:lang w:val="es-ES"/>
-        </w:rPr>
-        <w:t>Diap</w:t>
-      </w:r>
-      <w:proofErr w:type="spellEnd"/>
-      <w:r>
-        <w:rPr>
-          <w:b/>
-          <w:bCs/>
-          <w:lang w:val="es-ES"/>
-        </w:rPr>
-        <w:t>. 4</w:t>
-      </w:r>
-      <w:r>
-        <w:rPr>
-          <w:b/>
-          <w:bCs/>
-          <w:lang w:val="es-ES"/>
-        </w:rPr>
-        <w:t>2</w:t>
-      </w:r>
-      <w:r>
-        <w:rPr>
-          <w:b/>
-          <w:bCs/>
-          <w:lang w:val="es-ES"/>
-        </w:rPr>
-        <w:t xml:space="preserve">] </w:t>
-      </w:r>
-      <w:r>
-        <w:rPr>
-          <w:lang w:val="es-ES"/>
-        </w:rPr>
-        <w:t xml:space="preserve">Para despedirnos, los dejamos con esta </w:t>
-      </w:r>
-      <w:r>
-        <w:rPr>
-          <w:lang w:val="es-ES"/>
-        </w:rPr>
-        <w:t>cita “</w:t>
-      </w:r>
+        <w:t>EduFinanzas</w:t>
+      </w:r>
+      <w:proofErr w:type="spellEnd"/>
       <w:r>
         <w:rPr>
           <w:i/>
           <w:iCs/>
           <w:lang w:val="es-ES"/>
         </w:rPr>
+        <w:t xml:space="preserve"> tiene potencial para fortalecer la educación financiera de estas comunidades mediante una plataforma inclusiva, con opciones de acceso con y sin suscripción. Además, busca contribuir a la transformación digital del sector financiero, convirtiendo el uso de datos en un mayor bienestar económico para la sociedad</w:t>
+      </w:r>
+      <w:r>
+        <w:rPr>
+          <w:i/>
+          <w:iCs/>
+          <w:lang w:val="es-ES"/>
+        </w:rPr>
+        <w:t>.</w:t>
+      </w:r>
+    </w:p>
+    <w:p>
+      <w:pPr>
+        <w:rPr>
+          <w:lang w:val="es-ES"/>
+        </w:rPr>
+      </w:pPr>
+      <w:r>
+        <w:rPr>
+          <w:b/>
+          <w:bCs/>
+          <w:lang w:val="es-ES"/>
+        </w:rPr>
+        <w:t>[</w:t>
+      </w:r>
+      <w:proofErr w:type="spellStart"/>
+      <w:r>
+        <w:rPr>
+          <w:b/>
+          <w:bCs/>
+          <w:lang w:val="es-ES"/>
+        </w:rPr>
+        <w:t>Diap</w:t>
+      </w:r>
+      <w:proofErr w:type="spellEnd"/>
+      <w:r>
+        <w:rPr>
+          <w:b/>
+          <w:bCs/>
+          <w:lang w:val="es-ES"/>
+        </w:rPr>
+        <w:t>. 39</w:t>
+      </w:r>
+      <w:r>
+        <w:rPr>
+          <w:b/>
+          <w:bCs/>
+          <w:lang w:val="es-ES"/>
+        </w:rPr>
+        <w:t xml:space="preserve"> a 40</w:t>
+      </w:r>
+      <w:r>
+        <w:rPr>
+          <w:b/>
+          <w:bCs/>
+          <w:lang w:val="es-ES"/>
+        </w:rPr>
+        <w:t xml:space="preserve">] </w:t>
+      </w:r>
+      <w:r>
+        <w:rPr>
+          <w:lang w:val="es-ES"/>
+        </w:rPr>
+        <w:t>Bueno, aquí tenemos alguna de la bibliografía relevante para el proyecto, otras referencias se encuentran dentro del proyecto.</w:t>
+      </w:r>
+    </w:p>
+    <w:p>
+      <w:pPr>
+        <w:rPr>
+          <w:lang w:val="es-ES"/>
+        </w:rPr>
+      </w:pPr>
+      <w:r>
+        <w:rPr>
+          <w:b/>
+          <w:bCs/>
+          <w:lang w:val="es-ES"/>
+        </w:rPr>
+        <w:t>[</w:t>
+      </w:r>
+      <w:proofErr w:type="spellStart"/>
+      <w:r>
+        <w:rPr>
+          <w:b/>
+          <w:bCs/>
+          <w:lang w:val="es-ES"/>
+        </w:rPr>
+        <w:t>Diap</w:t>
+      </w:r>
+      <w:proofErr w:type="spellEnd"/>
+      <w:r>
+        <w:rPr>
+          <w:b/>
+          <w:bCs/>
+          <w:lang w:val="es-ES"/>
+        </w:rPr>
+        <w:t>. 4</w:t>
+      </w:r>
+      <w:r>
+        <w:rPr>
+          <w:b/>
+          <w:bCs/>
+          <w:lang w:val="es-ES"/>
+        </w:rPr>
+        <w:t>1</w:t>
+      </w:r>
+      <w:r>
+        <w:rPr>
+          <w:b/>
+          <w:bCs/>
+          <w:lang w:val="es-ES"/>
+        </w:rPr>
+        <w:t xml:space="preserve">] </w:t>
+      </w:r>
+      <w:r>
+        <w:rPr>
+          <w:lang w:val="es-ES"/>
+        </w:rPr>
+        <w:t>Como agradecimientos, inicialmente al grupo de emprendimiento que sirvió como base para la elaboración del proyecto, al profesor Abel Antonio Navarrete por el acompañamiento durante todo el tiempo del proyecto, por las reuniones y consejos para mejorar nuestro proyecto, al profesor José David Álvarez por la disposición del tiempo, otros docentes y compañeros que acompañaron durante todos estos años de formación.</w:t>
+      </w:r>
+    </w:p>
+    <w:p>
+      <w:pPr>
+        <w:rPr>
+          <w:lang w:val="es-ES"/>
+        </w:rPr>
+      </w:pPr>
+      <w:r>
+        <w:rPr>
+          <w:b/>
+          <w:bCs/>
+          <w:lang w:val="es-ES"/>
+        </w:rPr>
+        <w:t>[</w:t>
+      </w:r>
+      <w:proofErr w:type="spellStart"/>
+      <w:r>
+        <w:rPr>
+          <w:b/>
+          <w:bCs/>
+          <w:lang w:val="es-ES"/>
+        </w:rPr>
+        <w:t>Diap</w:t>
+      </w:r>
+      <w:proofErr w:type="spellEnd"/>
+      <w:r>
+        <w:rPr>
+          <w:b/>
+          <w:bCs/>
+          <w:lang w:val="es-ES"/>
+        </w:rPr>
+        <w:t>. 4</w:t>
+      </w:r>
+      <w:r>
+        <w:rPr>
+          <w:b/>
+          <w:bCs/>
+          <w:lang w:val="es-ES"/>
+        </w:rPr>
+        <w:t>2</w:t>
+      </w:r>
+      <w:r>
+        <w:rPr>
+          <w:b/>
+          <w:bCs/>
+          <w:lang w:val="es-ES"/>
+        </w:rPr>
+        <w:t xml:space="preserve">] </w:t>
+      </w:r>
+      <w:r>
+        <w:rPr>
+          <w:lang w:val="es-ES"/>
+        </w:rPr>
+        <w:t xml:space="preserve">Para despedirnos, los dejamos con esta </w:t>
+      </w:r>
+      <w:r>
+        <w:rPr>
+          <w:lang w:val="es-ES"/>
+        </w:rPr>
+        <w:t>cita “</w:t>
+      </w:r>
+      <w:r>
+        <w:rPr>
+          <w:i/>
+          <w:iCs/>
+          <w:lang w:val="es-ES"/>
+        </w:rPr>
         <w:t>La economía funciona como una máquina simple, pero mucha gente no la entiende o no se pone de acuerdo sobre cómo funciona, y esto ha provocado mucho sufrimiento económico innecesario</w:t>
       </w:r>
       <w:r>
@@ -3522,7 +3563,6 @@
         <w:rPr>
           <w:lang w:val="es-ES"/>
         </w:rPr>
-        <w:lastRenderedPageBreak/>
         <w:t xml:space="preserve"> </w:t>
       </w:r>
     </w:p>
@@ -4001,7 +4041,6 @@
   <w:style w:type="character" w:default="1" w:styleId="Fuentedeprrafopredeter">
     <w:name w:val="Default Paragraph Font"/>
     <w:uiPriority w:val="1"/>
-    <w:semiHidden/>
     <w:unhideWhenUsed/>
   </w:style>
   <w:style w:type="table" w:default="1" w:styleId="Tablanormal">

</xml_diff>

<commit_message>
Script V. FINAL FINAL (creo)
</commit_message>
<xml_diff>
--- a/Presentacion/Script.docx
+++ b/Presentacion/Script.docx
@@ -39,7 +39,21 @@
         <w:rPr>
           <w:lang w:val="es-ES"/>
         </w:rPr>
-        <w:t>Damos inicio al Plan de Negocios para Plataforma Educativa Financiera para Usuario Inexpertos con Machine Learning, bajo los estudiantes David Leonardo Rincón Ovalle y Leidy Marcela Morales Segura.</w:t>
+        <w:t xml:space="preserve">Damos inicio al Plan de Negocios para Plataforma Educativa Financiera para Usuario Inexpertos con Machine </w:t>
+      </w:r>
+      <w:proofErr w:type="spellStart"/>
+      <w:r>
+        <w:rPr>
+          <w:lang w:val="es-ES"/>
+        </w:rPr>
+        <w:t>Learning</w:t>
+      </w:r>
+      <w:proofErr w:type="spellEnd"/>
+      <w:r>
+        <w:rPr>
+          <w:lang w:val="es-ES"/>
+        </w:rPr>
+        <w:t>, bajo los estudiantes David Leonardo Rincón Ovalle y Leidy Marcela Morales Segura.</w:t>
       </w:r>
     </w:p>
     <w:p>
@@ -86,7 +100,25 @@
           <w:bCs/>
           <w:lang w:val="es-ES"/>
         </w:rPr>
-        <w:t xml:space="preserve">[Diap. 1] </w:t>
+        <w:t>[</w:t>
+      </w:r>
+      <w:proofErr w:type="spellStart"/>
+      <w:r>
+        <w:rPr>
+          <w:b/>
+          <w:bCs/>
+          <w:lang w:val="es-ES"/>
+        </w:rPr>
+        <w:t>Diap</w:t>
+      </w:r>
+      <w:proofErr w:type="spellEnd"/>
+      <w:r>
+        <w:rPr>
+          <w:b/>
+          <w:bCs/>
+          <w:lang w:val="es-ES"/>
+        </w:rPr>
+        <w:t xml:space="preserve">. 1] </w:t>
       </w:r>
       <w:r>
         <w:rPr>
@@ -114,8 +146,16 @@
         <w:rPr>
           <w:lang w:val="es-ES"/>
         </w:rPr>
-        <w:t>y mi compañer</w:t>
-      </w:r>
+        <w:t xml:space="preserve">y mi </w:t>
+      </w:r>
+      <w:proofErr w:type="spellStart"/>
+      <w:r>
+        <w:rPr>
+          <w:lang w:val="es-ES"/>
+        </w:rPr>
+        <w:t>compañer</w:t>
+      </w:r>
+      <w:proofErr w:type="spellEnd"/>
       <w:r>
         <w:rPr>
           <w:i/>
@@ -145,19 +185,39 @@
           <w:i/>
           <w:iCs/>
         </w:rPr>
-        <w:t xml:space="preserve">David Rincon </w:t>
-      </w:r>
-      <w:r>
-        <w:t xml:space="preserve"> vamos a hacer la presentación del </w:t>
-      </w:r>
-      <w:r>
-        <w:rPr>
-          <w:i/>
-          <w:iCs/>
-          <w:lang w:val="es-ES"/>
-        </w:rPr>
-        <w:t>Plan de Negocios para Plataforma Educativa Financiera para Usuarios Inexpertos con Machine Learning</w:t>
-      </w:r>
+        <w:t xml:space="preserve">David </w:t>
+      </w:r>
+      <w:r>
+        <w:rPr>
+          <w:i/>
+          <w:iCs/>
+        </w:rPr>
+        <w:t xml:space="preserve">Rincon </w:t>
+      </w:r>
+      <w:r>
+        <w:t>vamos</w:t>
+      </w:r>
+      <w:r>
+        <w:t xml:space="preserve"> a hacer la presentación del </w:t>
+      </w:r>
+      <w:r>
+        <w:rPr>
+          <w:i/>
+          <w:iCs/>
+          <w:lang w:val="es-ES"/>
+        </w:rPr>
+        <w:t xml:space="preserve">Plan de Negocios para Plataforma Educativa Financiera para Usuarios Inexpertos con Machine </w:t>
+      </w:r>
+      <w:proofErr w:type="spellStart"/>
+      <w:r>
+        <w:rPr>
+          <w:i/>
+          <w:iCs/>
+          <w:lang w:val="es-ES"/>
+        </w:rPr>
+        <w:t>Learning</w:t>
+      </w:r>
+      <w:proofErr w:type="spellEnd"/>
       <w:r>
         <w:rPr>
           <w:lang w:val="es-ES"/>
@@ -173,11 +233,9 @@
       </w:pPr>
       <w:r>
         <w:rPr>
-          <w:b/>
-          <w:bCs/>
-          <w:lang w:val="es-ES"/>
-        </w:rPr>
-        <w:t>[Diap. 1] ¿</w:t>
+          <w:lang w:val="es-ES"/>
+        </w:rPr>
+        <w:t>¿</w:t>
       </w:r>
       <w:r>
         <w:rPr>
@@ -198,7 +256,41 @@
           <w:bCs/>
           <w:lang w:val="es-ES"/>
         </w:rPr>
-        <w:t xml:space="preserve">[Diap. 2] </w:t>
+        <w:t>[</w:t>
+      </w:r>
+      <w:proofErr w:type="spellStart"/>
+      <w:r>
+        <w:rPr>
+          <w:b/>
+          <w:bCs/>
+          <w:lang w:val="es-ES"/>
+        </w:rPr>
+        <w:t>Diap</w:t>
+      </w:r>
+      <w:proofErr w:type="spellEnd"/>
+      <w:r>
+        <w:rPr>
+          <w:b/>
+          <w:bCs/>
+          <w:lang w:val="es-ES"/>
+        </w:rPr>
+        <w:t xml:space="preserve">. </w:t>
+      </w:r>
+      <w:r>
+        <w:rPr>
+          <w:b/>
+          <w:bCs/>
+          <w:lang w:val="es-ES"/>
+        </w:rPr>
+        <w:t>2</w:t>
+      </w:r>
+      <w:r>
+        <w:rPr>
+          <w:b/>
+          <w:bCs/>
+          <w:lang w:val="es-ES"/>
+        </w:rPr>
+        <w:t xml:space="preserve">] </w:t>
       </w:r>
       <w:r>
         <w:rPr>
@@ -233,7 +325,25 @@
           <w:bCs/>
           <w:lang w:val="es-ES"/>
         </w:rPr>
-        <w:t xml:space="preserve">[Diap. 3] </w:t>
+        <w:t>[</w:t>
+      </w:r>
+      <w:proofErr w:type="spellStart"/>
+      <w:r>
+        <w:rPr>
+          <w:b/>
+          <w:bCs/>
+          <w:lang w:val="es-ES"/>
+        </w:rPr>
+        <w:t>Diap</w:t>
+      </w:r>
+      <w:proofErr w:type="spellEnd"/>
+      <w:r>
+        <w:rPr>
+          <w:b/>
+          <w:bCs/>
+          <w:lang w:val="es-ES"/>
+        </w:rPr>
+        <w:t xml:space="preserve">. 3] </w:t>
       </w:r>
       <w:r>
         <w:rPr>
@@ -249,7 +359,25 @@
           <w:bCs/>
           <w:lang w:val="es-ES"/>
         </w:rPr>
-        <w:t xml:space="preserve">[Diap. 4 a 5] </w:t>
+        <w:t>[</w:t>
+      </w:r>
+      <w:proofErr w:type="spellStart"/>
+      <w:r>
+        <w:rPr>
+          <w:b/>
+          <w:bCs/>
+          <w:lang w:val="es-ES"/>
+        </w:rPr>
+        <w:t>Diap</w:t>
+      </w:r>
+      <w:proofErr w:type="spellEnd"/>
+      <w:r>
+        <w:rPr>
+          <w:b/>
+          <w:bCs/>
+          <w:lang w:val="es-ES"/>
+        </w:rPr>
+        <w:t xml:space="preserve">. 4 a 5] </w:t>
       </w:r>
       <w:r>
         <w:rPr>
@@ -278,29 +406,97 @@
           <w:bCs/>
           <w:lang w:val="es-ES"/>
         </w:rPr>
-        <w:t xml:space="preserve">[Diap. 6] </w:t>
-      </w:r>
-      <w:r>
-        <w:rPr>
-          <w:i/>
-          <w:iCs/>
-        </w:rPr>
-        <w:t>"Para responder a este desafío nació EduFinanzas. Nuestro propósito con este trabajo fue estructurar un plan de negocios integral junto con un prototipo funcional enfocado en jóvenes, independientes y nómadas digitales aquí en Bogotá. La clave de nuestra propuesta radica en combinar una arquitectura robusta de microservicios con modelos de Machine Learning, logrando que la plataforma entienda al usuario y adapte la enseñanza a sus necesidades reales."</w:t>
-      </w:r>
-    </w:p>
-    <w:p>
-      <w:pPr>
-        <w:rPr>
-          <w:lang w:val="es-ES"/>
-        </w:rPr>
-      </w:pPr>
-      <w:r>
-        <w:rPr>
-          <w:b/>
-          <w:bCs/>
-          <w:lang w:val="es-ES"/>
-        </w:rPr>
-        <w:t xml:space="preserve">[Diap. 7 a 8] </w:t>
+        <w:t>[</w:t>
+      </w:r>
+      <w:proofErr w:type="spellStart"/>
+      <w:r>
+        <w:rPr>
+          <w:b/>
+          <w:bCs/>
+          <w:lang w:val="es-ES"/>
+        </w:rPr>
+        <w:t>Diap</w:t>
+      </w:r>
+      <w:proofErr w:type="spellEnd"/>
+      <w:r>
+        <w:rPr>
+          <w:b/>
+          <w:bCs/>
+          <w:lang w:val="es-ES"/>
+        </w:rPr>
+        <w:t xml:space="preserve">. 6] </w:t>
+      </w:r>
+      <w:r>
+        <w:rPr>
+          <w:i/>
+          <w:iCs/>
+        </w:rPr>
+        <w:t xml:space="preserve">"Para responder a este desafío nació </w:t>
+      </w:r>
+      <w:proofErr w:type="spellStart"/>
+      <w:r>
+        <w:rPr>
+          <w:i/>
+          <w:iCs/>
+        </w:rPr>
+        <w:t>EduFinanzas</w:t>
+      </w:r>
+      <w:proofErr w:type="spellEnd"/>
+      <w:r>
+        <w:rPr>
+          <w:i/>
+          <w:iCs/>
+        </w:rPr>
+        <w:t xml:space="preserve">. Nuestro propósito con este trabajo fue estructurar un plan de negocios integral junto con un prototipo funcional enfocado en jóvenes, independientes y nómadas digitales aquí en Bogotá. La clave de nuestra propuesta radica en combinar una arquitectura robusta de microservicios con modelos de Machine </w:t>
+      </w:r>
+      <w:proofErr w:type="spellStart"/>
+      <w:r>
+        <w:rPr>
+          <w:i/>
+          <w:iCs/>
+        </w:rPr>
+        <w:t>Learning</w:t>
+      </w:r>
+      <w:proofErr w:type="spellEnd"/>
+      <w:r>
+        <w:rPr>
+          <w:i/>
+          <w:iCs/>
+        </w:rPr>
+        <w:t>, logrando que la plataforma entienda al usuario y adapte la enseñanza a sus necesidades reales."</w:t>
+      </w:r>
+    </w:p>
+    <w:p>
+      <w:pPr>
+        <w:rPr>
+          <w:lang w:val="es-ES"/>
+        </w:rPr>
+      </w:pPr>
+      <w:r>
+        <w:rPr>
+          <w:b/>
+          <w:bCs/>
+          <w:lang w:val="es-ES"/>
+        </w:rPr>
+        <w:t>[</w:t>
+      </w:r>
+      <w:proofErr w:type="spellStart"/>
+      <w:r>
+        <w:rPr>
+          <w:b/>
+          <w:bCs/>
+          <w:lang w:val="es-ES"/>
+        </w:rPr>
+        <w:t>Diap</w:t>
+      </w:r>
+      <w:proofErr w:type="spellEnd"/>
+      <w:r>
+        <w:rPr>
+          <w:b/>
+          <w:bCs/>
+          <w:lang w:val="es-ES"/>
+        </w:rPr>
+        <w:t xml:space="preserve">. 7 a 8] </w:t>
       </w:r>
       <w:r>
         <w:rPr>
@@ -313,17 +509,49 @@
           <w:lang w:val="es-ES"/>
         </w:rPr>
         <w:lastRenderedPageBreak/>
-        <w:t>temas como intereses y conceptos financieros al cliente. Todo esto bajo un modelo freemium, es decir, que no tiene costo alguno usar la plataforma, y para funciones adicionales como remover anuncios o mayor profundidad sobre los temas, se tendrá la opción de una suscripción mensual opcional. Permitiendo a nuestro público objetivo poder acceder al entorno y obtener ganancias por medio de este modelo.</w:t>
-      </w:r>
-    </w:p>
-    <w:p>
-      <w:r>
-        <w:rPr>
-          <w:b/>
-          <w:bCs/>
-          <w:lang w:val="es-ES"/>
-        </w:rPr>
-        <w:t xml:space="preserve">[Diap. 9] </w:t>
+        <w:t xml:space="preserve">temas como intereses y conceptos financieros al cliente. Todo esto bajo un modelo </w:t>
+      </w:r>
+      <w:proofErr w:type="spellStart"/>
+      <w:r>
+        <w:rPr>
+          <w:lang w:val="es-ES"/>
+        </w:rPr>
+        <w:t>freemium</w:t>
+      </w:r>
+      <w:proofErr w:type="spellEnd"/>
+      <w:r>
+        <w:rPr>
+          <w:lang w:val="es-ES"/>
+        </w:rPr>
+        <w:t>, es decir, que no tiene costo alguno usar la plataforma, y para funciones adicionales como remover anuncios o mayor profundidad sobre los temas, se tendrá la opción de una suscripción mensual opcional. Permitiendo a nuestro público objetivo poder acceder al entorno y obtener ganancias por medio de este modelo.</w:t>
+      </w:r>
+    </w:p>
+    <w:p>
+      <w:r>
+        <w:rPr>
+          <w:b/>
+          <w:bCs/>
+          <w:lang w:val="es-ES"/>
+        </w:rPr>
+        <w:t>[</w:t>
+      </w:r>
+      <w:proofErr w:type="spellStart"/>
+      <w:r>
+        <w:rPr>
+          <w:b/>
+          <w:bCs/>
+          <w:lang w:val="es-ES"/>
+        </w:rPr>
+        <w:t>Diap</w:t>
+      </w:r>
+      <w:proofErr w:type="spellEnd"/>
+      <w:r>
+        <w:rPr>
+          <w:b/>
+          <w:bCs/>
+          <w:lang w:val="es-ES"/>
+        </w:rPr>
+        <w:t xml:space="preserve">. 9] </w:t>
       </w:r>
       <w:r>
         <w:rPr>
@@ -345,14 +573,48 @@
           <w:bCs/>
           <w:lang w:val="es-ES"/>
         </w:rPr>
-        <w:t xml:space="preserve">[Diap. 10] </w:t>
-      </w:r>
-      <w:r>
-        <w:rPr>
-          <w:i/>
-          <w:iCs/>
-        </w:rPr>
-        <w:t>Para construir la plataforma seleccionamos un stack de tecnologías maduras, escalables y orientadas a microservicios.</w:t>
+        <w:t>[</w:t>
+      </w:r>
+      <w:proofErr w:type="spellStart"/>
+      <w:r>
+        <w:rPr>
+          <w:b/>
+          <w:bCs/>
+          <w:lang w:val="es-ES"/>
+        </w:rPr>
+        <w:t>Diap</w:t>
+      </w:r>
+      <w:proofErr w:type="spellEnd"/>
+      <w:r>
+        <w:rPr>
+          <w:b/>
+          <w:bCs/>
+          <w:lang w:val="es-ES"/>
+        </w:rPr>
+        <w:t xml:space="preserve">. 10] </w:t>
+      </w:r>
+      <w:r>
+        <w:rPr>
+          <w:i/>
+          <w:iCs/>
+        </w:rPr>
+        <w:t xml:space="preserve">Para construir la plataforma seleccionamos un </w:t>
+      </w:r>
+      <w:proofErr w:type="spellStart"/>
+      <w:r>
+        <w:rPr>
+          <w:i/>
+          <w:iCs/>
+        </w:rPr>
+        <w:t>stack</w:t>
+      </w:r>
+      <w:proofErr w:type="spellEnd"/>
+      <w:r>
+        <w:rPr>
+          <w:i/>
+          <w:iCs/>
+        </w:rPr>
+        <w:t xml:space="preserve"> de tecnologías maduras, escalables y orientadas a microservicios.</w:t>
       </w:r>
     </w:p>
     <w:p>
@@ -411,15 +673,37 @@
         </w:rPr>
         <w:t xml:space="preserve"> junto con </w:t>
       </w:r>
-      <w:r>
-        <w:rPr>
-          <w:b/>
-          <w:bCs/>
-          <w:i/>
-          <w:iCs/>
-        </w:rPr>
-        <w:t>Scikit-learn y TensorFlow</w:t>
-      </w:r>
+      <w:proofErr w:type="spellStart"/>
+      <w:r>
+        <w:rPr>
+          <w:b/>
+          <w:bCs/>
+          <w:i/>
+          <w:iCs/>
+        </w:rPr>
+        <w:t>Scikit-learn</w:t>
+      </w:r>
+      <w:proofErr w:type="spellEnd"/>
+      <w:r>
+        <w:rPr>
+          <w:b/>
+          <w:bCs/>
+          <w:i/>
+          <w:iCs/>
+        </w:rPr>
+        <w:t xml:space="preserve"> y </w:t>
+      </w:r>
+      <w:proofErr w:type="spellStart"/>
+      <w:r>
+        <w:rPr>
+          <w:b/>
+          <w:bCs/>
+          <w:i/>
+          <w:iCs/>
+        </w:rPr>
+        <w:t>TensorFlow</w:t>
+      </w:r>
+      <w:proofErr w:type="spellEnd"/>
       <w:r>
         <w:rPr>
           <w:i/>
@@ -441,7 +725,23 @@
           <w:i/>
           <w:iCs/>
         </w:rPr>
-        <w:t xml:space="preserve">, mientras que en el frontend implementamos una interfaz dinámica con </w:t>
+        <w:t xml:space="preserve">, mientras que en el </w:t>
+      </w:r>
+      <w:proofErr w:type="spellStart"/>
+      <w:r>
+        <w:rPr>
+          <w:i/>
+          <w:iCs/>
+        </w:rPr>
+        <w:t>frontend</w:t>
+      </w:r>
+      <w:proofErr w:type="spellEnd"/>
+      <w:r>
+        <w:rPr>
+          <w:i/>
+          <w:iCs/>
+        </w:rPr>
+        <w:t xml:space="preserve"> implementamos una interfaz dinámica con </w:t>
       </w:r>
       <w:r>
         <w:rPr>
@@ -483,7 +783,25 @@
           <w:bCs/>
           <w:lang w:val="es-ES"/>
         </w:rPr>
-        <w:t xml:space="preserve">[Diap. 11] </w:t>
+        <w:t>[</w:t>
+      </w:r>
+      <w:proofErr w:type="spellStart"/>
+      <w:r>
+        <w:rPr>
+          <w:b/>
+          <w:bCs/>
+          <w:lang w:val="es-ES"/>
+        </w:rPr>
+        <w:t>Diap</w:t>
+      </w:r>
+      <w:proofErr w:type="spellEnd"/>
+      <w:r>
+        <w:rPr>
+          <w:b/>
+          <w:bCs/>
+          <w:lang w:val="es-ES"/>
+        </w:rPr>
+        <w:t xml:space="preserve">. 11] </w:t>
       </w:r>
       <w:r>
         <w:rPr>
@@ -614,7 +932,23 @@
           <w:i/>
           <w:iCs/>
         </w:rPr>
-        <w:t xml:space="preserve"> entrega la experiencia al usuario mediante la Progressive Web App en Angular.</w:t>
+        <w:t xml:space="preserve"> entrega la experiencia al usuario mediante la </w:t>
+      </w:r>
+      <w:proofErr w:type="spellStart"/>
+      <w:r>
+        <w:rPr>
+          <w:i/>
+          <w:iCs/>
+        </w:rPr>
+        <w:t>Progressive</w:t>
+      </w:r>
+      <w:proofErr w:type="spellEnd"/>
+      <w:r>
+        <w:rPr>
+          <w:i/>
+          <w:iCs/>
+        </w:rPr>
+        <w:t xml:space="preserve"> Web App en Angular.</w:t>
       </w:r>
     </w:p>
     <w:p>
@@ -640,20 +974,89 @@
           <w:bCs/>
           <w:lang w:val="es-ES"/>
         </w:rPr>
-        <w:t xml:space="preserve">[Diap. 12 a 13] </w:t>
-      </w:r>
-      <w:r>
-        <w:rPr>
-          <w:lang w:val="es-ES"/>
-        </w:rPr>
-        <w:t xml:space="preserve">Bueno entonces el estudio de mercado, nuestro aplicativo tiene como objetivo todas las personas de bajos recursos, estudiantes y nómadas digitales, por esto, es importante ofrecer un servicio gratuito para lograr acaparar la demanda existente, en competencia no tenemos competencia directa, más si existen gran cantidad de plataformas financieras, estas ofrecen poco o nulo conocimiento acerca de educación financiera. No existe una plataforma que se centre exclusivamente en conocimientos financieros apropiadamente. Bconomy es una herramienta diseñada para evaluar la salud financiera pero no ofrece conocimientos profundos sobre economía, Fintonic se encarga de organizar cuentas bancarias y centralizarlas y Nequi es una plataforma bancaria digital. </w:t>
-      </w:r>
-      <w:r>
-        <w:rPr>
-          <w:i/>
-          <w:iCs/>
-        </w:rPr>
-        <w:t xml:space="preserve">EduFinanzas no compite como una billetera ni como un banco; nos </w:t>
+        <w:t>[</w:t>
+      </w:r>
+      <w:proofErr w:type="spellStart"/>
+      <w:r>
+        <w:rPr>
+          <w:b/>
+          <w:bCs/>
+          <w:lang w:val="es-ES"/>
+        </w:rPr>
+        <w:t>Diap</w:t>
+      </w:r>
+      <w:proofErr w:type="spellEnd"/>
+      <w:r>
+        <w:rPr>
+          <w:b/>
+          <w:bCs/>
+          <w:lang w:val="es-ES"/>
+        </w:rPr>
+        <w:t xml:space="preserve">. 12 a 13] </w:t>
+      </w:r>
+      <w:r>
+        <w:rPr>
+          <w:lang w:val="es-ES"/>
+        </w:rPr>
+        <w:t xml:space="preserve">Bueno entonces el estudio de mercado, nuestro aplicativo tiene como objetivo todas las personas de bajos recursos, estudiantes y nómadas digitales, por esto, es importante ofrecer un servicio gratuito para lograr acaparar la demanda existente, en competencia no tenemos competencia directa, más si existen gran cantidad de plataformas financieras, estas ofrecen poco o nulo conocimiento acerca de educación financiera. No existe una plataforma que se centre exclusivamente en conocimientos financieros apropiadamente. </w:t>
+      </w:r>
+      <w:proofErr w:type="spellStart"/>
+      <w:r>
+        <w:rPr>
+          <w:lang w:val="es-ES"/>
+        </w:rPr>
+        <w:t>Bconomy</w:t>
+      </w:r>
+      <w:proofErr w:type="spellEnd"/>
+      <w:r>
+        <w:rPr>
+          <w:lang w:val="es-ES"/>
+        </w:rPr>
+        <w:t xml:space="preserve"> es una herramienta diseñada para evaluar la salud financiera pero no ofrece conocimientos profundos sobre economía, </w:t>
+      </w:r>
+      <w:proofErr w:type="spellStart"/>
+      <w:r>
+        <w:rPr>
+          <w:lang w:val="es-ES"/>
+        </w:rPr>
+        <w:t>Fintonic</w:t>
+      </w:r>
+      <w:proofErr w:type="spellEnd"/>
+      <w:r>
+        <w:rPr>
+          <w:lang w:val="es-ES"/>
+        </w:rPr>
+        <w:t xml:space="preserve"> se encarga de organizar cuentas bancarias y centralizarlas y </w:t>
+      </w:r>
+      <w:proofErr w:type="spellStart"/>
+      <w:r>
+        <w:rPr>
+          <w:lang w:val="es-ES"/>
+        </w:rPr>
+        <w:t>Nequi</w:t>
+      </w:r>
+      <w:proofErr w:type="spellEnd"/>
+      <w:r>
+        <w:rPr>
+          <w:lang w:val="es-ES"/>
+        </w:rPr>
+        <w:t xml:space="preserve"> es una plataforma bancaria digital. </w:t>
+      </w:r>
+      <w:proofErr w:type="spellStart"/>
+      <w:r>
+        <w:rPr>
+          <w:i/>
+          <w:iCs/>
+        </w:rPr>
+        <w:t>EduFinanzas</w:t>
+      </w:r>
+      <w:proofErr w:type="spellEnd"/>
+      <w:r>
+        <w:rPr>
+          <w:i/>
+          <w:iCs/>
+        </w:rPr>
+        <w:t xml:space="preserve"> no compite como una billetera ni como un banco; nos </w:t>
       </w:r>
       <w:r>
         <w:rPr>
@@ -661,7 +1064,23 @@
           <w:iCs/>
         </w:rPr>
         <w:lastRenderedPageBreak/>
-        <w:t>posicionamos 100% en el sector EdTech, educando al usuario antes de que tome una decisión financiera, no solo mostrándole en qué se gastó el dinero."</w:t>
+        <w:t xml:space="preserve">posicionamos 100% en el sector </w:t>
+      </w:r>
+      <w:proofErr w:type="spellStart"/>
+      <w:r>
+        <w:rPr>
+          <w:i/>
+          <w:iCs/>
+        </w:rPr>
+        <w:t>EdTech</w:t>
+      </w:r>
+      <w:proofErr w:type="spellEnd"/>
+      <w:r>
+        <w:rPr>
+          <w:i/>
+          <w:iCs/>
+        </w:rPr>
+        <w:t>, educando al usuario antes de que tome una decisión financiera, no solo mostrándole en qué se gastó el dinero."</w:t>
       </w:r>
       <w:r>
         <w:rPr>
@@ -684,13 +1103,45 @@
           <w:bCs/>
           <w:lang w:val="es-ES"/>
         </w:rPr>
-        <w:t xml:space="preserve">[Diap. 14] </w:t>
-      </w:r>
-      <w:r>
-        <w:rPr>
-          <w:lang w:val="es-ES"/>
-        </w:rPr>
-        <w:t>Esto se verifica con las 5 fuerzas de Porter, en las cuales se observa como la plataforma tiene poca competencia con el poder del cliente, gracias a su modelo Freemium. Adicionalmente, de buscar promoverse mediante Google Ads y el desarrollo de alianzas universitarias y con sectores públicos, y a pesar de que es posible crear una app similar, se mitiga este peligro de nuevos competidores al establecernos, crear confianza y buscar innovar creando una reputación estable.</w:t>
+        <w:t>[</w:t>
+      </w:r>
+      <w:proofErr w:type="spellStart"/>
+      <w:r>
+        <w:rPr>
+          <w:b/>
+          <w:bCs/>
+          <w:lang w:val="es-ES"/>
+        </w:rPr>
+        <w:t>Diap</w:t>
+      </w:r>
+      <w:proofErr w:type="spellEnd"/>
+      <w:r>
+        <w:rPr>
+          <w:b/>
+          <w:bCs/>
+          <w:lang w:val="es-ES"/>
+        </w:rPr>
+        <w:t xml:space="preserve">. 14] </w:t>
+      </w:r>
+      <w:r>
+        <w:rPr>
+          <w:lang w:val="es-ES"/>
+        </w:rPr>
+        <w:t xml:space="preserve">Esto se verifica con las 5 fuerzas de Porter, en las cuales se observa como la plataforma tiene poca competencia con el poder del cliente, gracias a su modelo Freemium. Adicionalmente, de buscar promoverse mediante Google </w:t>
+      </w:r>
+      <w:proofErr w:type="spellStart"/>
+      <w:r>
+        <w:rPr>
+          <w:lang w:val="es-ES"/>
+        </w:rPr>
+        <w:t>Ads</w:t>
+      </w:r>
+      <w:proofErr w:type="spellEnd"/>
+      <w:r>
+        <w:rPr>
+          <w:lang w:val="es-ES"/>
+        </w:rPr>
+        <w:t xml:space="preserve"> y el desarrollo de alianzas universitarias y con sectores públicos, y a pesar de que es posible crear una app similar, se mitiga este peligro de nuevos competidores al establecernos, crear confianza y buscar innovar creando una reputación estable.</w:t>
       </w:r>
       <w:r>
         <w:rPr>
@@ -702,7 +1153,35 @@
         <w:rPr>
           <w:lang w:val="es-ES"/>
         </w:rPr>
-        <w:t>Es posible que existan amenazas de sustitutivos, debido al contenido dado por finfluencers y modelos básicos de aprendizaje, para ello, la plataforma debe diferenciarse por su autenticidad, su autoridad técnica y su adaptabilidad, y como se dijo anteriormente, para evitar una confrontación directa con sistemas bancarios tradicionales, se debe centrar en el aprendizaje financiero en vez de la gestión de transacciones y comportarse como una fintech.</w:t>
+        <w:t xml:space="preserve">Es posible que existan amenazas de sustitutivos, debido al contenido dado por </w:t>
+      </w:r>
+      <w:proofErr w:type="spellStart"/>
+      <w:r>
+        <w:rPr>
+          <w:lang w:val="es-ES"/>
+        </w:rPr>
+        <w:t>finfluencers</w:t>
+      </w:r>
+      <w:proofErr w:type="spellEnd"/>
+      <w:r>
+        <w:rPr>
+          <w:lang w:val="es-ES"/>
+        </w:rPr>
+        <w:t xml:space="preserve"> y modelos básicos de aprendizaje, para ello, la plataforma debe diferenciarse por su autenticidad, su autoridad técnica y su adaptabilidad, y como se dijo anteriormente, para evitar una confrontación directa con sistemas bancarios tradicionales, se debe centrar en el aprendizaje financiero en vez de la gestión de transacciones y comportarse como una </w:t>
+      </w:r>
+      <w:proofErr w:type="spellStart"/>
+      <w:r>
+        <w:rPr>
+          <w:lang w:val="es-ES"/>
+        </w:rPr>
+        <w:t>fintech</w:t>
+      </w:r>
+      <w:proofErr w:type="spellEnd"/>
+      <w:r>
+        <w:rPr>
+          <w:lang w:val="es-ES"/>
+        </w:rPr>
+        <w:t>.</w:t>
       </w:r>
     </w:p>
     <w:p>
@@ -731,82 +1210,196 @@
           <w:bCs/>
           <w:lang w:val="es-ES"/>
         </w:rPr>
-        <w:t>[Diap. 1</w:t>
-      </w:r>
-      <w:r>
-        <w:rPr>
-          <w:b/>
-          <w:bCs/>
-          <w:lang w:val="es-ES"/>
-        </w:rPr>
-        <w:t>5</w:t>
-      </w:r>
-      <w:r>
-        <w:rPr>
-          <w:b/>
-          <w:bCs/>
-          <w:lang w:val="es-ES"/>
-        </w:rPr>
-        <w:t xml:space="preserve"> a 1</w:t>
-      </w:r>
-      <w:r>
-        <w:rPr>
-          <w:b/>
-          <w:bCs/>
-          <w:lang w:val="es-ES"/>
-        </w:rPr>
-        <w:t>6</w:t>
-      </w:r>
-      <w:r>
-        <w:rPr>
-          <w:b/>
-          <w:bCs/>
-          <w:lang w:val="es-ES"/>
-        </w:rPr>
-        <w:t xml:space="preserve">] </w:t>
-      </w:r>
-      <w:r>
-        <w:rPr>
-          <w:lang w:val="es-ES"/>
-        </w:rPr>
-        <w:t>Adicionalmente en nuestro modelo de negocio se encuentra el modelo Canvas, siendo alguno de los posibles socios clave universidades tales como la Universidad del Rosario o también el Banco de la República, además es posible hacer alianzas con instituciones públicas que tienen enfoque sobre temas de educación financiera, además de ONG’s y otras fundaciones cercanas a temas económicos. Acerca de las actividades clave están el mantenimiento de un aplicativo web, el diseño de herramientas interactivas para el cliente, marketing digital, y la creación de contenido dinámico y gamificado. Nuestra propuesta de valor como comentamos es una plataforma autónoma, interactiva y personalizada hacia el usuario, con coste cero al usuario final, la corrección de hábitos y un enfoque en la accesibilidad. Las relaciones con el cliente serán por medio de autoservicio digital, con soporte opcional y comunicación del aplicativo al usuario. Los canales serán a través de nuestra página web. Los segmentos del público comprenderán los jóvenes entre 18 a 24 años, trabajadores informales, nómadas digitales y personas interesadas en el mundo de la economía. La estructura de costos está compuesta por el salario del talento humano, desarrollo tecnológico (como servidores), marketing y la producción del material. Nuestra fuente de ingreso es por medio de suscripciones mensuales, dinero por despliegue de publicidad mediante la versión gratuita y posibles patrocinios de bancos interesados en el aplicativo.</w:t>
-      </w:r>
-    </w:p>
-    <w:p>
-      <w:pPr>
-        <w:rPr>
-          <w:lang w:val="es-ES"/>
-        </w:rPr>
-      </w:pPr>
-      <w:r>
-        <w:rPr>
-          <w:b/>
-          <w:bCs/>
-          <w:lang w:val="es-ES"/>
-        </w:rPr>
-        <w:t>[Diap. 1</w:t>
-      </w:r>
-      <w:r>
-        <w:rPr>
-          <w:b/>
-          <w:bCs/>
-          <w:lang w:val="es-ES"/>
-        </w:rPr>
-        <w:t>7</w:t>
-      </w:r>
-      <w:r>
-        <w:rPr>
-          <w:b/>
-          <w:bCs/>
-          <w:lang w:val="es-ES"/>
-        </w:rPr>
-        <w:t xml:space="preserve">] </w:t>
-      </w:r>
-      <w:r>
-        <w:rPr>
-          <w:lang w:val="es-ES"/>
-        </w:rPr>
-        <w:t>Usando lo dado anteriormente, las características del modelo de negocio, se puede garantizar la accesibilidad, la personalización, la escalabilidad y la interactividad con las características del modelo Canvas que hemos descrito anteriormente.</w:t>
+        <w:t>[</w:t>
+      </w:r>
+      <w:proofErr w:type="spellStart"/>
+      <w:r>
+        <w:rPr>
+          <w:b/>
+          <w:bCs/>
+          <w:lang w:val="es-ES"/>
+        </w:rPr>
+        <w:t>Diap</w:t>
+      </w:r>
+      <w:proofErr w:type="spellEnd"/>
+      <w:r>
+        <w:rPr>
+          <w:b/>
+          <w:bCs/>
+          <w:lang w:val="es-ES"/>
+        </w:rPr>
+        <w:t xml:space="preserve">. 15 a 16] </w:t>
+      </w:r>
+      <w:r>
+        <w:rPr>
+          <w:lang w:val="es-ES"/>
+        </w:rPr>
+        <w:t xml:space="preserve">Nuestro modelo de negocio incluye el modelo </w:t>
+      </w:r>
+      <w:proofErr w:type="spellStart"/>
+      <w:r>
+        <w:rPr>
+          <w:lang w:val="es-ES"/>
+        </w:rPr>
+        <w:t>Canvas</w:t>
+      </w:r>
+      <w:proofErr w:type="spellEnd"/>
+      <w:r>
+        <w:rPr>
+          <w:lang w:val="es-ES"/>
+        </w:rPr>
+        <w:t>.</w:t>
+      </w:r>
+      <w:r>
+        <w:rPr>
+          <w:lang w:val="es-ES"/>
+        </w:rPr>
+        <w:t xml:space="preserve"> Se compone en</w:t>
+      </w:r>
+      <w:r>
+        <w:rPr>
+          <w:lang w:val="es-ES"/>
+        </w:rPr>
+        <w:t xml:space="preserve"> </w:t>
+      </w:r>
+      <w:r>
+        <w:rPr>
+          <w:lang w:val="es-ES"/>
+        </w:rPr>
+        <w:t>l</w:t>
+      </w:r>
+      <w:r>
+        <w:rPr>
+          <w:lang w:val="es-ES"/>
+        </w:rPr>
+        <w:t xml:space="preserve">os socios clave pueden ser universidades como la Universidad del Rosario, el Banco de la República, instituciones públicas de educación financiera, ONG y fundaciones económicas. Las actividades clave son el mantenimiento de la plataforma web, el desarrollo de herramientas interactivas, el marketing digital y la creación de contenido dinámico y </w:t>
+      </w:r>
+      <w:proofErr w:type="spellStart"/>
+      <w:r>
+        <w:rPr>
+          <w:lang w:val="es-ES"/>
+        </w:rPr>
+        <w:t>gamificado</w:t>
+      </w:r>
+      <w:proofErr w:type="spellEnd"/>
+      <w:r>
+        <w:rPr>
+          <w:lang w:val="es-ES"/>
+        </w:rPr>
+        <w:t>.</w:t>
+      </w:r>
+    </w:p>
+    <w:p>
+      <w:pPr>
+        <w:rPr>
+          <w:lang w:val="es-ES"/>
+        </w:rPr>
+      </w:pPr>
+      <w:r>
+        <w:rPr>
+          <w:lang w:val="es-ES"/>
+        </w:rPr>
+        <w:t>La propuesta de valor es una plataforma autónoma, interactiva y personalizada, gratuita para el usuario, enfocada en mejorar hábitos financieros y facilitar el acceso a la educación económica. La relación con los clientes será mediante autoservicio digital, soporte opcional y comunicación desde la plataforma. El canal será la página web.</w:t>
+      </w:r>
+    </w:p>
+    <w:p>
+      <w:pPr>
+        <w:rPr>
+          <w:b/>
+          <w:bCs/>
+          <w:lang w:val="es-ES"/>
+        </w:rPr>
+      </w:pPr>
+      <w:r>
+        <w:rPr>
+          <w:lang w:val="es-ES"/>
+        </w:rPr>
+        <w:t>Los segmentos objetivo son jóvenes de 18 a 24 años, trabajadores informales, nómadas digitales y personas interesadas en economía. L</w:t>
+      </w:r>
+      <w:r>
+        <w:rPr>
+          <w:lang w:val="es-ES"/>
+        </w:rPr>
+        <w:t>a estructura de</w:t>
+      </w:r>
+      <w:r>
+        <w:rPr>
+          <w:lang w:val="es-ES"/>
+        </w:rPr>
+        <w:t xml:space="preserve"> costos incluye talento humano, desarrollo tecnológico, servidores, marketing y producción de contenido. L</w:t>
+      </w:r>
+      <w:r>
+        <w:rPr>
+          <w:lang w:val="es-ES"/>
+        </w:rPr>
+        <w:t xml:space="preserve">a fuente de </w:t>
+      </w:r>
+      <w:r>
+        <w:rPr>
+          <w:lang w:val="es-ES"/>
+        </w:rPr>
+        <w:t>ingresos provendrá de suscripciones mensuales, publicidad en la versión gratuita y posibles patrocinios de entidades bancarias.</w:t>
+      </w:r>
+      <w:r>
+        <w:rPr>
+          <w:b/>
+          <w:bCs/>
+          <w:lang w:val="es-ES"/>
+        </w:rPr>
+        <w:t xml:space="preserve"> </w:t>
+      </w:r>
+    </w:p>
+    <w:p>
+      <w:pPr>
+        <w:rPr>
+          <w:lang w:val="es-ES"/>
+        </w:rPr>
+      </w:pPr>
+      <w:r>
+        <w:rPr>
+          <w:b/>
+          <w:bCs/>
+          <w:lang w:val="es-ES"/>
+        </w:rPr>
+        <w:t>[</w:t>
+      </w:r>
+      <w:proofErr w:type="spellStart"/>
+      <w:r>
+        <w:rPr>
+          <w:b/>
+          <w:bCs/>
+          <w:lang w:val="es-ES"/>
+        </w:rPr>
+        <w:t>Diap</w:t>
+      </w:r>
+      <w:proofErr w:type="spellEnd"/>
+      <w:r>
+        <w:rPr>
+          <w:b/>
+          <w:bCs/>
+          <w:lang w:val="es-ES"/>
+        </w:rPr>
+        <w:t xml:space="preserve">. 17] </w:t>
+      </w:r>
+      <w:r>
+        <w:rPr>
+          <w:lang w:val="es-ES"/>
+        </w:rPr>
+        <w:t xml:space="preserve">Usando lo dado anteriormente, las características del modelo de negocio, se puede garantizar la accesibilidad, la personalización, la escalabilidad y la interactividad con las características del modelo </w:t>
+      </w:r>
+      <w:proofErr w:type="spellStart"/>
+      <w:r>
+        <w:rPr>
+          <w:lang w:val="es-ES"/>
+        </w:rPr>
+        <w:t>Canvas</w:t>
+      </w:r>
+      <w:proofErr w:type="spellEnd"/>
+      <w:r>
+        <w:rPr>
+          <w:lang w:val="es-ES"/>
+        </w:rPr>
+        <w:t xml:space="preserve"> que hemos descrito anteriormente.</w:t>
       </w:r>
       <w:r>
         <w:rPr>
@@ -827,23 +1420,25 @@
           <w:bCs/>
           <w:lang w:val="es-ES"/>
         </w:rPr>
-        <w:t>[Diap. 1</w:t>
-      </w:r>
-      <w:r>
-        <w:rPr>
-          <w:b/>
-          <w:bCs/>
-          <w:lang w:val="es-ES"/>
-        </w:rPr>
-        <w:t>8</w:t>
-      </w:r>
-      <w:r>
-        <w:rPr>
-          <w:b/>
-          <w:bCs/>
-          <w:lang w:val="es-ES"/>
-        </w:rPr>
-        <w:t xml:space="preserve">] </w:t>
+        <w:t>[</w:t>
+      </w:r>
+      <w:proofErr w:type="spellStart"/>
+      <w:r>
+        <w:rPr>
+          <w:b/>
+          <w:bCs/>
+          <w:lang w:val="es-ES"/>
+        </w:rPr>
+        <w:t>Diap</w:t>
+      </w:r>
+      <w:proofErr w:type="spellEnd"/>
+      <w:r>
+        <w:rPr>
+          <w:b/>
+          <w:bCs/>
+          <w:lang w:val="es-ES"/>
+        </w:rPr>
+        <w:t xml:space="preserve">. 18] </w:t>
       </w:r>
       <w:r>
         <w:rPr>
@@ -857,23 +1452,76 @@
           <w:iCs/>
           <w:lang w:val="es-ES"/>
         </w:rPr>
-        <w:t>Empoderar a jóvenes, trabajadores informales y nómadas digitales en Bogotá mediante un eco sistema tecnológico de planificación financiera personalizado y accesible. A través de algoritmos de análisis de datos y herramientas interactivas, transforma</w:t>
-      </w:r>
-      <w:r>
-        <w:rPr>
-          <w:i/>
-          <w:iCs/>
-          <w:lang w:val="es-ES"/>
-        </w:rPr>
-        <w:t>nd</w:t>
-      </w:r>
-      <w:r>
-        <w:rPr>
-          <w:i/>
-          <w:iCs/>
-          <w:lang w:val="es-ES"/>
-        </w:rPr>
-        <w:t xml:space="preserve">o conceptos financieros complejos en estrategias prácticas de ahorro, inversión y gestión de seguridad social, promoviendo la resiliencia económica y la bancarización efectiva en un </w:t>
+        <w:t>Impulsar a jóvenes, trabajadores informales y nómadas digitales de Bogotá mediante una plataforma tecnológica de planificación financiera personalizada y accesible, que facilite el ahorro, la inversión y la gestión de recursos, promoviendo una mayor estabilidad y educación financiera</w:t>
+      </w:r>
+      <w:r>
+        <w:rPr>
+          <w:i/>
+          <w:iCs/>
+          <w:lang w:val="es-ES"/>
+        </w:rPr>
+        <w:t>.</w:t>
+      </w:r>
+      <w:r>
+        <w:rPr>
+          <w:i/>
+          <w:iCs/>
+          <w:lang w:val="es-ES"/>
+        </w:rPr>
+        <w:t xml:space="preserve"> </w:t>
+      </w:r>
+      <w:r>
+        <w:rPr>
+          <w:lang w:val="es-ES"/>
+        </w:rPr>
+        <w:t>Esto en base a la evidencia, la mejor forma de proporcionar educación financiera efectiva es por medio de un sistema intuitivo.</w:t>
+      </w:r>
+    </w:p>
+    <w:p>
+      <w:pPr>
+        <w:rPr>
+          <w:lang w:val="es-ES"/>
+        </w:rPr>
+      </w:pPr>
+      <w:r>
+        <w:rPr>
+          <w:b/>
+          <w:bCs/>
+          <w:lang w:val="es-ES"/>
+        </w:rPr>
+        <w:t>[</w:t>
+      </w:r>
+      <w:proofErr w:type="spellStart"/>
+      <w:r>
+        <w:rPr>
+          <w:b/>
+          <w:bCs/>
+          <w:lang w:val="es-ES"/>
+        </w:rPr>
+        <w:t>Diap</w:t>
+      </w:r>
+      <w:proofErr w:type="spellEnd"/>
+      <w:r>
+        <w:rPr>
+          <w:b/>
+          <w:bCs/>
+          <w:lang w:val="es-ES"/>
+        </w:rPr>
+        <w:t xml:space="preserve">. 19] </w:t>
+      </w:r>
+      <w:r>
+        <w:rPr>
+          <w:lang w:val="es-ES"/>
+        </w:rPr>
+        <w:t xml:space="preserve">La visión entonces es que </w:t>
+      </w:r>
+      <w:r>
+        <w:rPr>
+          <w:i/>
+          <w:iCs/>
+          <w:lang w:val="es-ES"/>
+        </w:rPr>
+        <w:t xml:space="preserve">Para 2030, ser la plataforma líder en Bogotá para la gestión financiera inteligente de trabajadores independientes, ofreciendo soluciones seguras, </w:t>
       </w:r>
       <w:r>
         <w:rPr>
@@ -882,7 +1530,15 @@
           <w:lang w:val="es-ES"/>
         </w:rPr>
         <w:lastRenderedPageBreak/>
-        <w:t>entorno laboral digital y dinámico.</w:t>
+        <w:t>personalizadas y basadas en analítica avanzada</w:t>
+      </w:r>
+      <w:r>
+        <w:rPr>
+          <w:i/>
+          <w:iCs/>
+          <w:lang w:val="es-ES"/>
+        </w:rPr>
+        <w:t>.</w:t>
       </w:r>
       <w:r>
         <w:rPr>
@@ -896,68 +1552,709 @@
         <w:rPr>
           <w:lang w:val="es-ES"/>
         </w:rPr>
-        <w:t>Esto en base a la evidencia, la mejor forma de proporcionar educación financiera efectiva es por medio de un sistema intuitivo.</w:t>
-      </w:r>
-    </w:p>
-    <w:p>
-      <w:pPr>
-        <w:rPr>
-          <w:lang w:val="es-ES"/>
-        </w:rPr>
-      </w:pPr>
-      <w:r>
-        <w:rPr>
-          <w:b/>
-          <w:bCs/>
-          <w:lang w:val="es-ES"/>
-        </w:rPr>
-        <w:t xml:space="preserve">[Diap. </w:t>
-      </w:r>
-      <w:r>
-        <w:rPr>
-          <w:b/>
-          <w:bCs/>
-          <w:lang w:val="es-ES"/>
-        </w:rPr>
-        <w:t>19</w:t>
-      </w:r>
-      <w:r>
-        <w:rPr>
-          <w:b/>
-          <w:bCs/>
-          <w:lang w:val="es-ES"/>
-        </w:rPr>
-        <w:t xml:space="preserve">] </w:t>
-      </w:r>
-      <w:r>
-        <w:rPr>
-          <w:lang w:val="es-ES"/>
-        </w:rPr>
-        <w:t xml:space="preserve">La visión entonces es que </w:t>
-      </w:r>
-      <w:r>
-        <w:rPr>
-          <w:i/>
-          <w:iCs/>
-          <w:lang w:val="es-ES"/>
-        </w:rPr>
-        <w:t xml:space="preserve">Para el año 2030, </w:t>
-      </w:r>
-      <w:r>
-        <w:rPr>
-          <w:i/>
-          <w:iCs/>
-          <w:lang w:val="es-ES"/>
-        </w:rPr>
-        <w:t>Edufinanzas se consolide</w:t>
-      </w:r>
-      <w:r>
-        <w:rPr>
-          <w:i/>
-          <w:iCs/>
-          <w:lang w:val="es-ES"/>
-        </w:rPr>
-        <w:t xml:space="preserve"> como la plataforma tecnológica líder en la ciudad de Bogotá para la gestión financiera inteligente de trabajadores independientes, reconocida por nuestra capacidad de integrar la realidad del mercado laboral digital con soluciones de analítica avanzada que garanticen la seguridad socioeconómica de nuestros usuarios.</w:t>
+        <w:t xml:space="preserve">Logrando así que nuestro público objetivo aproveche las capacidades de </w:t>
+      </w:r>
+      <w:proofErr w:type="spellStart"/>
+      <w:r>
+        <w:rPr>
+          <w:lang w:val="es-ES"/>
+        </w:rPr>
+        <w:t>Edufinanzas</w:t>
+      </w:r>
+      <w:proofErr w:type="spellEnd"/>
+      <w:r>
+        <w:rPr>
+          <w:lang w:val="es-ES"/>
+        </w:rPr>
+        <w:t xml:space="preserve"> y pueda no solamente participar más activamente sobre decisiones económicas sino tener la oportunidad de mejorar su situación financiera gracias al aprendizaje dentro del sistema.</w:t>
+      </w:r>
+    </w:p>
+    <w:p>
+      <w:pPr>
+        <w:rPr>
+          <w:lang w:val="es-ES"/>
+        </w:rPr>
+      </w:pPr>
+      <w:r>
+        <w:rPr>
+          <w:b/>
+          <w:bCs/>
+          <w:lang w:val="es-ES"/>
+        </w:rPr>
+        <w:t>[</w:t>
+      </w:r>
+      <w:proofErr w:type="spellStart"/>
+      <w:r>
+        <w:rPr>
+          <w:b/>
+          <w:bCs/>
+          <w:lang w:val="es-ES"/>
+        </w:rPr>
+        <w:t>Diap</w:t>
+      </w:r>
+      <w:proofErr w:type="spellEnd"/>
+      <w:r>
+        <w:rPr>
+          <w:b/>
+          <w:bCs/>
+          <w:lang w:val="es-ES"/>
+        </w:rPr>
+        <w:t xml:space="preserve">. 20] </w:t>
+      </w:r>
+      <w:r>
+        <w:rPr>
+          <w:lang w:val="es-ES"/>
+        </w:rPr>
+        <w:t xml:space="preserve">El equipo está conformado por David Rincón como Gerente General de </w:t>
+      </w:r>
+      <w:proofErr w:type="spellStart"/>
+      <w:r>
+        <w:rPr>
+          <w:lang w:val="es-ES"/>
+        </w:rPr>
+        <w:t>Edufinanzas</w:t>
+      </w:r>
+      <w:proofErr w:type="spellEnd"/>
+      <w:r>
+        <w:rPr>
+          <w:lang w:val="es-ES"/>
+        </w:rPr>
+        <w:t xml:space="preserve"> y Leidy Morales como directora del departamento de investigación, desarrollo e innovación. </w:t>
+      </w:r>
+    </w:p>
+    <w:p>
+      <w:pPr>
+        <w:rPr>
+          <w:lang w:val="es-ES"/>
+        </w:rPr>
+      </w:pPr>
+      <w:r>
+        <w:rPr>
+          <w:b/>
+          <w:bCs/>
+          <w:lang w:val="es-ES"/>
+        </w:rPr>
+        <w:t>[</w:t>
+      </w:r>
+      <w:proofErr w:type="spellStart"/>
+      <w:r>
+        <w:rPr>
+          <w:b/>
+          <w:bCs/>
+          <w:lang w:val="es-ES"/>
+        </w:rPr>
+        <w:t>Diap</w:t>
+      </w:r>
+      <w:proofErr w:type="spellEnd"/>
+      <w:r>
+        <w:rPr>
+          <w:b/>
+          <w:bCs/>
+          <w:lang w:val="es-ES"/>
+        </w:rPr>
+        <w:t xml:space="preserve">. 21] </w:t>
+      </w:r>
+      <w:r>
+        <w:rPr>
+          <w:lang w:val="es-ES"/>
+        </w:rPr>
+        <w:t xml:space="preserve">Ahora vamos a hablar sobre los estados financieros, en el cual se documenta la rentabilidad del modelo de negocio. </w:t>
+      </w:r>
+    </w:p>
+    <w:p>
+      <w:pPr>
+        <w:rPr>
+          <w:lang w:val="es-ES"/>
+        </w:rPr>
+      </w:pPr>
+      <w:r>
+        <w:rPr>
+          <w:b/>
+          <w:bCs/>
+          <w:lang w:val="es-ES"/>
+        </w:rPr>
+        <w:t>[</w:t>
+      </w:r>
+      <w:proofErr w:type="spellStart"/>
+      <w:r>
+        <w:rPr>
+          <w:b/>
+          <w:bCs/>
+          <w:lang w:val="es-ES"/>
+        </w:rPr>
+        <w:t>Diap</w:t>
+      </w:r>
+      <w:proofErr w:type="spellEnd"/>
+      <w:r>
+        <w:rPr>
+          <w:b/>
+          <w:bCs/>
+          <w:lang w:val="es-ES"/>
+        </w:rPr>
+        <w:t xml:space="preserve">. 22] </w:t>
+      </w:r>
+      <w:r>
+        <w:rPr>
+          <w:lang w:val="es-ES"/>
+        </w:rPr>
+        <w:t xml:space="preserve">Al principio se va a contar con un capital inicial de 33 millones 640 mil pesos el cual se divide en 19 millones 300 mil entre los aportes de los socios y el resto usando un préstamo bancario de GNB Sudameris, este capital inicial se divide entre el capital de trabajo (salarios), planeación, producción de contenidos interactivos, planeación de marketing, equipos de trabajo y el montaje de la infraestructura inicial. </w:t>
+      </w:r>
+    </w:p>
+    <w:p>
+      <w:pPr>
+        <w:rPr>
+          <w:lang w:val="es-ES"/>
+        </w:rPr>
+      </w:pPr>
+      <w:r>
+        <w:rPr>
+          <w:b/>
+          <w:bCs/>
+          <w:lang w:val="es-ES"/>
+        </w:rPr>
+        <w:t>[</w:t>
+      </w:r>
+      <w:proofErr w:type="spellStart"/>
+      <w:r>
+        <w:rPr>
+          <w:b/>
+          <w:bCs/>
+          <w:lang w:val="es-ES"/>
+        </w:rPr>
+        <w:t>Diap</w:t>
+      </w:r>
+      <w:proofErr w:type="spellEnd"/>
+      <w:r>
+        <w:rPr>
+          <w:b/>
+          <w:bCs/>
+          <w:lang w:val="es-ES"/>
+        </w:rPr>
+        <w:t xml:space="preserve">. 23] </w:t>
+      </w:r>
+      <w:r>
+        <w:rPr>
+          <w:lang w:val="es-ES"/>
+        </w:rPr>
+        <w:t>Acá se presenta las proyecciones de venta, donde se detallan los diferentes tipos de financiamiento que posee nuestro modelo de negocio, dentro del cual, se presenta dos versiones, una versión gratuita que funciona con publicidad dentro de la página, y una versión suscrita, que contará con un valor de 30 mil pesos por mes la cual elimina la publicidad y desbloquea funciones más avanzadas.</w:t>
+      </w:r>
+    </w:p>
+    <w:p>
+      <w:pPr>
+        <w:rPr>
+          <w:lang w:val="es-ES"/>
+        </w:rPr>
+      </w:pPr>
+      <w:r>
+        <w:rPr>
+          <w:b/>
+          <w:bCs/>
+          <w:lang w:val="es-ES"/>
+        </w:rPr>
+        <w:t>[</w:t>
+      </w:r>
+      <w:proofErr w:type="spellStart"/>
+      <w:r>
+        <w:rPr>
+          <w:b/>
+          <w:bCs/>
+          <w:lang w:val="es-ES"/>
+        </w:rPr>
+        <w:t>Diap</w:t>
+      </w:r>
+      <w:proofErr w:type="spellEnd"/>
+      <w:r>
+        <w:rPr>
+          <w:b/>
+          <w:bCs/>
+          <w:lang w:val="es-ES"/>
+        </w:rPr>
+        <w:t xml:space="preserve">. 24] </w:t>
+      </w:r>
+      <w:r>
+        <w:rPr>
+          <w:lang w:val="es-ES"/>
+        </w:rPr>
+        <w:t xml:space="preserve">Adicionalmente, acá se encuentra proyectado el incremento de las ventas durante los primeros cinco años del modelo de negocio, está se basa en pronósticos del </w:t>
+      </w:r>
+      <w:r>
+        <w:rPr>
+          <w:lang w:val="es-ES"/>
+        </w:rPr>
+        <w:t>IPC</w:t>
+      </w:r>
+      <w:r>
+        <w:rPr>
+          <w:lang w:val="es-ES"/>
+        </w:rPr>
+        <w:t xml:space="preserve"> junto a un estimado porcentaje de crecimiento de ventas, es decir, de suscripciones, publicidad y otros aspectos comparados con el año pasado.</w:t>
+      </w:r>
+    </w:p>
+    <w:p>
+      <w:pPr>
+        <w:rPr>
+          <w:lang w:val="es-ES"/>
+        </w:rPr>
+      </w:pPr>
+      <w:r>
+        <w:rPr>
+          <w:b/>
+          <w:bCs/>
+          <w:lang w:val="es-ES"/>
+        </w:rPr>
+        <w:t>[</w:t>
+      </w:r>
+      <w:proofErr w:type="spellStart"/>
+      <w:r>
+        <w:rPr>
+          <w:b/>
+          <w:bCs/>
+          <w:lang w:val="es-ES"/>
+        </w:rPr>
+        <w:t>Diap</w:t>
+      </w:r>
+      <w:proofErr w:type="spellEnd"/>
+      <w:r>
+        <w:rPr>
+          <w:b/>
+          <w:bCs/>
+          <w:lang w:val="es-ES"/>
+        </w:rPr>
+        <w:t xml:space="preserve">. 25] </w:t>
+      </w:r>
+      <w:r>
+        <w:rPr>
+          <w:lang w:val="es-ES"/>
+        </w:rPr>
+        <w:t>Ahora damos a conocer detalles sobre el préstamo y la amortización del crédito, como mencionamos anteriormente, este será mediante el banco GNB Sudameris por un valor del préstamo de 15 millones 790 mil pesos. Cuyo plazo de paga será de 4 años con un interés anual de 16,64%. Abajo podemos observar como el pago de este préstamo en cada uno de los períodos anuales, con un pago de 5 millones 715 mil por año, cuyo valor se va entre los intereses del préstamo junto al abono al capital.</w:t>
+      </w:r>
+    </w:p>
+    <w:p>
+      <w:pPr>
+        <w:rPr>
+          <w:lang w:val="es-ES"/>
+        </w:rPr>
+      </w:pPr>
+      <w:r>
+        <w:rPr>
+          <w:b/>
+          <w:bCs/>
+          <w:lang w:val="es-ES"/>
+        </w:rPr>
+        <w:t>[</w:t>
+      </w:r>
+      <w:proofErr w:type="spellStart"/>
+      <w:r>
+        <w:rPr>
+          <w:b/>
+          <w:bCs/>
+          <w:lang w:val="es-ES"/>
+        </w:rPr>
+        <w:t>Diap</w:t>
+      </w:r>
+      <w:proofErr w:type="spellEnd"/>
+      <w:r>
+        <w:rPr>
+          <w:b/>
+          <w:bCs/>
+          <w:lang w:val="es-ES"/>
+        </w:rPr>
+        <w:t xml:space="preserve">. 26] </w:t>
+      </w:r>
+      <w:r>
+        <w:rPr>
+          <w:lang w:val="es-ES"/>
+        </w:rPr>
+        <w:t>En el balance general, nosotros lo dividimos en tres grandes grupos los cuales son los activos, los pasivos, y el capital. En el primero se subdivide en activos corrientes y no corrientes que se refiere al flujo de efectivo existente, la depreciación de los equipos, el valor de los intangibles. Y a eso restarle los pasivos, los cuales se dividen en corrientes y no corrientes, donde se específica el pago de acreedores comerciales, salarios y otros beneficios de los clientes y el pago del préstamo. Y también el capital que tiene en cuenta el capital social, los dividendos resultantes y la utilidad.</w:t>
+      </w:r>
+    </w:p>
+    <w:p>
+      <w:pPr>
+        <w:rPr>
+          <w:lang w:val="es-ES"/>
+        </w:rPr>
+      </w:pPr>
+      <w:r>
+        <w:rPr>
+          <w:b/>
+          <w:bCs/>
+          <w:lang w:val="es-ES"/>
+        </w:rPr>
+        <w:t>[</w:t>
+      </w:r>
+      <w:proofErr w:type="spellStart"/>
+      <w:r>
+        <w:rPr>
+          <w:b/>
+          <w:bCs/>
+          <w:lang w:val="es-ES"/>
+        </w:rPr>
+        <w:t>Diap</w:t>
+      </w:r>
+      <w:proofErr w:type="spellEnd"/>
+      <w:r>
+        <w:rPr>
+          <w:b/>
+          <w:bCs/>
+          <w:lang w:val="es-ES"/>
+        </w:rPr>
+        <w:t xml:space="preserve">. 27] </w:t>
+      </w:r>
+      <w:r>
+        <w:rPr>
+          <w:lang w:val="es-ES"/>
+        </w:rPr>
+        <w:t xml:space="preserve">En el estado de resultados podemos visualizar las utilidades de nuestro negocio, en donde los impuestos son claramente del 35% para las PYMES en Colombia, esta se divide en Bruta, que se subdivide en los ingresos obtenidos y el costo de mantenimiento. Operativa que trata sobre la mano de obra, beneficios, administración y de marketing. Y cuotas del préstamo. Finalmente, en </w:t>
+      </w:r>
+      <w:r>
+        <w:rPr>
+          <w:lang w:val="es-ES"/>
+        </w:rPr>
+        <w:lastRenderedPageBreak/>
+        <w:t>la parte inferior de la tabla se detalla la utilidad neta que se calcula de 11 millones pesos para el primer año fiscal llegando a 182 millones para el quinto año de operación.</w:t>
+      </w:r>
+    </w:p>
+    <w:p>
+      <w:pPr>
+        <w:rPr>
+          <w:lang w:val="es-ES"/>
+        </w:rPr>
+      </w:pPr>
+      <w:r>
+        <w:rPr>
+          <w:b/>
+          <w:bCs/>
+          <w:lang w:val="es-ES"/>
+        </w:rPr>
+        <w:t>[</w:t>
+      </w:r>
+      <w:proofErr w:type="spellStart"/>
+      <w:r>
+        <w:rPr>
+          <w:b/>
+          <w:bCs/>
+          <w:lang w:val="es-ES"/>
+        </w:rPr>
+        <w:t>Diap</w:t>
+      </w:r>
+      <w:proofErr w:type="spellEnd"/>
+      <w:r>
+        <w:rPr>
+          <w:b/>
+          <w:bCs/>
+          <w:lang w:val="es-ES"/>
+        </w:rPr>
+        <w:t xml:space="preserve">. 28] </w:t>
+      </w:r>
+      <w:r>
+        <w:rPr>
+          <w:lang w:val="es-ES"/>
+        </w:rPr>
+        <w:t>Con base en lo anterior, nos dejaría el flujo de caja que es el dinero libre que podemos invertir en agrandar el proyecto. Como observamos, durante el primer año contamos con apenas 11 millones de pesos. Pero esperamos que en año venideros este flujo aumente hasta alcanzar los 180 millones para el quinto año, lo que permitiría tener mayor flexibilidad para abrir la puerta a nuevas formas de inversión, realizar nuevos proyectos y mejorar la infraestructura existente.</w:t>
+      </w:r>
+    </w:p>
+    <w:p>
+      <w:pPr>
+        <w:rPr>
+          <w:lang w:val="es-ES"/>
+        </w:rPr>
+      </w:pPr>
+      <w:r>
+        <w:rPr>
+          <w:b/>
+          <w:bCs/>
+          <w:lang w:val="es-ES"/>
+        </w:rPr>
+        <w:t>[</w:t>
+      </w:r>
+      <w:proofErr w:type="spellStart"/>
+      <w:r>
+        <w:rPr>
+          <w:b/>
+          <w:bCs/>
+          <w:lang w:val="es-ES"/>
+        </w:rPr>
+        <w:t>Diap</w:t>
+      </w:r>
+      <w:proofErr w:type="spellEnd"/>
+      <w:r>
+        <w:rPr>
+          <w:b/>
+          <w:bCs/>
+          <w:lang w:val="es-ES"/>
+        </w:rPr>
+        <w:t xml:space="preserve">. 29] </w:t>
+      </w:r>
+      <w:r>
+        <w:rPr>
+          <w:lang w:val="es-ES"/>
+        </w:rPr>
+        <w:t>Para estimar el punto de equilibrio, siempre se tendrá en cuenta el costo fijo, los empleados, el hosting y los servicios, cuyos valores deben ser fijos durante la operación del aplicativo. Además, añadimos un 10% del valor para imprevistos en caso de ocurrir un evento extraordinario.</w:t>
+      </w:r>
+    </w:p>
+    <w:p>
+      <w:pPr>
+        <w:rPr>
+          <w:lang w:val="es-ES"/>
+        </w:rPr>
+      </w:pPr>
+      <w:r>
+        <w:rPr>
+          <w:b/>
+          <w:bCs/>
+          <w:lang w:val="es-ES"/>
+        </w:rPr>
+        <w:t>[</w:t>
+      </w:r>
+      <w:proofErr w:type="spellStart"/>
+      <w:r>
+        <w:rPr>
+          <w:b/>
+          <w:bCs/>
+          <w:lang w:val="es-ES"/>
+        </w:rPr>
+        <w:t>Diap</w:t>
+      </w:r>
+      <w:proofErr w:type="spellEnd"/>
+      <w:r>
+        <w:rPr>
+          <w:b/>
+          <w:bCs/>
+          <w:lang w:val="es-ES"/>
+        </w:rPr>
+        <w:t xml:space="preserve">. 30] </w:t>
+      </w:r>
+      <w:r>
+        <w:rPr>
+          <w:lang w:val="es-ES"/>
+        </w:rPr>
+        <w:t>Pasamos hacia el análisis de proyecciones, este se realiza teniendo en cuenta las ganancias de las proyecciones dadas anteriormente. Para el primer año, vemos que, por cada persona que este dentro del aplicativo de forma anual, se genera 33.027 pesos, esto sumando a personas con suscripciones pagas y gratuitas. Adicionalmente, vemos que el número de usuarios que se proyecta para el primer año de la plataforma es de 4.944.</w:t>
+      </w:r>
+    </w:p>
+    <w:p>
+      <w:pPr>
+        <w:rPr>
+          <w:lang w:val="es-ES"/>
+        </w:rPr>
+      </w:pPr>
+      <w:r>
+        <w:rPr>
+          <w:b/>
+          <w:bCs/>
+          <w:lang w:val="es-ES"/>
+        </w:rPr>
+        <w:t>[</w:t>
+      </w:r>
+      <w:proofErr w:type="spellStart"/>
+      <w:r>
+        <w:rPr>
+          <w:b/>
+          <w:bCs/>
+          <w:lang w:val="es-ES"/>
+        </w:rPr>
+        <w:t>Diap</w:t>
+      </w:r>
+      <w:proofErr w:type="spellEnd"/>
+      <w:r>
+        <w:rPr>
+          <w:b/>
+          <w:bCs/>
+          <w:lang w:val="es-ES"/>
+        </w:rPr>
+        <w:t xml:space="preserve">. 31 a 32] </w:t>
+      </w:r>
+      <w:r>
+        <w:rPr>
+          <w:lang w:val="es-ES"/>
+        </w:rPr>
+        <w:t>Siguiendo con la estimación del punto de equilibrio, el costo de producción es de 31.955 pesos por cada usuario, y por tal. Podemos observar como el punto de equilibrio donde el cual los ingresos superan los costos es alrededor de 4.784 personas en total, con unas ventas anuales mínimas de alrededor de 158 millones de pesos.</w:t>
+      </w:r>
+    </w:p>
+    <w:p>
+      <w:pPr>
+        <w:rPr>
+          <w:lang w:val="es-ES"/>
+        </w:rPr>
+      </w:pPr>
+      <w:r>
+        <w:rPr>
+          <w:b/>
+          <w:bCs/>
+          <w:lang w:val="es-ES"/>
+        </w:rPr>
+        <w:t>[</w:t>
+      </w:r>
+      <w:proofErr w:type="spellStart"/>
+      <w:r>
+        <w:rPr>
+          <w:b/>
+          <w:bCs/>
+          <w:lang w:val="es-ES"/>
+        </w:rPr>
+        <w:t>Diap</w:t>
+      </w:r>
+      <w:proofErr w:type="spellEnd"/>
+      <w:r>
+        <w:rPr>
+          <w:b/>
+          <w:bCs/>
+          <w:lang w:val="es-ES"/>
+        </w:rPr>
+        <w:t xml:space="preserve">. 33] </w:t>
+      </w:r>
+      <w:r>
+        <w:rPr>
+          <w:lang w:val="es-ES"/>
+        </w:rPr>
+        <w:t>En base a todo lo anterior, el valor actual neto es de 219 millones de pesos con una tasa interna de retorno de 94,95% efectiva anual, lo cual es muy positiva para el negocio.</w:t>
+      </w:r>
+    </w:p>
+    <w:p>
+      <w:pPr>
+        <w:rPr>
+          <w:lang w:val="es-ES"/>
+        </w:rPr>
+      </w:pPr>
+      <w:r>
+        <w:rPr>
+          <w:b/>
+          <w:bCs/>
+          <w:lang w:val="es-ES"/>
+        </w:rPr>
+        <w:t>[</w:t>
+      </w:r>
+      <w:proofErr w:type="spellStart"/>
+      <w:r>
+        <w:rPr>
+          <w:b/>
+          <w:bCs/>
+          <w:lang w:val="es-ES"/>
+        </w:rPr>
+        <w:t>Diap</w:t>
+      </w:r>
+      <w:proofErr w:type="spellEnd"/>
+      <w:r>
+        <w:rPr>
+          <w:b/>
+          <w:bCs/>
+          <w:lang w:val="es-ES"/>
+        </w:rPr>
+        <w:t xml:space="preserve">. 34 a 35] </w:t>
+      </w:r>
+      <w:r>
+        <w:rPr>
+          <w:lang w:val="es-ES"/>
+        </w:rPr>
+        <w:t>Sobre el análisis financiero, mostramos la rentabilidad de operación, el nivel de endeudamiento que posee, que se reduce de gran manera con el paso del tiempo, junto a la liquidez de estos años, demostrando que la empresa es muy rentable y es realista.</w:t>
+      </w:r>
+    </w:p>
+    <w:p>
+      <w:pPr>
+        <w:rPr>
+          <w:i/>
+          <w:iCs/>
+          <w:lang w:val="es-ES"/>
+        </w:rPr>
+      </w:pPr>
+      <w:r>
+        <w:rPr>
+          <w:b/>
+          <w:bCs/>
+          <w:lang w:val="es-ES"/>
+        </w:rPr>
+        <w:t>[</w:t>
+      </w:r>
+      <w:proofErr w:type="spellStart"/>
+      <w:r>
+        <w:rPr>
+          <w:b/>
+          <w:bCs/>
+          <w:lang w:val="es-ES"/>
+        </w:rPr>
+        <w:t>Diap</w:t>
+      </w:r>
+      <w:proofErr w:type="spellEnd"/>
+      <w:r>
+        <w:rPr>
+          <w:b/>
+          <w:bCs/>
+          <w:lang w:val="es-ES"/>
+        </w:rPr>
+        <w:t xml:space="preserve">. 36 a 37] </w:t>
+      </w:r>
+      <w:r>
+        <w:rPr>
+          <w:lang w:val="es-ES"/>
+        </w:rPr>
+        <w:t xml:space="preserve">Para terminar, tenemos unas conclusiones finales con respecto al proyecto, el primero es que </w:t>
+      </w:r>
+      <w:r>
+        <w:rPr>
+          <w:i/>
+          <w:iCs/>
+          <w:lang w:val="es-ES"/>
+        </w:rPr>
+        <w:t xml:space="preserve">El plan de negocio de </w:t>
+      </w:r>
+      <w:proofErr w:type="spellStart"/>
+      <w:r>
+        <w:rPr>
+          <w:i/>
+          <w:iCs/>
+          <w:lang w:val="es-ES"/>
+        </w:rPr>
+        <w:t>EduFinanzas</w:t>
+      </w:r>
+      <w:proofErr w:type="spellEnd"/>
+      <w:r>
+        <w:rPr>
+          <w:i/>
+          <w:iCs/>
+          <w:lang w:val="es-ES"/>
+        </w:rPr>
+        <w:t xml:space="preserve"> propone una plataforma </w:t>
+      </w:r>
+      <w:proofErr w:type="spellStart"/>
+      <w:r>
+        <w:rPr>
+          <w:i/>
+          <w:iCs/>
+          <w:lang w:val="es-ES"/>
+        </w:rPr>
+        <w:t>EdTech</w:t>
+      </w:r>
+      <w:proofErr w:type="spellEnd"/>
+      <w:r>
+        <w:rPr>
+          <w:i/>
+          <w:iCs/>
+          <w:lang w:val="es-ES"/>
+        </w:rPr>
+        <w:t xml:space="preserve"> centrada en educación financiera, que permite </w:t>
+      </w:r>
+      <w:r>
+        <w:rPr>
+          <w:i/>
+          <w:iCs/>
+          <w:lang w:val="es-ES"/>
+        </w:rPr>
+        <w:t>al público objetivo</w:t>
+      </w:r>
+      <w:r>
+        <w:rPr>
+          <w:i/>
+          <w:iCs/>
+          <w:lang w:val="es-ES"/>
+        </w:rPr>
+        <w:t>. El análisis identifica sus oportunidades y riesgos, mostrando la viabilidad del modelo en el mercado actual</w:t>
+      </w:r>
+      <w:r>
+        <w:rPr>
+          <w:i/>
+          <w:iCs/>
+          <w:lang w:val="es-ES"/>
+        </w:rPr>
+        <w:t>.</w:t>
       </w:r>
       <w:r>
         <w:rPr>
@@ -971,815 +2268,213 @@
         <w:rPr>
           <w:lang w:val="es-ES"/>
         </w:rPr>
-        <w:t>Logrando así que nuestro público objetivo aproveche las capacidades de Edufinanzas y pueda no solamente participar más activamente sobre decisiones económicas sino tener la oportunidad de mejorar su situación financiera gracias al aprendizaje dentro del sistema.</w:t>
-      </w:r>
-    </w:p>
-    <w:p>
-      <w:pPr>
-        <w:rPr>
-          <w:lang w:val="es-ES"/>
-        </w:rPr>
-      </w:pPr>
-      <w:r>
-        <w:rPr>
-          <w:b/>
-          <w:bCs/>
-          <w:lang w:val="es-ES"/>
-        </w:rPr>
-        <w:t>[Diap. 2</w:t>
-      </w:r>
-      <w:r>
-        <w:rPr>
-          <w:b/>
-          <w:bCs/>
-          <w:lang w:val="es-ES"/>
-        </w:rPr>
-        <w:t>0</w:t>
-      </w:r>
-      <w:r>
-        <w:rPr>
-          <w:b/>
-          <w:bCs/>
-          <w:lang w:val="es-ES"/>
-        </w:rPr>
-        <w:t xml:space="preserve">] </w:t>
-      </w:r>
-      <w:r>
-        <w:rPr>
-          <w:lang w:val="es-ES"/>
-        </w:rPr>
-        <w:t xml:space="preserve">El equipo está conformado por David Leonardo Rincón Ovalle como Gerente General de Edufinanzas y Leidy Marcela Morales Segura como directora del departamento de investigación, desarrollo e innovación. </w:t>
-      </w:r>
-    </w:p>
-    <w:p>
-      <w:pPr>
-        <w:rPr>
-          <w:lang w:val="es-ES"/>
-        </w:rPr>
-      </w:pPr>
-      <w:r>
-        <w:rPr>
-          <w:b/>
-          <w:bCs/>
-          <w:lang w:val="es-ES"/>
-        </w:rPr>
-        <w:t>[Diap. 2</w:t>
-      </w:r>
-      <w:r>
-        <w:rPr>
-          <w:b/>
-          <w:bCs/>
-          <w:lang w:val="es-ES"/>
-        </w:rPr>
-        <w:t>1</w:t>
-      </w:r>
-      <w:r>
-        <w:rPr>
-          <w:b/>
-          <w:bCs/>
-          <w:lang w:val="es-ES"/>
-        </w:rPr>
-        <w:t xml:space="preserve">] </w:t>
-      </w:r>
-      <w:r>
-        <w:rPr>
-          <w:lang w:val="es-ES"/>
-        </w:rPr>
-        <w:t xml:space="preserve">Ahora vamos a hablar sobre los estados financieros, en el cual se documenta la rentabilidad del modelo de negocio. </w:t>
-      </w:r>
-    </w:p>
-    <w:p>
-      <w:pPr>
-        <w:rPr>
-          <w:lang w:val="es-ES"/>
-        </w:rPr>
-      </w:pPr>
-      <w:r>
-        <w:rPr>
-          <w:b/>
-          <w:bCs/>
-          <w:lang w:val="es-ES"/>
-        </w:rPr>
-        <w:t>[Diap. 2</w:t>
-      </w:r>
-      <w:r>
-        <w:rPr>
-          <w:b/>
-          <w:bCs/>
-          <w:lang w:val="es-ES"/>
-        </w:rPr>
-        <w:t>2</w:t>
-      </w:r>
-      <w:r>
-        <w:rPr>
-          <w:b/>
-          <w:bCs/>
-          <w:lang w:val="es-ES"/>
-        </w:rPr>
-        <w:t xml:space="preserve">] </w:t>
-      </w:r>
-      <w:r>
-        <w:rPr>
-          <w:lang w:val="es-ES"/>
-        </w:rPr>
-        <w:t xml:space="preserve">Al principio se va a contar con un capital inicial de 33 millones 640 mil pesos el cual se divide en 19 millones 300 mil entre los aportes de los socios y el resto usando un préstamo bancario de GNB Sudameris, este capital inicial se divide entre el capital de trabajo (salarios), planeación, producción de contenidos interactivos, planeación de marketing, equipos de trabajo y el montaje de la infraestructura inicial. </w:t>
-      </w:r>
-    </w:p>
-    <w:p>
-      <w:pPr>
-        <w:rPr>
-          <w:lang w:val="es-ES"/>
-        </w:rPr>
-      </w:pPr>
-      <w:r>
-        <w:rPr>
-          <w:b/>
-          <w:bCs/>
-          <w:lang w:val="es-ES"/>
-        </w:rPr>
-        <w:t>[Diap. 2</w:t>
-      </w:r>
-      <w:r>
-        <w:rPr>
-          <w:b/>
-          <w:bCs/>
-          <w:lang w:val="es-ES"/>
-        </w:rPr>
-        <w:t>3</w:t>
-      </w:r>
-      <w:r>
-        <w:rPr>
-          <w:b/>
-          <w:bCs/>
-          <w:lang w:val="es-ES"/>
-        </w:rPr>
-        <w:t xml:space="preserve">] </w:t>
-      </w:r>
-      <w:r>
-        <w:rPr>
-          <w:lang w:val="es-ES"/>
-        </w:rPr>
-        <w:t>Acá se presenta las proyecciones de venta, donde se detallan los diferentes tipos de financiamiento que posee nuestro modelo de negocio, dentro del cual, se presenta dos versiones, una versión gratuita que funciona con publicidad dentro de la página, y una versión suscrita, que contará con un valor de 30 mil pesos por mes la cual elimina la publicidad y desbloquea funciones más avanzadas.</w:t>
-      </w:r>
-    </w:p>
-    <w:p>
-      <w:pPr>
-        <w:rPr>
-          <w:lang w:val="es-ES"/>
-        </w:rPr>
-      </w:pPr>
-      <w:r>
-        <w:rPr>
-          <w:b/>
-          <w:bCs/>
-          <w:lang w:val="es-ES"/>
-        </w:rPr>
-        <w:t>[Diap. 2</w:t>
-      </w:r>
-      <w:r>
-        <w:rPr>
-          <w:b/>
-          <w:bCs/>
-          <w:lang w:val="es-ES"/>
-        </w:rPr>
-        <w:t>4</w:t>
-      </w:r>
-      <w:r>
-        <w:rPr>
-          <w:b/>
-          <w:bCs/>
-          <w:lang w:val="es-ES"/>
-        </w:rPr>
-        <w:t xml:space="preserve">] </w:t>
-      </w:r>
-      <w:r>
-        <w:rPr>
-          <w:lang w:val="es-ES"/>
-        </w:rPr>
-        <w:t>Adicionalmente, acá se encuentra proyectado el incremento de las ventas durante los primeros cinco años del modelo de negocio, está se basa en pronósticos del Índice de Precios al Consumidor junto a un estimado porcentaje de crecimiento de ventas, es decir, de suscripciones, publicidad y otros aspectos comparados con el año pasado.</w:t>
-      </w:r>
-    </w:p>
-    <w:p>
-      <w:pPr>
-        <w:rPr>
-          <w:lang w:val="es-ES"/>
-        </w:rPr>
-      </w:pPr>
-      <w:r>
-        <w:rPr>
-          <w:b/>
-          <w:bCs/>
-          <w:lang w:val="es-ES"/>
-        </w:rPr>
-        <w:t>[Diap. 2</w:t>
-      </w:r>
-      <w:r>
-        <w:rPr>
-          <w:b/>
-          <w:bCs/>
-          <w:lang w:val="es-ES"/>
-        </w:rPr>
-        <w:t>5</w:t>
-      </w:r>
-      <w:r>
-        <w:rPr>
-          <w:b/>
-          <w:bCs/>
-          <w:lang w:val="es-ES"/>
-        </w:rPr>
-        <w:t xml:space="preserve">] </w:t>
-      </w:r>
-      <w:r>
-        <w:rPr>
-          <w:lang w:val="es-ES"/>
-        </w:rPr>
-        <w:t>Ahora damos a conocer detalles sobre el préstamo y la amortización del crédito, como mencionamos anteriormente, este será mediante el banco GNB Sudameris por un valor del préstamo de 15 millones 790 mil pesos. Cuyo plazo de paga será de 4 años (48 meses) con un interés anual de 16,64%. Abajo podemos observar como el pago de este préstamo en cada uno de los períodos anuales, con un pago de 5 millones 715 mil por año, cuyo valor se va entre los intereses del préstamo junto al abono al capital.</w:t>
-      </w:r>
-    </w:p>
-    <w:p>
-      <w:pPr>
-        <w:rPr>
-          <w:lang w:val="es-ES"/>
-        </w:rPr>
-      </w:pPr>
-      <w:r>
-        <w:rPr>
-          <w:b/>
-          <w:bCs/>
-          <w:lang w:val="es-ES"/>
-        </w:rPr>
-        <w:t>[Diap. 2</w:t>
-      </w:r>
-      <w:r>
-        <w:rPr>
-          <w:b/>
-          <w:bCs/>
-          <w:lang w:val="es-ES"/>
-        </w:rPr>
-        <w:t>6</w:t>
-      </w:r>
-      <w:r>
-        <w:rPr>
-          <w:b/>
-          <w:bCs/>
-          <w:lang w:val="es-ES"/>
-        </w:rPr>
-        <w:t xml:space="preserve">] </w:t>
-      </w:r>
-      <w:r>
-        <w:rPr>
-          <w:lang w:val="es-ES"/>
-        </w:rPr>
-        <w:t xml:space="preserve">En el balance general, nosotros lo dividimos en tres grandes grupos los cuales son los activos, los pasivos, y el capital. En el primero se subdivide en activos corrientes y no corrientes que se refiere al flujo de efectivo existente, la depreciación de los equipos, el valor de los intangibles. Y a eso restarle los pasivos, los cuales se dividen en corrientes y no corrientes, donde se específica el pago de acreedores comerciales, salarios y otros beneficios de los clientes y el </w:t>
+        <w:t xml:space="preserve">Y como segunda y última conclusión es que </w:t>
+      </w:r>
+      <w:proofErr w:type="spellStart"/>
+      <w:r>
+        <w:rPr>
+          <w:i/>
+          <w:iCs/>
+          <w:lang w:val="es-ES"/>
+        </w:rPr>
+        <w:t>EduFinanzas</w:t>
+      </w:r>
+      <w:proofErr w:type="spellEnd"/>
+      <w:r>
+        <w:rPr>
+          <w:i/>
+          <w:iCs/>
+          <w:lang w:val="es-ES"/>
+        </w:rPr>
+        <w:t xml:space="preserve"> tiene potencial para fortalecer la educación financiera de estas comunidades mediante una plataforma inclusiva, con opciones de acceso con y sin suscripción. Además, busca contribuir a la transformación digital del sector financiero, convirtiendo el uso de datos en un mayor bienestar económico para la sociedad</w:t>
+      </w:r>
+      <w:r>
+        <w:rPr>
+          <w:i/>
+          <w:iCs/>
+          <w:lang w:val="es-ES"/>
+        </w:rPr>
+        <w:t>.</w:t>
+      </w:r>
+    </w:p>
+    <w:p>
+      <w:pPr>
+        <w:rPr>
+          <w:lang w:val="es-ES"/>
+        </w:rPr>
+      </w:pPr>
+      <w:r>
+        <w:rPr>
+          <w:b/>
+          <w:bCs/>
+          <w:lang w:val="es-ES"/>
+        </w:rPr>
+        <w:t>[</w:t>
+      </w:r>
+      <w:proofErr w:type="spellStart"/>
+      <w:r>
+        <w:rPr>
+          <w:b/>
+          <w:bCs/>
+          <w:lang w:val="es-ES"/>
+        </w:rPr>
+        <w:t>Diap</w:t>
+      </w:r>
+      <w:proofErr w:type="spellEnd"/>
+      <w:r>
+        <w:rPr>
+          <w:b/>
+          <w:bCs/>
+          <w:lang w:val="es-ES"/>
+        </w:rPr>
+        <w:t xml:space="preserve">. 38 a 39] </w:t>
+      </w:r>
+      <w:r>
+        <w:rPr>
+          <w:lang w:val="es-ES"/>
+        </w:rPr>
+        <w:t>Bueno, aquí tenemos alguna de la bibliografía relevante para el proyecto, otras referencias se encuentran dentro del proyecto.</w:t>
+      </w:r>
+    </w:p>
+    <w:p>
+      <w:pPr>
+        <w:rPr>
+          <w:lang w:val="es-ES"/>
+        </w:rPr>
+      </w:pPr>
+      <w:r>
+        <w:rPr>
+          <w:b/>
+          <w:bCs/>
+          <w:lang w:val="es-ES"/>
+        </w:rPr>
+        <w:t>[</w:t>
+      </w:r>
+      <w:proofErr w:type="spellStart"/>
+      <w:r>
+        <w:rPr>
+          <w:b/>
+          <w:bCs/>
+          <w:lang w:val="es-ES"/>
+        </w:rPr>
+        <w:t>Diap</w:t>
+      </w:r>
+      <w:proofErr w:type="spellEnd"/>
+      <w:r>
+        <w:rPr>
+          <w:b/>
+          <w:bCs/>
+          <w:lang w:val="es-ES"/>
+        </w:rPr>
+        <w:t xml:space="preserve">. 40] </w:t>
+      </w:r>
+      <w:r>
+        <w:rPr>
+          <w:lang w:val="es-ES"/>
+        </w:rPr>
+        <w:t xml:space="preserve">Como agradecimientos, inicialmente al grupo de emprendimiento que sirvió como base para la elaboración del proyecto, al profesor Abel Antonio Navarrete por el acompañamiento durante todo el tiempo del proyecto, por las reuniones y consejos para mejorar nuestro proyecto, </w:t>
       </w:r>
       <w:r>
         <w:rPr>
           <w:lang w:val="es-ES"/>
         </w:rPr>
         <w:lastRenderedPageBreak/>
-        <w:t>pago del préstamo. Y también el capital que tiene en cuenta el capital social, los dividendos resultantes y la utilidad.</w:t>
-      </w:r>
-    </w:p>
-    <w:p>
-      <w:pPr>
-        <w:rPr>
-          <w:lang w:val="es-ES"/>
-        </w:rPr>
-      </w:pPr>
-      <w:r>
-        <w:rPr>
-          <w:b/>
-          <w:bCs/>
-          <w:lang w:val="es-ES"/>
-        </w:rPr>
-        <w:t>[Diap. 2</w:t>
-      </w:r>
-      <w:r>
-        <w:rPr>
-          <w:b/>
-          <w:bCs/>
-          <w:lang w:val="es-ES"/>
-        </w:rPr>
-        <w:t>7</w:t>
-      </w:r>
-      <w:r>
-        <w:rPr>
-          <w:b/>
-          <w:bCs/>
-          <w:lang w:val="es-ES"/>
-        </w:rPr>
-        <w:t xml:space="preserve">] </w:t>
-      </w:r>
-      <w:r>
-        <w:rPr>
-          <w:lang w:val="es-ES"/>
-        </w:rPr>
-        <w:t>En el estado de resultados podemos visualizar las utilidades de nuestro negocio, en donde los impuestos son claramente del 35% para las PYMES en Colombia, esta se divide en Bruta, que se subdivide en los ingresos obtenidos y el costo de mantenimiento. Operativa que trata sobre la mano de obra, beneficios, administración y de marketing. Y cuotas del préstamo. Finalmente, en la parte inferior de la tabla se detalla la utilidad neta que se calcula de 11 millones 77 mil pesos para el primer año fiscal llegando a 182 millones 328 mil para el quinto año de operación.</w:t>
-      </w:r>
-    </w:p>
-    <w:p>
-      <w:pPr>
-        <w:rPr>
-          <w:lang w:val="es-ES"/>
-        </w:rPr>
-      </w:pPr>
-      <w:r>
-        <w:rPr>
-          <w:b/>
-          <w:bCs/>
-          <w:lang w:val="es-ES"/>
-        </w:rPr>
-        <w:t>[Diap. 2</w:t>
-      </w:r>
-      <w:r>
-        <w:rPr>
-          <w:b/>
-          <w:bCs/>
-          <w:lang w:val="es-ES"/>
-        </w:rPr>
-        <w:t>8</w:t>
-      </w:r>
-      <w:r>
-        <w:rPr>
-          <w:b/>
-          <w:bCs/>
-          <w:lang w:val="es-ES"/>
-        </w:rPr>
-        <w:t xml:space="preserve">] </w:t>
-      </w:r>
-      <w:r>
-        <w:rPr>
-          <w:lang w:val="es-ES"/>
-        </w:rPr>
-        <w:t>Con base en lo anterior, nos dejaría el flujo de caja que es el dinero libre que podemos invertir en agrandar el proyecto. Como observamos, durante el primer año contamos con apenas 11 millones de pesos. Pero esperamos que en año venideros este flujo aumente hasta alcanzar los 180 millones 509 mil para el quinto año, lo que permitiría tener mayor flexibilidad para abrir la puerta a nuevas formas de inversión, realizar nuevos proyectos y mejorar la infraestructura existente.</w:t>
-      </w:r>
-    </w:p>
-    <w:p>
-      <w:pPr>
-        <w:rPr>
-          <w:lang w:val="es-ES"/>
-        </w:rPr>
-      </w:pPr>
-      <w:r>
-        <w:rPr>
-          <w:b/>
-          <w:bCs/>
-          <w:lang w:val="es-ES"/>
-        </w:rPr>
-        <w:t xml:space="preserve">[Diap. </w:t>
-      </w:r>
-      <w:r>
-        <w:rPr>
-          <w:b/>
-          <w:bCs/>
-          <w:lang w:val="es-ES"/>
-        </w:rPr>
-        <w:t>29</w:t>
-      </w:r>
-      <w:r>
-        <w:rPr>
-          <w:b/>
-          <w:bCs/>
-          <w:lang w:val="es-ES"/>
-        </w:rPr>
-        <w:t xml:space="preserve">] </w:t>
-      </w:r>
-      <w:r>
-        <w:rPr>
-          <w:lang w:val="es-ES"/>
-        </w:rPr>
-        <w:t>Para estimar el punto de equilibrio, siempre se tendrá en cuenta el costo fijo, los empleados, el hosting y los servicios, cuyos valores deben ser fijos durante la operación del aplicativo. Además, añadimos un 10% del valor para imprevistos en caso de ocurrir un evento extraordinario.</w:t>
-      </w:r>
-    </w:p>
-    <w:p>
-      <w:pPr>
-        <w:rPr>
-          <w:lang w:val="es-ES"/>
-        </w:rPr>
-      </w:pPr>
-      <w:r>
-        <w:rPr>
-          <w:b/>
-          <w:bCs/>
-          <w:lang w:val="es-ES"/>
-        </w:rPr>
-        <w:t>[Diap. 3</w:t>
-      </w:r>
-      <w:r>
-        <w:rPr>
-          <w:b/>
-          <w:bCs/>
-          <w:lang w:val="es-ES"/>
-        </w:rPr>
-        <w:t>0</w:t>
-      </w:r>
-      <w:r>
-        <w:rPr>
-          <w:b/>
-          <w:bCs/>
-          <w:lang w:val="es-ES"/>
-        </w:rPr>
-        <w:t xml:space="preserve">] </w:t>
-      </w:r>
-      <w:r>
-        <w:rPr>
-          <w:lang w:val="es-ES"/>
-        </w:rPr>
-        <w:t>Pasamos hacia el análisis de proyecciones, este se realiza teniendo en cuenta las ganancias de las proyecciones dadas anteriormente. Para el primer año, vemos que, por cada persona que este dentro del aplicativo de forma anual, se genera 33.027 pesos, esto sumando a personas con suscripciones pagas y gratuitas. Adicionalmente, vemos que el número de usuarios que se proyecta para el primer año de la plataforma es de 4.944.</w:t>
-      </w:r>
-    </w:p>
-    <w:p>
-      <w:pPr>
-        <w:rPr>
-          <w:lang w:val="es-ES"/>
-        </w:rPr>
-      </w:pPr>
-      <w:r>
-        <w:rPr>
-          <w:b/>
-          <w:bCs/>
-          <w:lang w:val="es-ES"/>
-        </w:rPr>
-        <w:t>[Diap. 3</w:t>
-      </w:r>
-      <w:r>
-        <w:rPr>
-          <w:b/>
-          <w:bCs/>
-          <w:lang w:val="es-ES"/>
-        </w:rPr>
-        <w:t>1</w:t>
-      </w:r>
-      <w:r>
-        <w:rPr>
-          <w:b/>
-          <w:bCs/>
-          <w:lang w:val="es-ES"/>
-        </w:rPr>
-        <w:t xml:space="preserve"> a 3</w:t>
-      </w:r>
-      <w:r>
-        <w:rPr>
-          <w:b/>
-          <w:bCs/>
-          <w:lang w:val="es-ES"/>
-        </w:rPr>
-        <w:t>2</w:t>
-      </w:r>
-      <w:r>
-        <w:rPr>
-          <w:b/>
-          <w:bCs/>
-          <w:lang w:val="es-ES"/>
-        </w:rPr>
-        <w:t xml:space="preserve">] </w:t>
-      </w:r>
-      <w:r>
-        <w:rPr>
-          <w:lang w:val="es-ES"/>
-        </w:rPr>
-        <w:t>Siguiendo con la estimación del punto de equilibrio, el costo de producción es de 31.955 pesos por cada usuario, y por tal. Podemos observar como el punto de equilibrio donde el cual los ingresos superan los costos es alrededor de 4.784 personas en total, con unas ventas anuales mínimas de alrededor de 158 millones de pesos.</w:t>
-      </w:r>
-    </w:p>
-    <w:p>
-      <w:pPr>
-        <w:rPr>
-          <w:lang w:val="es-ES"/>
-        </w:rPr>
-      </w:pPr>
-      <w:r>
-        <w:rPr>
-          <w:b/>
-          <w:bCs/>
-          <w:lang w:val="es-ES"/>
-        </w:rPr>
-        <w:t>[Diap. 3</w:t>
-      </w:r>
-      <w:r>
-        <w:rPr>
-          <w:b/>
-          <w:bCs/>
-          <w:lang w:val="es-ES"/>
-        </w:rPr>
-        <w:t>3</w:t>
-      </w:r>
-      <w:r>
-        <w:rPr>
-          <w:b/>
-          <w:bCs/>
-          <w:lang w:val="es-ES"/>
-        </w:rPr>
-        <w:t xml:space="preserve">] </w:t>
-      </w:r>
-      <w:r>
-        <w:rPr>
-          <w:lang w:val="es-ES"/>
-        </w:rPr>
-        <w:t>En base a todo lo anterior, el valor actual neto es de 219 millones de pesos con una tasa interna de retorno de 94,95% efectiva anual, lo cual es muy positiva para el negocio.</w:t>
-      </w:r>
-    </w:p>
-    <w:p>
-      <w:pPr>
-        <w:rPr>
-          <w:lang w:val="es-ES"/>
-        </w:rPr>
-      </w:pPr>
-      <w:r>
-        <w:rPr>
-          <w:b/>
-          <w:bCs/>
-          <w:lang w:val="es-ES"/>
-        </w:rPr>
-        <w:t>[Diap. 3</w:t>
-      </w:r>
-      <w:r>
-        <w:rPr>
-          <w:b/>
-          <w:bCs/>
-          <w:lang w:val="es-ES"/>
-        </w:rPr>
-        <w:t>4</w:t>
-      </w:r>
-      <w:r>
-        <w:rPr>
-          <w:b/>
-          <w:bCs/>
-          <w:lang w:val="es-ES"/>
-        </w:rPr>
-        <w:t xml:space="preserve"> a 3</w:t>
-      </w:r>
-      <w:r>
-        <w:rPr>
-          <w:b/>
-          <w:bCs/>
-          <w:lang w:val="es-ES"/>
-        </w:rPr>
-        <w:t>5</w:t>
-      </w:r>
-      <w:r>
-        <w:rPr>
-          <w:b/>
-          <w:bCs/>
-          <w:lang w:val="es-ES"/>
-        </w:rPr>
-        <w:t xml:space="preserve">] </w:t>
-      </w:r>
-      <w:r>
-        <w:rPr>
-          <w:lang w:val="es-ES"/>
-        </w:rPr>
-        <w:t>Sobre el análisis financiero, mostramos la rentabilidad de operación, el nivel de endeudamiento que posee, que se reduce de gran manera con el paso del tiempo, junto a la liquidez de estos años, demostrando que la empresa es muy rentable y es realista.</w:t>
-      </w:r>
-    </w:p>
-    <w:p>
-      <w:pPr>
-        <w:rPr>
-          <w:i/>
-          <w:iCs/>
-          <w:lang w:val="es-ES"/>
-        </w:rPr>
-      </w:pPr>
-      <w:r>
-        <w:rPr>
-          <w:b/>
-          <w:bCs/>
-          <w:lang w:val="es-ES"/>
-        </w:rPr>
-        <w:t>[Diap. 3</w:t>
-      </w:r>
-      <w:r>
-        <w:rPr>
-          <w:b/>
-          <w:bCs/>
-          <w:lang w:val="es-ES"/>
-        </w:rPr>
-        <w:t>6</w:t>
-      </w:r>
-      <w:r>
-        <w:rPr>
-          <w:b/>
-          <w:bCs/>
-          <w:lang w:val="es-ES"/>
-        </w:rPr>
-        <w:t xml:space="preserve"> a 3</w:t>
-      </w:r>
-      <w:r>
-        <w:rPr>
-          <w:b/>
-          <w:bCs/>
-          <w:lang w:val="es-ES"/>
-        </w:rPr>
-        <w:t>7</w:t>
-      </w:r>
-      <w:r>
-        <w:rPr>
-          <w:b/>
-          <w:bCs/>
-          <w:lang w:val="es-ES"/>
-        </w:rPr>
-        <w:t xml:space="preserve">] </w:t>
-      </w:r>
-      <w:r>
-        <w:rPr>
-          <w:lang w:val="es-ES"/>
-        </w:rPr>
-        <w:t xml:space="preserve">Para terminar, tenemos unas conclusiones finales con respecto al proyecto, el primero es que </w:t>
-      </w:r>
-      <w:r>
-        <w:rPr>
-          <w:i/>
-          <w:iCs/>
-          <w:lang w:val="es-ES"/>
-        </w:rPr>
-        <w:t>El plan de negocio de EduFinanzas propone una plataforma EdTech centrada en educación financiera, que permite a estudiantes, personas de bajos recursos y nómadas digitales acceder a un aprendizaje intuitivo y personalizado. El análisis identifica sus oportunidades y riesgos, mostrando la viabilidad del modelo en el mercado actual</w:t>
-      </w:r>
-      <w:r>
-        <w:rPr>
-          <w:i/>
-          <w:iCs/>
-          <w:lang w:val="es-ES"/>
-        </w:rPr>
-        <w:t>.</w:t>
-      </w:r>
-      <w:r>
-        <w:rPr>
-          <w:i/>
-          <w:iCs/>
+        <w:t>al profesor José David Álvarez por la disposición del tiempo, otros docentes y compañeros que acompañaron durante todos estos años de formación.</w:t>
+      </w:r>
+    </w:p>
+    <w:p>
+      <w:pPr>
+        <w:rPr>
+          <w:lang w:val="es-ES"/>
+        </w:rPr>
+      </w:pPr>
+      <w:r>
+        <w:rPr>
+          <w:b/>
+          <w:bCs/>
+          <w:lang w:val="es-ES"/>
+        </w:rPr>
+        <w:t>[</w:t>
+      </w:r>
+      <w:proofErr w:type="spellStart"/>
+      <w:r>
+        <w:rPr>
+          <w:b/>
+          <w:bCs/>
+          <w:lang w:val="es-ES"/>
+        </w:rPr>
+        <w:t>Diap</w:t>
+      </w:r>
+      <w:proofErr w:type="spellEnd"/>
+      <w:r>
+        <w:rPr>
+          <w:b/>
+          <w:bCs/>
+          <w:lang w:val="es-ES"/>
+        </w:rPr>
+        <w:t xml:space="preserve">. 41] </w:t>
+      </w:r>
+      <w:r>
+        <w:rPr>
+          <w:lang w:val="es-ES"/>
+        </w:rPr>
+        <w:t>Para despedirnos, los dejamos con esta cita “</w:t>
+      </w:r>
+      <w:r>
+        <w:rPr>
+          <w:i/>
+          <w:iCs/>
+          <w:lang w:val="es-ES"/>
+        </w:rPr>
+        <w:t>La economía funciona como una máquina simple, pero mucha gente no la entiende o no se pone de acuerdo sobre cómo funciona, y esto ha provocado mucho sufrimiento económico innecesario</w:t>
+      </w:r>
+      <w:r>
+        <w:rPr>
+          <w:lang w:val="es-ES"/>
+        </w:rPr>
+        <w:t xml:space="preserve">” del autor Ray </w:t>
+      </w:r>
+      <w:proofErr w:type="spellStart"/>
+      <w:r>
+        <w:rPr>
+          <w:lang w:val="es-ES"/>
+        </w:rPr>
+        <w:t>Dalio</w:t>
+      </w:r>
+      <w:proofErr w:type="spellEnd"/>
+      <w:r>
+        <w:rPr>
+          <w:lang w:val="es-ES"/>
+        </w:rPr>
+        <w:t xml:space="preserve">, fundador de </w:t>
+      </w:r>
+      <w:proofErr w:type="spellStart"/>
+      <w:r>
+        <w:rPr>
+          <w:lang w:val="es-ES"/>
+        </w:rPr>
+        <w:t>Bridgewater</w:t>
+      </w:r>
+      <w:proofErr w:type="spellEnd"/>
+      <w:r>
+        <w:rPr>
           <w:lang w:val="es-ES"/>
         </w:rPr>
         <w:t xml:space="preserve"> </w:t>
       </w:r>
-      <w:r>
-        <w:rPr>
-          <w:lang w:val="es-ES"/>
-        </w:rPr>
-        <w:t xml:space="preserve">Y como segunda y última conclusión es que </w:t>
-      </w:r>
-      <w:r>
-        <w:rPr>
-          <w:i/>
-          <w:iCs/>
-          <w:lang w:val="es-ES"/>
-        </w:rPr>
-        <w:t xml:space="preserve">EduFinanzas tiene potencial para fortalecer la educación financiera de estas comunidades mediante una plataforma inclusiva, con opciones de acceso con y sin suscripción. </w:t>
-      </w:r>
-      <w:r>
-        <w:rPr>
-          <w:i/>
-          <w:iCs/>
-          <w:lang w:val="es-ES"/>
-        </w:rPr>
-        <w:lastRenderedPageBreak/>
-        <w:t>Además, busca contribuir a la transformación digital del sector financiero, convirtiendo el uso de datos en un mayor bienestar económico para la sociedad</w:t>
-      </w:r>
-      <w:r>
-        <w:rPr>
-          <w:i/>
-          <w:iCs/>
-          <w:lang w:val="es-ES"/>
-        </w:rPr>
-        <w:t>.</w:t>
-      </w:r>
-    </w:p>
-    <w:p>
-      <w:pPr>
-        <w:rPr>
-          <w:lang w:val="es-ES"/>
-        </w:rPr>
-      </w:pPr>
-      <w:r>
-        <w:rPr>
-          <w:b/>
-          <w:bCs/>
-          <w:lang w:val="es-ES"/>
-        </w:rPr>
-        <w:t>[Diap. 3</w:t>
-      </w:r>
-      <w:r>
-        <w:rPr>
-          <w:b/>
-          <w:bCs/>
-          <w:lang w:val="es-ES"/>
-        </w:rPr>
-        <w:t>8</w:t>
-      </w:r>
-      <w:r>
-        <w:rPr>
-          <w:b/>
-          <w:bCs/>
-          <w:lang w:val="es-ES"/>
-        </w:rPr>
-        <w:t xml:space="preserve"> a </w:t>
-      </w:r>
-      <w:r>
-        <w:rPr>
-          <w:b/>
-          <w:bCs/>
-          <w:lang w:val="es-ES"/>
-        </w:rPr>
-        <w:t>39</w:t>
-      </w:r>
-      <w:r>
-        <w:rPr>
-          <w:b/>
-          <w:bCs/>
-          <w:lang w:val="es-ES"/>
-        </w:rPr>
-        <w:t xml:space="preserve">] </w:t>
-      </w:r>
-      <w:r>
-        <w:rPr>
-          <w:lang w:val="es-ES"/>
-        </w:rPr>
-        <w:t>Bueno, aquí tenemos alguna de la bibliografía relevante para el proyecto, otras referencias se encuentran dentro del proyecto.</w:t>
-      </w:r>
-    </w:p>
-    <w:p>
-      <w:pPr>
-        <w:rPr>
-          <w:lang w:val="es-ES"/>
-        </w:rPr>
-      </w:pPr>
-      <w:r>
-        <w:rPr>
-          <w:b/>
-          <w:bCs/>
-          <w:lang w:val="es-ES"/>
-        </w:rPr>
-        <w:t>[Diap. 4</w:t>
-      </w:r>
-      <w:r>
-        <w:rPr>
-          <w:b/>
-          <w:bCs/>
-          <w:lang w:val="es-ES"/>
-        </w:rPr>
-        <w:t>0</w:t>
-      </w:r>
-      <w:r>
-        <w:rPr>
-          <w:b/>
-          <w:bCs/>
-          <w:lang w:val="es-ES"/>
-        </w:rPr>
-        <w:t xml:space="preserve">] </w:t>
-      </w:r>
-      <w:r>
-        <w:rPr>
-          <w:lang w:val="es-ES"/>
-        </w:rPr>
-        <w:t>Como agradecimientos, inicialmente al grupo de emprendimiento que sirvió como base para la elaboración del proyecto, al profesor Abel Antonio Navarrete por el acompañamiento durante todo el tiempo del proyecto, por las reuniones y consejos para mejorar nuestro proyecto, al profesor José David Álvarez por la disposición del tiempo, otros docentes y compañeros que acompañaron durante todos estos años de formación.</w:t>
-      </w:r>
-    </w:p>
-    <w:p>
-      <w:pPr>
-        <w:rPr>
-          <w:lang w:val="es-ES"/>
-        </w:rPr>
-      </w:pPr>
-      <w:r>
-        <w:rPr>
-          <w:b/>
-          <w:bCs/>
-          <w:lang w:val="es-ES"/>
-        </w:rPr>
-        <w:t>[Diap. 4</w:t>
-      </w:r>
-      <w:r>
-        <w:rPr>
-          <w:b/>
-          <w:bCs/>
-          <w:lang w:val="es-ES"/>
-        </w:rPr>
-        <w:t>1</w:t>
-      </w:r>
-      <w:r>
-        <w:rPr>
-          <w:b/>
-          <w:bCs/>
-          <w:lang w:val="es-ES"/>
-        </w:rPr>
-        <w:t xml:space="preserve">] </w:t>
-      </w:r>
-      <w:r>
-        <w:rPr>
-          <w:lang w:val="es-ES"/>
-        </w:rPr>
-        <w:t>Para despedirnos, los dejamos con esta cita “</w:t>
-      </w:r>
-      <w:r>
-        <w:rPr>
-          <w:i/>
-          <w:iCs/>
-          <w:lang w:val="es-ES"/>
-        </w:rPr>
-        <w:t>La economía funciona como una máquina simple, pero mucha gente no la entiende o no se pone de acuerdo sobre cómo funciona, y esto ha provocado mucho sufrimiento económico innecesario</w:t>
-      </w:r>
-      <w:r>
-        <w:rPr>
-          <w:lang w:val="es-ES"/>
-        </w:rPr>
-        <w:t>” del autor Ray Dalio, fundador de Bridgewater Associates uno de los fondos de cobertura más grandes en el mundo, y eso sería todo, muchísimas gracias por su atención</w:t>
+      <w:proofErr w:type="spellStart"/>
+      <w:r>
+        <w:rPr>
+          <w:lang w:val="es-ES"/>
+        </w:rPr>
+        <w:t>Associates</w:t>
+      </w:r>
+      <w:proofErr w:type="spellEnd"/>
+      <w:r>
+        <w:rPr>
+          <w:lang w:val="es-ES"/>
+        </w:rPr>
+        <w:t xml:space="preserve"> uno de los fondos de cobertura más grandes en el mundo, y eso sería todo, muchísimas gracias por su atención</w:t>
       </w:r>
       <w:r>
         <w:rPr>

</xml_diff>